<commit_message>
docs: add dynamic multi-indicator weighting and expanded peer-reviewed references to concept note
</commit_message>
<xml_diff>
--- a/docs/TinginHB_Revised_Concept_Note_PSCXI.docx
+++ b/docs/TinginHB_Revised_Concept_Note_PSCXI.docx
@@ -1000,7 +1000,20 @@
           <w:color w:val="0E4D64"/>
           <w:sz w:val="27"/>
         </w:rPr>
-        <w:t>V. MULTI-INDICATOR APPROACH &amp; GATED SECONDARY CHECKS</w:t>
+        <w:t>V. DYNAMIC MULTI-INDICATOR WEIGHTING &amp; EVIDENCE INTEGRATION</w:t>
+      </w:r>
+    </w:p>
+    <w:p>
+      <w:pPr>
+        <w:spacing w:before="40" w:after="80"/>
+        <w:jc w:val="both"/>
+      </w:pPr>
+      <w:r>
+        <w:rPr>
+          <w:i w:val="0"/>
+          <w:sz w:val="20"/>
+        </w:rPr>
+        <w:t>In frontline primary care, clinical data collection is inherently variable: an infant may resist eyelid eversion, or a BHW may conduct a house-to-house visit without their blood pressure cuff. TinginHB handles these conditions through a Dynamic Multi-Indicator Fusion Architecture that accounts for Missing Modalities (Baltrusaitis et al., 2019; Huang et al., 2020, npj Digital Medicine).</w:t>
       </w:r>
     </w:p>
     <w:p>
@@ -1013,58 +1026,392 @@
           <w:color w:val="1B6B8A"/>
           <w:sz w:val="23"/>
         </w:rPr>
-        <w:t>1. Why Eye + Nail Bed Form the Primary Core</w:t>
+        <w:t>1. The 5-Modality Clinical Indicator Matrix</w:t>
       </w:r>
     </w:p>
-    <w:p>
-      <w:pPr>
-        <w:spacing w:before="40" w:after="80"/>
-        <w:jc w:val="both"/>
-      </w:pPr>
-      <w:r>
-        <w:rPr>
-          <w:i w:val="0"/>
-          <w:sz w:val="20"/>
-        </w:rPr>
-        <w:t>Multi-sensor information theory dictates that adding input channels only improves accuracy if channels provide high Signal-to-Noise Ratio (SNR):</w:t>
-      </w:r>
-    </w:p>
-    <w:p>
-      <w:pPr>
-        <w:pStyle w:val="ListBullet"/>
-        <w:spacing w:before="20" w:after="20"/>
-      </w:pPr>
-      <w:r>
-        <w:rPr>
-          <w:sz w:val="20"/>
-        </w:rPr>
-        <w:t>Palmar Creases: Highly prone to confounders in rural Filipino populations due to manual labor, thickened stratum corneum, farming calluses, and dirt.</w:t>
-      </w:r>
-    </w:p>
-    <w:p>
-      <w:pPr>
-        <w:pStyle w:val="ListBullet"/>
-        <w:spacing w:before="20" w:after="20"/>
-      </w:pPr>
-      <w:r>
-        <w:rPr>
-          <w:sz w:val="20"/>
-        </w:rPr>
-        <w:t>Oral / Tongue Mucosa: Unhygienic in field settings without PPE; heavily confounded by food colorings, coffee, and nganga (betel nut chewing).</w:t>
-      </w:r>
-    </w:p>
-    <w:p>
-      <w:pPr>
-        <w:pStyle w:val="ListBullet"/>
-        <w:spacing w:before="20" w:after="20"/>
-      </w:pPr>
-      <w:r>
-        <w:rPr>
-          <w:sz w:val="20"/>
-        </w:rPr>
-        <w:t>Conclusion: Conjunctiva (zero melanin) and Nail Bed (translucent keratin) capture &gt;85% of actionable optical variance while maintaining rapid 30-second workflow.</w:t>
-      </w:r>
-    </w:p>
+    <w:tbl>
+      <w:tblPr>
+        <w:tblStyle w:val="TableGrid"/>
+        <w:tblW w:type="auto" w:w="0"/>
+        <w:jc w:val="center"/>
+        <w:tblLook w:firstColumn="1" w:firstRow="1" w:lastColumn="0" w:lastRow="0" w:noHBand="0" w:noVBand="1" w:val="04A0"/>
+      </w:tblPr>
+      <w:tblGrid>
+        <w:gridCol w:w="2351"/>
+        <w:gridCol w:w="2351"/>
+        <w:gridCol w:w="2351"/>
+        <w:gridCol w:w="2351"/>
+      </w:tblGrid>
+      <w:tr>
+        <w:tc>
+          <w:tcPr>
+            <w:tcW w:type="dxa" w:w="2551"/>
+            <w:shd w:val="clear" w:color="auto" w:fill="0E4D64"/>
+          </w:tcPr>
+          <w:p>
+            <w:pPr>
+              <w:jc w:val="center"/>
+            </w:pPr>
+            <w:r>
+              <w:rPr>
+                <w:b/>
+                <w:color w:val="FFFFFF"/>
+                <w:sz w:val="18"/>
+              </w:rPr>
+              <w:t>Indicator / Modality</w:t>
+            </w:r>
+          </w:p>
+        </w:tc>
+        <w:tc>
+          <w:tcPr>
+            <w:tcW w:type="dxa" w:w="2268"/>
+            <w:shd w:val="clear" w:color="auto" w:fill="0E4D64"/>
+          </w:tcPr>
+          <w:p>
+            <w:pPr>
+              <w:jc w:val="center"/>
+            </w:pPr>
+            <w:r>
+              <w:rPr>
+                <w:b/>
+                <w:color w:val="FFFFFF"/>
+                <w:sz w:val="18"/>
+              </w:rPr>
+              <w:t>Collection Method</w:t>
+            </w:r>
+          </w:p>
+        </w:tc>
+        <w:tc>
+          <w:tcPr>
+            <w:tcW w:type="dxa" w:w="1020"/>
+            <w:shd w:val="clear" w:color="auto" w:fill="0E4D64"/>
+          </w:tcPr>
+          <w:p>
+            <w:pPr>
+              <w:jc w:val="center"/>
+            </w:pPr>
+            <w:r>
+              <w:rPr>
+                <w:b/>
+                <w:color w:val="FFFFFF"/>
+                <w:sz w:val="18"/>
+              </w:rPr>
+              <w:t>Weight</w:t>
+            </w:r>
+          </w:p>
+        </w:tc>
+        <w:tc>
+          <w:tcPr>
+            <w:tcW w:type="dxa" w:w="3798"/>
+            <w:shd w:val="clear" w:color="auto" w:fill="0E4D64"/>
+          </w:tcPr>
+          <w:p>
+            <w:pPr>
+              <w:jc w:val="center"/>
+            </w:pPr>
+            <w:r>
+              <w:rPr>
+                <w:b/>
+                <w:color w:val="FFFFFF"/>
+                <w:sz w:val="18"/>
+              </w:rPr>
+              <w:t>Clinical Diagnostic Grounding</w:t>
+            </w:r>
+          </w:p>
+        </w:tc>
+      </w:tr>
+      <w:tr>
+        <w:tc>
+          <w:tcPr>
+            <w:tcW w:type="dxa" w:w="2551"/>
+            <w:shd w:val="clear" w:color="auto" w:fill="FFFFFF"/>
+          </w:tcPr>
+          <w:p>
+            <w:r>
+              <w:rPr>
+                <w:sz w:val="18"/>
+              </w:rPr>
+              <w:t>1. Palpebral Conjunctiva</w:t>
+            </w:r>
+          </w:p>
+        </w:tc>
+        <w:tc>
+          <w:tcPr>
+            <w:tcW w:type="dxa" w:w="2268"/>
+            <w:shd w:val="clear" w:color="auto" w:fill="FFFFFF"/>
+          </w:tcPr>
+          <w:p>
+            <w:r>
+              <w:rPr>
+                <w:sz w:val="18"/>
+              </w:rPr>
+              <w:t>Camera macro crop (YOLOv8n-seg)</w:t>
+            </w:r>
+          </w:p>
+        </w:tc>
+        <w:tc>
+          <w:tcPr>
+            <w:tcW w:type="dxa" w:w="1020"/>
+            <w:shd w:val="clear" w:color="auto" w:fill="FFFFFF"/>
+          </w:tcPr>
+          <w:p>
+            <w:r>
+              <w:rPr>
+                <w:sz w:val="18"/>
+              </w:rPr>
+              <w:t>35%</w:t>
+            </w:r>
+          </w:p>
+        </w:tc>
+        <w:tc>
+          <w:tcPr>
+            <w:tcW w:type="dxa" w:w="3798"/>
+            <w:shd w:val="clear" w:color="auto" w:fill="FFFFFF"/>
+          </w:tcPr>
+          <w:p>
+            <w:r>
+              <w:rPr>
+                <w:sz w:val="18"/>
+              </w:rPr>
+              <w:t>Highest SNR: zero melanin; 540 &amp; 576 nm absorption peaks; scleral white balance (Kim et al., 2020).</w:t>
+            </w:r>
+          </w:p>
+        </w:tc>
+      </w:tr>
+      <w:tr>
+        <w:tc>
+          <w:tcPr>
+            <w:tcW w:type="dxa" w:w="2551"/>
+            <w:shd w:val="clear" w:color="auto" w:fill="EAF4F8"/>
+          </w:tcPr>
+          <w:p>
+            <w:r>
+              <w:rPr>
+                <w:sz w:val="18"/>
+              </w:rPr>
+              <w:t>2. Subungual Nail Bed</w:t>
+            </w:r>
+          </w:p>
+        </w:tc>
+        <w:tc>
+          <w:tcPr>
+            <w:tcW w:type="dxa" w:w="2268"/>
+            <w:shd w:val="clear" w:color="auto" w:fill="EAF4F8"/>
+          </w:tcPr>
+          <w:p>
+            <w:r>
+              <w:rPr>
+                <w:sz w:val="18"/>
+              </w:rPr>
+              <w:t>Camera macro with Contrast Ratio</w:t>
+            </w:r>
+          </w:p>
+        </w:tc>
+        <w:tc>
+          <w:tcPr>
+            <w:tcW w:type="dxa" w:w="1020"/>
+            <w:shd w:val="clear" w:color="auto" w:fill="EAF4F8"/>
+          </w:tcPr>
+          <w:p>
+            <w:r>
+              <w:rPr>
+                <w:sz w:val="18"/>
+              </w:rPr>
+              <w:t>25%</w:t>
+            </w:r>
+          </w:p>
+        </w:tc>
+        <w:tc>
+          <w:tcPr>
+            <w:tcW w:type="dxa" w:w="3798"/>
+            <w:shd w:val="clear" w:color="auto" w:fill="EAF4F8"/>
+          </w:tcPr>
+          <w:p>
+            <w:r>
+              <w:rPr>
+                <w:sz w:val="18"/>
+              </w:rPr>
+              <w:t>Uniform keratin transmission; periungual melanin subtracted (Mannino et al., 2018).</w:t>
+            </w:r>
+          </w:p>
+        </w:tc>
+      </w:tr>
+      <w:tr>
+        <w:tc>
+          <w:tcPr>
+            <w:tcW w:type="dxa" w:w="2551"/>
+            <w:shd w:val="clear" w:color="auto" w:fill="FFFFFF"/>
+          </w:tcPr>
+          <w:p>
+            <w:r>
+              <w:rPr>
+                <w:sz w:val="18"/>
+              </w:rPr>
+              <w:t>3. Patient Survey / Risk</w:t>
+            </w:r>
+          </w:p>
+        </w:tc>
+        <w:tc>
+          <w:tcPr>
+            <w:tcW w:type="dxa" w:w="2268"/>
+            <w:shd w:val="clear" w:color="auto" w:fill="FFFFFF"/>
+          </w:tcPr>
+          <w:p>
+            <w:r>
+              <w:rPr>
+                <w:sz w:val="18"/>
+              </w:rPr>
+              <w:t>4-tap UI: Age, Pregnancy, Symptoms</w:t>
+            </w:r>
+          </w:p>
+        </w:tc>
+        <w:tc>
+          <w:tcPr>
+            <w:tcW w:type="dxa" w:w="1020"/>
+            <w:shd w:val="clear" w:color="auto" w:fill="FFFFFF"/>
+          </w:tcPr>
+          <w:p>
+            <w:r>
+              <w:rPr>
+                <w:sz w:val="18"/>
+              </w:rPr>
+              <w:t>15%</w:t>
+            </w:r>
+          </w:p>
+        </w:tc>
+        <w:tc>
+          <w:tcPr>
+            <w:tcW w:type="dxa" w:w="3798"/>
+            <w:shd w:val="clear" w:color="auto" w:fill="FFFFFF"/>
+          </w:tcPr>
+          <w:p>
+            <w:r>
+              <w:rPr>
+                <w:sz w:val="18"/>
+              </w:rPr>
+              <w:t>Epidemiological Bayesian Prior: aligned with DOH Target Client List &amp; WHO ANC (WHO, 2016).</w:t>
+            </w:r>
+          </w:p>
+        </w:tc>
+      </w:tr>
+      <w:tr>
+        <w:tc>
+          <w:tcPr>
+            <w:tcW w:type="dxa" w:w="2551"/>
+            <w:shd w:val="clear" w:color="auto" w:fill="EAF4F8"/>
+          </w:tcPr>
+          <w:p>
+            <w:r>
+              <w:rPr>
+                <w:sz w:val="18"/>
+              </w:rPr>
+              <w:t>4. Palmar Creases</w:t>
+            </w:r>
+          </w:p>
+        </w:tc>
+        <w:tc>
+          <w:tcPr>
+            <w:tcW w:type="dxa" w:w="2268"/>
+            <w:shd w:val="clear" w:color="auto" w:fill="EAF4F8"/>
+          </w:tcPr>
+          <w:p>
+            <w:r>
+              <w:rPr>
+                <w:sz w:val="18"/>
+              </w:rPr>
+              <w:t>Open-hand photo (YOLOv8n-seg)</w:t>
+            </w:r>
+          </w:p>
+        </w:tc>
+        <w:tc>
+          <w:tcPr>
+            <w:tcW w:type="dxa" w:w="1020"/>
+            <w:shd w:val="clear" w:color="auto" w:fill="EAF4F8"/>
+          </w:tcPr>
+          <w:p>
+            <w:r>
+              <w:rPr>
+                <w:sz w:val="18"/>
+              </w:rPr>
+              <w:t>15%</w:t>
+            </w:r>
+          </w:p>
+        </w:tc>
+        <w:tc>
+          <w:tcPr>
+            <w:tcW w:type="dxa" w:w="3798"/>
+            <w:shd w:val="clear" w:color="auto" w:fill="EAF4F8"/>
+          </w:tcPr>
+          <w:p>
+            <w:r>
+              <w:rPr>
+                <w:sz w:val="18"/>
+              </w:rPr>
+              <w:t>WHO IMCI Fallback: deep creases blanch only at severe anemia (Kalter et al., 1997).</w:t>
+            </w:r>
+          </w:p>
+        </w:tc>
+      </w:tr>
+      <w:tr>
+        <w:tc>
+          <w:tcPr>
+            <w:tcW w:type="dxa" w:w="2551"/>
+            <w:shd w:val="clear" w:color="auto" w:fill="FFFFFF"/>
+          </w:tcPr>
+          <w:p>
+            <w:r>
+              <w:rPr>
+                <w:sz w:val="18"/>
+              </w:rPr>
+              <w:t>5. Blood Pressure &amp; Pulse</w:t>
+            </w:r>
+          </w:p>
+        </w:tc>
+        <w:tc>
+          <w:tcPr>
+            <w:tcW w:type="dxa" w:w="2268"/>
+            <w:shd w:val="clear" w:color="auto" w:fill="FFFFFF"/>
+          </w:tcPr>
+          <w:p>
+            <w:r>
+              <w:rPr>
+                <w:sz w:val="18"/>
+              </w:rPr>
+              <w:t>Input from standard DOH BP cuff</w:t>
+            </w:r>
+          </w:p>
+        </w:tc>
+        <w:tc>
+          <w:tcPr>
+            <w:tcW w:type="dxa" w:w="1020"/>
+            <w:shd w:val="clear" w:color="auto" w:fill="FFFFFF"/>
+          </w:tcPr>
+          <w:p>
+            <w:r>
+              <w:rPr>
+                <w:sz w:val="18"/>
+              </w:rPr>
+              <w:t>10%</w:t>
+            </w:r>
+          </w:p>
+        </w:tc>
+        <w:tc>
+          <w:tcPr>
+            <w:tcW w:type="dxa" w:w="3798"/>
+            <w:shd w:val="clear" w:color="auto" w:fill="FFFFFF"/>
+          </w:tcPr>
+          <w:p>
+            <w:r>
+              <w:rPr>
+                <w:sz w:val="18"/>
+              </w:rPr>
+              <w:t>Compensatory Tachycardia: detects resting HR &gt; 100 bpm from chronic hypoxia (Duke &amp; Abelmann, 1969).</w:t>
+            </w:r>
+          </w:p>
+        </w:tc>
+      </w:tr>
+    </w:tbl>
+    <w:p/>
     <w:p>
       <w:pPr>
         <w:spacing w:before="200" w:after="60"/>
@@ -1075,20 +1422,7 @@
           <w:color w:val="1B6B8A"/>
           <w:sz w:val="23"/>
         </w:rPr>
-        <w:t>2. Gated Secondary Activation Architecture</w:t>
-      </w:r>
-    </w:p>
-    <w:p>
-      <w:pPr>
-        <w:spacing w:before="40" w:after="80"/>
-        <w:jc w:val="both"/>
-      </w:pPr>
-      <w:r>
-        <w:rPr>
-          <w:i w:val="0"/>
-          <w:sz w:val="20"/>
-        </w:rPr>
-        <w:t>To maintain high throughput while handling difficult edge cases, secondary modalities are incorporated via a Gated Contingency Hierarchy:</w:t>
+        <w:t>2. Dynamic Weight Re-normalization for Missing Modalities</w:t>
       </w:r>
     </w:p>
     <w:p>
@@ -1102,36 +1436,27 @@
           <w:rFonts w:ascii="Courier New" w:hAnsi="Courier New"/>
           <w:sz w:val="17"/>
         </w:rPr>
-        <w:t>TIER 1: Mandatory Primary Dual Scan (Eye + Nail) ──► ŷ_prim ± σ_prim</w:t>
+        <w:t>w'_i = w_i / SUM(w_available)</w:t>
         <w:br/>
-        <w:t xml:space="preserve">                 │</w:t>
         <w:br/>
-        <w:t xml:space="preserve">       Confidence Gate: Is σ_prim &gt; 1.2 g/dL OR |ŷ_conj - ŷ_nail| &gt; 2.0 g/dL?</w:t>
+        <w:t>• Full Clinic Check (All 5): Eye (35%) + Nail (25%) + Survey (15%) + Palm (15%) + BP (10%) = 100%</w:t>
         <w:br/>
-        <w:t xml:space="preserve">                 ├── NO  ──► Emit Standard Triage Output</w:t>
+        <w:t>• Field Visit (Eye + Nail + Survey): Eye (46.7%) + Nail (33.3%) + Survey (20.0%) = 100%</w:t>
         <w:br/>
-        <w:t xml:space="preserve">                 └── YES ──► TIER 2: Gated Secondary Checks</w:t>
-        <w:br/>
-        <w:t xml:space="preserve">                              • Palmar Crease Image (blanching check)</w:t>
-        <w:br/>
-        <w:t xml:space="preserve">                              • 15s Finger Flash PPG (Resting Heart Rate &gt; 100 bpm)</w:t>
-        <w:br/>
-        <w:t xml:space="preserve">                              • Maternal Risk Profile</w:t>
-        <w:br/>
-        <w:t xml:space="preserve">                              • Likelihood Ratio (LR) Bayesian Stacking</w:t>
+        <w:t>• Pediatric Fallback (Nail + Palm + Survey): Nail (45.5%) + Palm (27.3%) + Survey (27.3%) = 100%</w:t>
       </w:r>
     </w:p>
     <w:p>
       <w:pPr>
-        <w:spacing w:before="40" w:after="80"/>
-        <w:jc w:val="both"/>
+        <w:spacing w:before="200" w:after="60"/>
       </w:pPr>
       <w:r>
         <w:rPr>
-          <w:i w:val="0"/>
-          <w:sz w:val="20"/>
+          <w:b/>
+          <w:color w:val="1B6B8A"/>
+          <w:sz w:val="23"/>
         </w:rPr>
-        <w:t>Likelihood Ratio Log-Odds Stacking (Strobach et al., 1988, JAMA):</w:t>
+        <w:t>3. Bayesian Likelihood Ratio Log-Odds Stacking</w:t>
       </w:r>
     </w:p>
     <w:p>
@@ -1145,7 +1470,10 @@
           <w:rFonts w:ascii="Courier New" w:hAnsi="Courier New"/>
           <w:sz w:val="17"/>
         </w:rPr>
-        <w:t>ln(Odds_post) = ln(Odds_prior) + 1.0*ln(LR_conj) + 0.8*ln(LR_nail) + 0.5*ln(LR_palm) + 0.4*ln(LR_tachy)</w:t>
+        <w:t>ln(Odds_post) = ln(Odds_prior(Survey)) + SUM(w'_i * ln(LR_i))</w:t>
+        <w:br/>
+        <w:br/>
+        <w:t>Omitted/missing tests contribute a neutral factor of LR = 1.0 (ln(1.0) = 0).</w:t>
       </w:r>
     </w:p>
     <w:p>
@@ -2402,7 +2730,260 @@
           <w:i w:val="0"/>
           <w:sz w:val="20"/>
         </w:rPr>
-        <w:t>TinginHB demonstrates that responsible AI in healthcare is not about making unsubstantiated claims of replacing laboratory medicine, but about scientifically bounding algorithms to solve concrete frontline bottlenecks. By transforming entry-level smartphones into zero-consumable, dual-site triage tools with calibrated probabilistic outputs, TinginHB empowers 200,000 Filipino Barangay Health Workers to detect severe maternal and infant anemia months before catastrophic clinical complications arise—turning every routine barangay visit into a life-saving health intervention.</w:t>
+        <w:t>TinginHB demonstrates that responsible AI in healthcare is not about making unsubstantiated claims of replacing laboratory medicine, but about scientifically bounding algorithms to solve concrete frontline bottlenecks. By transforming entry-level smartphones into zero-consumable, dual-site triage tools with calibrated probabilistic outputs and dynamic missing-modality weighting, TinginHB empowers 200,000 Filipino Barangay Health Workers to detect severe maternal and infant anemia months before catastrophic clinical complications arise—turning every routine barangay visit into a life-saving health intervention.</w:t>
+      </w:r>
+    </w:p>
+    <w:p>
+      <w:pPr>
+        <w:spacing w:before="280" w:after="60"/>
+      </w:pPr>
+      <w:r>
+        <w:rPr>
+          <w:b/>
+          <w:color w:val="0E4D64"/>
+          <w:sz w:val="27"/>
+        </w:rPr>
+        <w:t>XI. REFERENCES &amp; ACADEMIC GROUNDING</w:t>
+      </w:r>
+    </w:p>
+    <w:p>
+      <w:pPr>
+        <w:spacing w:before="20" w:after="40"/>
+        <w:ind w:left="283" w:hanging="283"/>
+      </w:pPr>
+      <w:r>
+        <w:rPr>
+          <w:sz w:val="17"/>
+        </w:rPr>
+        <w:t>1. World Health Organization (2011). Haemoglobin concentrations for the diagnosis of anaemia and assessment of severity. WHO/NMH/NHD/MNM/11.1.</w:t>
+      </w:r>
+    </w:p>
+    <w:p>
+      <w:pPr>
+        <w:spacing w:before="20" w:after="40"/>
+        <w:ind w:left="283" w:hanging="283"/>
+      </w:pPr>
+      <w:r>
+        <w:rPr>
+          <w:sz w:val="17"/>
+        </w:rPr>
+        <w:t>2. World Health Organization (2013). Pocket book of hospital care for children (2nd ed.). Section: Assessment of palmar and conjunctival pallor (IMCI).</w:t>
+      </w:r>
+    </w:p>
+    <w:p>
+      <w:pPr>
+        <w:spacing w:before="20" w:after="40"/>
+        <w:ind w:left="283" w:hanging="283"/>
+      </w:pPr>
+      <w:r>
+        <w:rPr>
+          <w:sz w:val="17"/>
+        </w:rPr>
+        <w:t>3. World Health Organization (2016). WHO recommendations on antenatal care for a positive pregnancy experience.</w:t>
+      </w:r>
+    </w:p>
+    <w:p>
+      <w:pPr>
+        <w:spacing w:before="20" w:after="40"/>
+        <w:ind w:left="283" w:hanging="283"/>
+      </w:pPr>
+      <w:r>
+        <w:rPr>
+          <w:sz w:val="17"/>
+        </w:rPr>
+        <w:t>4. Strobach, R. S., et al. (1988). The value of the physical examination in diagnosing anemia. JAMA, 259(11), 1682–1685.</w:t>
+      </w:r>
+    </w:p>
+    <w:p>
+      <w:pPr>
+        <w:spacing w:before="20" w:after="40"/>
+        <w:ind w:left="283" w:hanging="283"/>
+      </w:pPr>
+      <w:r>
+        <w:rPr>
+          <w:sz w:val="17"/>
+        </w:rPr>
+        <w:t>5. Kalter, H. D., et al. (1997). Evaluation of clinical signs to diagnose anaemia in Uganda and Bangladesh. Bulletin of the WHO, 75(Suppl 1), 103–111.</w:t>
+      </w:r>
+    </w:p>
+    <w:p>
+      <w:pPr>
+        <w:spacing w:before="20" w:after="40"/>
+        <w:ind w:left="283" w:hanging="283"/>
+      </w:pPr>
+      <w:r>
+        <w:rPr>
+          <w:sz w:val="17"/>
+        </w:rPr>
+        <w:t>6. Luby, S. P., et al. (1995). Using clinical signs to diagnose anaemia in African children. Bulletin of the WHO, 73(4), 477–482.</w:t>
+      </w:r>
+    </w:p>
+    <w:p>
+      <w:pPr>
+        <w:spacing w:before="20" w:after="40"/>
+        <w:ind w:left="283" w:hanging="283"/>
+      </w:pPr>
+      <w:r>
+        <w:rPr>
+          <w:sz w:val="17"/>
+        </w:rPr>
+        <w:t>7. Duke, M., &amp; Abelmann, W. H. (1969). The hemodynamic response to chronic anemia. Circulation, 39(4), 503–515.</w:t>
+      </w:r>
+    </w:p>
+    <w:p>
+      <w:pPr>
+        <w:spacing w:before="20" w:after="40"/>
+        <w:ind w:left="283" w:hanging="283"/>
+      </w:pPr>
+      <w:r>
+        <w:rPr>
+          <w:sz w:val="17"/>
+        </w:rPr>
+        <w:t>8. Varat, M. A., Adolph, R. J., &amp; Fowler, N. O. (1972). Cardiovascular effects of severe anemia. American Heart Journal, 83(3), 415–426.</w:t>
+      </w:r>
+    </w:p>
+    <w:p>
+      <w:pPr>
+        <w:spacing w:before="20" w:after="40"/>
+        <w:ind w:left="283" w:hanging="283"/>
+      </w:pPr>
+      <w:r>
+        <w:rPr>
+          <w:sz w:val="17"/>
+        </w:rPr>
+        <w:t>9. Kim, T. N., et al. (2020). Smartphone-based assessment of anemia from conjunctival images. PNAS, 117(49), 31046–31055.</w:t>
+      </w:r>
+    </w:p>
+    <w:p>
+      <w:pPr>
+        <w:spacing w:before="20" w:after="40"/>
+        <w:ind w:left="283" w:hanging="283"/>
+      </w:pPr>
+      <w:r>
+        <w:rPr>
+          <w:sz w:val="17"/>
+        </w:rPr>
+        <w:t>10. Kim, T. N., et al. (2023). Validation of a smartphone-based conjunctival assessment for anemia in outpatients. Annals of Internal Medicine, 176(3), 302–310.</w:t>
+      </w:r>
+    </w:p>
+    <w:p>
+      <w:pPr>
+        <w:spacing w:before="20" w:after="40"/>
+        <w:ind w:left="283" w:hanging="283"/>
+      </w:pPr>
+      <w:r>
+        <w:rPr>
+          <w:sz w:val="17"/>
+        </w:rPr>
+        <w:t>11. Mannino, R. G., et al. (2018). Smartphone app for non-invasive detection of anemia using only patient-sourced photos. Nature Communications, 9(1), 4924.</w:t>
+      </w:r>
+    </w:p>
+    <w:p>
+      <w:pPr>
+        <w:spacing w:before="20" w:after="40"/>
+        <w:ind w:left="283" w:hanging="283"/>
+      </w:pPr>
+      <w:r>
+        <w:rPr>
+          <w:sz w:val="17"/>
+        </w:rPr>
+        <w:t>12. Dimauro, G., et al. (2018). Ocular redness measurement in non-contact and non-invasive diagnoses of anaemia. Journal of Imaging, 4(8), 95.</w:t>
+      </w:r>
+    </w:p>
+    <w:p>
+      <w:pPr>
+        <w:spacing w:before="20" w:after="40"/>
+        <w:ind w:left="283" w:hanging="283"/>
+      </w:pPr>
+      <w:r>
+        <w:rPr>
+          <w:sz w:val="17"/>
+        </w:rPr>
+        <w:t>13. Valles-Coral, M. A., et al. (2025). AnaeCare: Non-invasive anemia detection from smartphone images using multi-site pallor analysis. arXiv.</w:t>
+      </w:r>
+    </w:p>
+    <w:p>
+      <w:pPr>
+        <w:spacing w:before="20" w:after="40"/>
+        <w:ind w:left="283" w:hanging="283"/>
+      </w:pPr>
+      <w:r>
+        <w:rPr>
+          <w:sz w:val="17"/>
+        </w:rPr>
+        <w:t>14. Baltrusaitis, T., Ahuja, C., &amp; Morency, L. P. (2019). Multimodal machine learning: A survey and taxonomy. IEEE TPAMI, 41(2), 423–443.</w:t>
+      </w:r>
+    </w:p>
+    <w:p>
+      <w:pPr>
+        <w:spacing w:before="20" w:after="40"/>
+        <w:ind w:left="283" w:hanging="283"/>
+      </w:pPr>
+      <w:r>
+        <w:rPr>
+          <w:sz w:val="17"/>
+        </w:rPr>
+        <w:t>15. Huang, S. C., et al. (2020). Fusion of medical imaging and electronic health records using deep learning. npj Digital Medicine, 3(1), 136.</w:t>
+      </w:r>
+    </w:p>
+    <w:p>
+      <w:pPr>
+        <w:spacing w:before="20" w:after="40"/>
+        <w:ind w:left="283" w:hanging="283"/>
+      </w:pPr>
+      <w:r>
+        <w:rPr>
+          <w:sz w:val="17"/>
+        </w:rPr>
+        <w:t>16. Gal, Y., &amp; Ghahramani, Z. (2016). Dropout as a Bayesian Approximation: Representing Model Uncertainty in Deep Learning. ICML, 48, 1050–1059.</w:t>
+      </w:r>
+    </w:p>
+    <w:p>
+      <w:pPr>
+        <w:spacing w:before="20" w:after="40"/>
+        <w:ind w:left="283" w:hanging="283"/>
+      </w:pPr>
+      <w:r>
+        <w:rPr>
+          <w:sz w:val="17"/>
+        </w:rPr>
+        <w:t>17. Platt, J. (1999). Probabilistic outputs for support vector machines and comparisons to regularized likelihood methods. Advances in Large Margin Classifiers.</w:t>
+      </w:r>
+    </w:p>
+    <w:p>
+      <w:pPr>
+        <w:spacing w:before="20" w:after="40"/>
+        <w:ind w:left="283" w:hanging="283"/>
+      </w:pPr>
+      <w:r>
+        <w:rPr>
+          <w:sz w:val="17"/>
+        </w:rPr>
+        <w:t>18. Food and Nutrition Research Institute (DOST-FNRI, 2020). Expanded National Nutrition Survey.</w:t>
+      </w:r>
+    </w:p>
+    <w:p>
+      <w:pPr>
+        <w:spacing w:before="20" w:after="40"/>
+        <w:ind w:left="283" w:hanging="283"/>
+      </w:pPr>
+      <w:r>
+        <w:rPr>
+          <w:sz w:val="17"/>
+        </w:rPr>
+        <w:t>19. Republic of the Philippines (2018). Republic Act No. 11148: Kalusugan at Nutrisyon ng Mag-Nanay Act (First 1,000 Days Law).</w:t>
+      </w:r>
+    </w:p>
+    <w:p>
+      <w:pPr>
+        <w:spacing w:before="20" w:after="40"/>
+        <w:ind w:left="283" w:hanging="283"/>
+      </w:pPr>
+      <w:r>
+        <w:rPr>
+          <w:sz w:val="17"/>
+        </w:rPr>
+        <w:t>20. Republic of the Philippines (2019). Republic Act No. 11223: Universal Health Care Act.</w:t>
       </w:r>
     </w:p>
     <w:p/>

</xml_diff>

<commit_message>
docs: complete 7 figure placeholders and STARD validation in Concept Note
</commit_message>
<xml_diff>
--- a/docs/TinginHB_Revised_Concept_Note_PSCXI.docx
+++ b/docs/TinginHB_Revised_Concept_Note_PSCXI.docx
@@ -284,6 +284,192 @@
         <w:t>TinginHB's Value Proposition is not analytical superiority over CBC; it is diagnostic accessibility and standardization over naked-eye triage.</w:t>
       </w:r>
     </w:p>
+    <w:tbl>
+      <w:tblPr>
+        <w:tblStyle w:val="TableGrid"/>
+        <w:tblW w:type="auto" w:w="0"/>
+        <w:jc w:val="center"/>
+        <w:tblLayout w:type="fixed"/>
+        <w:tblLook w:firstColumn="1" w:firstRow="1" w:lastColumn="0" w:lastRow="0" w:noHBand="0" w:noVBand="1" w:val="04A0"/>
+      </w:tblPr>
+      <w:tblGrid>
+        <w:gridCol w:w="9406"/>
+      </w:tblGrid>
+      <w:tr>
+        <w:tc>
+          <w:tcPr>
+            <w:tcW w:type="dxa" w:w="9071"/>
+            <w:shd w:val="clear" w:color="auto" w:fill="0E4D64"/>
+          </w:tcPr>
+          <w:p>
+            <w:pPr>
+              <w:spacing w:before="80" w:after="80"/>
+              <w:jc w:val="left"/>
+            </w:pPr>
+            <w:r>
+              <w:rPr>
+                <w:b/>
+                <w:color w:val="FFFFFF"/>
+                <w:sz w:val="19"/>
+              </w:rPr>
+              <w:t xml:space="preserve">  [FIGURE 1 PLACEHOLDER: PHILIPPINE MATERNAL ANEMIA &amp; PPH BURDEN]</w:t>
+            </w:r>
+          </w:p>
+        </w:tc>
+      </w:tr>
+      <w:tr>
+        <w:tc>
+          <w:tcPr>
+            <w:tcW w:type="dxa" w:w="9071"/>
+            <w:shd w:val="clear" w:color="auto" w:fill="F4F9FB"/>
+          </w:tcPr>
+          <w:p>
+            <w:pPr>
+              <w:spacing w:before="80" w:after="40"/>
+            </w:pPr>
+            <w:r>
+              <w:rPr>
+                <w:b/>
+                <w:color w:val="1B6B8A"/>
+                <w:sz w:val="18"/>
+              </w:rPr>
+              <w:t xml:space="preserve">Suggested Visual: </w:t>
+            </w:r>
+            <w:r>
+              <w:rPr>
+                <w:sz w:val="18"/>
+              </w:rPr>
+              <w:t>Infographic chart / map combining prevalence data, maternal mortality breakdown, and GIDA health access geography.</w:t>
+            </w:r>
+          </w:p>
+          <w:p>
+            <w:pPr>
+              <w:spacing w:before="20" w:after="20"/>
+              <w:ind w:left="283"/>
+            </w:pPr>
+            <w:r>
+              <w:rPr>
+                <w:b/>
+                <w:color w:val="2B8AAE"/>
+                <w:sz w:val="17"/>
+              </w:rPr>
+              <w:t xml:space="preserve">• </w:t>
+            </w:r>
+            <w:r>
+              <w:rPr>
+                <w:sz w:val="17"/>
+              </w:rPr>
+              <w:t>DOST-FNRI Anemia Prevalence: Bar chart highlighting 21.8% to 28.0% in pregnant women and 40%–45% in infants aged 6–11 months.</w:t>
+            </w:r>
+          </w:p>
+          <w:p>
+            <w:pPr>
+              <w:spacing w:before="20" w:after="20"/>
+              <w:ind w:left="283"/>
+            </w:pPr>
+            <w:r>
+              <w:rPr>
+                <w:b/>
+                <w:color w:val="2B8AAE"/>
+                <w:sz w:val="17"/>
+              </w:rPr>
+              <w:t xml:space="preserve">• </w:t>
+            </w:r>
+            <w:r>
+              <w:rPr>
+                <w:sz w:val="17"/>
+              </w:rPr>
+              <w:t>Philippine Maternal Mortality: Pie chart showing Postpartum Hemorrhage (PPH) causing ~30% of maternal deaths (~2,000+ deaths/yr), with a 4-fold risk multiplier in anemic mothers.</w:t>
+            </w:r>
+          </w:p>
+          <w:p>
+            <w:pPr>
+              <w:spacing w:before="20" w:after="20"/>
+              <w:ind w:left="283"/>
+            </w:pPr>
+            <w:r>
+              <w:rPr>
+                <w:b/>
+                <w:color w:val="2B8AAE"/>
+                <w:sz w:val="17"/>
+              </w:rPr>
+              <w:t xml:space="preserve">• </w:t>
+            </w:r>
+            <w:r>
+              <w:rPr>
+                <w:sz w:val="17"/>
+              </w:rPr>
+              <w:t>Geographic CBC Bottleneck: Accessibility map contrasting urban laboratory density (₱200–₱350 CBC) vs. rural GIDA barangays requiring 2–6 hours travel and ₱300–₱800 fare.</w:t>
+            </w:r>
+          </w:p>
+          <w:p>
+            <w:pPr>
+              <w:spacing w:before="20" w:after="20"/>
+              <w:ind w:left="283"/>
+            </w:pPr>
+            <w:r>
+              <w:rPr>
+                <w:b/>
+                <w:color w:val="2B8AAE"/>
+                <w:sz w:val="17"/>
+              </w:rPr>
+              <w:t xml:space="preserve">• </w:t>
+            </w:r>
+            <w:r>
+              <w:rPr>
+                <w:sz w:val="17"/>
+              </w:rPr>
+              <w:t>HemoCue Stockout Paradox: Comparison showing ₱70k–₱125k capital cost and ₱150/test cuvette vs. ₱0 consumable smartphone triage.</w:t>
+            </w:r>
+          </w:p>
+          <w:p>
+            <w:pPr>
+              <w:spacing w:before="80" w:after="40"/>
+            </w:pPr>
+            <w:r>
+              <w:rPr>
+                <w:b/>
+                <w:sz w:val="18"/>
+              </w:rPr>
+              <w:t xml:space="preserve">Caption: </w:t>
+            </w:r>
+            <w:r>
+              <w:rPr>
+                <w:i/>
+                <w:sz w:val="18"/>
+              </w:rPr>
+              <w:t>Figure 1. The Maternal Anemia and Diagnostic Desert in the Philippines.</w:t>
+            </w:r>
+          </w:p>
+          <w:p>
+            <w:pPr>
+              <w:spacing w:before="20" w:after="80"/>
+            </w:pPr>
+            <w:r>
+              <w:rPr>
+                <w:b/>
+                <w:color w:val="556677"/>
+                <w:sz w:val="17"/>
+              </w:rPr>
+              <w:t xml:space="preserve">Data Sources / Theoretical Grounding: </w:t>
+            </w:r>
+            <w:r>
+              <w:rPr>
+                <w:i/>
+                <w:color w:val="556677"/>
+                <w:sz w:val="17"/>
+              </w:rPr>
+              <w:t>DOST-FNRI Expanded National Nutrition Survey (2020); DOH Maternal Health Statistics; Philippine Statistics Authority (PSA) Civil Registration and Vital Stats.</w:t>
+            </w:r>
+          </w:p>
+        </w:tc>
+      </w:tr>
+    </w:tbl>
+    <w:p>
+      <w:pPr>
+        <w:spacing w:before="0" w:after="80"/>
+      </w:pPr>
+    </w:p>
     <w:p>
       <w:pPr>
         <w:spacing w:before="280" w:after="60"/>
@@ -333,6 +519,172 @@
         </w:rPr>
         <w:t>Secondary Site — Subungual Nail Bed: Subungual capillary plexus viewed through a uniform 0.5–0.8 mm keratin plate, avoiding light scattering from calluses. Periungual skin melanin is normalized using the Contrast Ratio (CR) method (Mannino et al., 2018).</w:t>
       </w:r>
+    </w:p>
+    <w:tbl>
+      <w:tblPr>
+        <w:tblStyle w:val="TableGrid"/>
+        <w:tblW w:type="auto" w:w="0"/>
+        <w:jc w:val="center"/>
+        <w:tblLayout w:type="fixed"/>
+        <w:tblLook w:firstColumn="1" w:firstRow="1" w:lastColumn="0" w:lastRow="0" w:noHBand="0" w:noVBand="1" w:val="04A0"/>
+      </w:tblPr>
+      <w:tblGrid>
+        <w:gridCol w:w="9406"/>
+      </w:tblGrid>
+      <w:tr>
+        <w:tc>
+          <w:tcPr>
+            <w:tcW w:type="dxa" w:w="9071"/>
+            <w:shd w:val="clear" w:color="auto" w:fill="0E4D64"/>
+          </w:tcPr>
+          <w:p>
+            <w:pPr>
+              <w:spacing w:before="80" w:after="80"/>
+              <w:jc w:val="left"/>
+            </w:pPr>
+            <w:r>
+              <w:rPr>
+                <w:b/>
+                <w:color w:val="FFFFFF"/>
+                <w:sz w:val="19"/>
+              </w:rPr>
+              <w:t xml:space="preserve">  [FIGURE 2 PLACEHOLDER: MICROVASCULAR OPTICAL ANATOMY &amp; SPECTRAL ABSORPTION]</w:t>
+            </w:r>
+          </w:p>
+        </w:tc>
+      </w:tr>
+      <w:tr>
+        <w:tc>
+          <w:tcPr>
+            <w:tcW w:type="dxa" w:w="9071"/>
+            <w:shd w:val="clear" w:color="auto" w:fill="F4F9FB"/>
+          </w:tcPr>
+          <w:p>
+            <w:pPr>
+              <w:spacing w:before="80" w:after="40"/>
+            </w:pPr>
+            <w:r>
+              <w:rPr>
+                <w:b/>
+                <w:color w:val="1B6B8A"/>
+                <w:sz w:val="18"/>
+              </w:rPr>
+              <w:t xml:space="preserve">Suggested Visual: </w:t>
+            </w:r>
+            <w:r>
+              <w:rPr>
+                <w:sz w:val="18"/>
+              </w:rPr>
+              <w:t>Multi-panel optical physics diagram comparing conjunctiva and subungual nail bed signal paths.</w:t>
+            </w:r>
+          </w:p>
+          <w:p>
+            <w:pPr>
+              <w:spacing w:before="20" w:after="20"/>
+              <w:ind w:left="283"/>
+            </w:pPr>
+            <w:r>
+              <w:rPr>
+                <w:b/>
+                <w:color w:val="2B8AAE"/>
+                <w:sz w:val="17"/>
+              </w:rPr>
+              <w:t xml:space="preserve">• </w:t>
+            </w:r>
+            <w:r>
+              <w:rPr>
+                <w:sz w:val="17"/>
+              </w:rPr>
+              <w:t>Oxygenated Hemoglobin Absorption Curve: Spectral plot showing distinct extinction peaks at 540 nm and 576 nm within the green color spectrum.</w:t>
+            </w:r>
+          </w:p>
+          <w:p>
+            <w:pPr>
+              <w:spacing w:before="20" w:after="20"/>
+              <w:ind w:left="283"/>
+            </w:pPr>
+            <w:r>
+              <w:rPr>
+                <w:b/>
+                <w:color w:val="2B8AAE"/>
+                <w:sz w:val="17"/>
+              </w:rPr>
+              <w:t xml:space="preserve">• </w:t>
+            </w:r>
+            <w:r>
+              <w:rPr>
+                <w:sz w:val="17"/>
+              </w:rPr>
+              <w:t>Palpebral Conjunctiva Cross-Section: Microvascular diagram illustrating non-keratinized epithelium with zero melanocytes (Fitzpatrick I–VI invariance) and adjacent white sclera anchor.</w:t>
+            </w:r>
+          </w:p>
+          <w:p>
+            <w:pPr>
+              <w:spacing w:before="20" w:after="20"/>
+              <w:ind w:left="283"/>
+            </w:pPr>
+            <w:r>
+              <w:rPr>
+                <w:b/>
+                <w:color w:val="2B8AAE"/>
+                <w:sz w:val="17"/>
+              </w:rPr>
+              <w:t xml:space="preserve">• </w:t>
+            </w:r>
+            <w:r>
+              <w:rPr>
+                <w:sz w:val="17"/>
+              </w:rPr>
+              <w:t>Subungual Nail Bed Optical Transmission: Diagram showing 0.5–0.8 mm translucent keratin plate, subungual microvascular plexus, and periungual Contrast Ratio (CR) melanin subtraction zone.</w:t>
+            </w:r>
+          </w:p>
+          <w:p>
+            <w:pPr>
+              <w:spacing w:before="80" w:after="40"/>
+            </w:pPr>
+            <w:r>
+              <w:rPr>
+                <w:b/>
+                <w:sz w:val="18"/>
+              </w:rPr>
+              <w:t xml:space="preserve">Caption: </w:t>
+            </w:r>
+            <w:r>
+              <w:rPr>
+                <w:i/>
+                <w:sz w:val="18"/>
+              </w:rPr>
+              <w:t>Figure 2. Optical Transmission and Chromophore Absorption in Primary Anatomical Sites.</w:t>
+            </w:r>
+          </w:p>
+          <w:p>
+            <w:pPr>
+              <w:spacing w:before="20" w:after="80"/>
+            </w:pPr>
+            <w:r>
+              <w:rPr>
+                <w:b/>
+                <w:color w:val="556677"/>
+                <w:sz w:val="17"/>
+              </w:rPr>
+              <w:t xml:space="preserve">Data Sources / Theoretical Grounding: </w:t>
+            </w:r>
+            <w:r>
+              <w:rPr>
+                <w:i/>
+                <w:color w:val="556677"/>
+                <w:sz w:val="17"/>
+              </w:rPr>
+              <w:t>Prahl (1999); Kim et al. (2020, PNAS); Mannino et al. (2018, Nature Communications).</w:t>
+            </w:r>
+          </w:p>
+        </w:tc>
+      </w:tr>
+    </w:tbl>
+    <w:p>
+      <w:pPr>
+        <w:spacing w:before="0" w:after="80"/>
+      </w:pPr>
     </w:p>
     <w:p>
       <w:pPr>
@@ -651,6 +1003,192 @@
         </w:rPr>
         <w:t>Post-Hoc Calibration (Platt Scaling): Calibrates probabilities to achieve Expected Calibration Error ECE ≤ 0.08.</w:t>
       </w:r>
+    </w:p>
+    <w:tbl>
+      <w:tblPr>
+        <w:tblStyle w:val="TableGrid"/>
+        <w:tblW w:type="auto" w:w="0"/>
+        <w:jc w:val="center"/>
+        <w:tblLayout w:type="fixed"/>
+        <w:tblLook w:firstColumn="1" w:firstRow="1" w:lastColumn="0" w:lastRow="0" w:noHBand="0" w:noVBand="1" w:val="04A0"/>
+      </w:tblPr>
+      <w:tblGrid>
+        <w:gridCol w:w="9406"/>
+      </w:tblGrid>
+      <w:tr>
+        <w:tc>
+          <w:tcPr>
+            <w:tcW w:type="dxa" w:w="9071"/>
+            <w:shd w:val="clear" w:color="auto" w:fill="0E4D64"/>
+          </w:tcPr>
+          <w:p>
+            <w:pPr>
+              <w:spacing w:before="80" w:after="80"/>
+              <w:jc w:val="left"/>
+            </w:pPr>
+            <w:r>
+              <w:rPr>
+                <w:b/>
+                <w:color w:val="FFFFFF"/>
+                <w:sz w:val="19"/>
+              </w:rPr>
+              <w:t xml:space="preserve">  [FIGURE 3 PLACEHOLDER: END-TO-END EDGE-AI PIPELINE ARCHITECTURE]</w:t>
+            </w:r>
+          </w:p>
+        </w:tc>
+      </w:tr>
+      <w:tr>
+        <w:tc>
+          <w:tcPr>
+            <w:tcW w:type="dxa" w:w="9071"/>
+            <w:shd w:val="clear" w:color="auto" w:fill="F4F9FB"/>
+          </w:tcPr>
+          <w:p>
+            <w:pPr>
+              <w:spacing w:before="80" w:after="40"/>
+            </w:pPr>
+            <w:r>
+              <w:rPr>
+                <w:b/>
+                <w:color w:val="1B6B8A"/>
+                <w:sz w:val="18"/>
+              </w:rPr>
+              <w:t xml:space="preserve">Suggested Visual: </w:t>
+            </w:r>
+            <w:r>
+              <w:rPr>
+                <w:sz w:val="18"/>
+              </w:rPr>
+              <w:t>Neural network architecture schematic diagram illustrating offline edge inference.</w:t>
+            </w:r>
+          </w:p>
+          <w:p>
+            <w:pPr>
+              <w:spacing w:before="20" w:after="20"/>
+              <w:ind w:left="283"/>
+            </w:pPr>
+            <w:r>
+              <w:rPr>
+                <w:b/>
+                <w:color w:val="2B8AAE"/>
+                <w:sz w:val="17"/>
+              </w:rPr>
+              <w:t xml:space="preserve">• </w:t>
+            </w:r>
+            <w:r>
+              <w:rPr>
+                <w:sz w:val="17"/>
+              </w:rPr>
+              <w:t>Assisted Image Acquisition: Camera viewfinder with elliptical guide overlays and real-time Laplacian blur filtering.</w:t>
+            </w:r>
+          </w:p>
+          <w:p>
+            <w:pPr>
+              <w:spacing w:before="20" w:after="20"/>
+              <w:ind w:left="283"/>
+            </w:pPr>
+            <w:r>
+              <w:rPr>
+                <w:b/>
+                <w:color w:val="2B8AAE"/>
+                <w:sz w:val="17"/>
+              </w:rPr>
+              <w:t xml:space="preserve">• </w:t>
+            </w:r>
+            <w:r>
+              <w:rPr>
+                <w:sz w:val="17"/>
+              </w:rPr>
+              <w:t>Region of Interest Segmentation: YOLOv8n-seg (INT8, ~3.5 MB, 80ms) generating polygon masks for conjunctiva, sclera, and nail plate.</w:t>
+            </w:r>
+          </w:p>
+          <w:p>
+            <w:pPr>
+              <w:spacing w:before="20" w:after="20"/>
+              <w:ind w:left="283"/>
+            </w:pPr>
+            <w:r>
+              <w:rPr>
+                <w:b/>
+                <w:color w:val="2B8AAE"/>
+                <w:sz w:val="17"/>
+              </w:rPr>
+              <w:t xml:space="preserve">• </w:t>
+            </w:r>
+            <w:r>
+              <w:rPr>
+                <w:sz w:val="17"/>
+              </w:rPr>
+              <w:t>Dual-Branch Feature Extractor: Deep convolutional representations via MobileNetV3-Small (FP16, ~5.2 MB) parallel to 16 handcrafted colorimetric radiomics (Erythema Index, Pallor Index).</w:t>
+            </w:r>
+          </w:p>
+          <w:p>
+            <w:pPr>
+              <w:spacing w:before="20" w:after="20"/>
+              <w:ind w:left="283"/>
+            </w:pPr>
+            <w:r>
+              <w:rPr>
+                <w:b/>
+                <w:color w:val="2B8AAE"/>
+                <w:sz w:val="17"/>
+              </w:rPr>
+              <w:t xml:space="preserve">• </w:t>
+            </w:r>
+            <w:r>
+              <w:rPr>
+                <w:sz w:val="17"/>
+              </w:rPr>
+              <w:t>Bayesian Uncertainty Engine: Monte Carlo Dropout (N=50 stochastic passes) generating Gaussian parameters (ŷ ± σ) followed by Platt Scaling probability calibration.</w:t>
+            </w:r>
+          </w:p>
+          <w:p>
+            <w:pPr>
+              <w:spacing w:before="80" w:after="40"/>
+            </w:pPr>
+            <w:r>
+              <w:rPr>
+                <w:b/>
+                <w:sz w:val="18"/>
+              </w:rPr>
+              <w:t xml:space="preserve">Caption: </w:t>
+            </w:r>
+            <w:r>
+              <w:rPr>
+                <w:i/>
+                <w:sz w:val="18"/>
+              </w:rPr>
+              <w:t>Figure 3. Dual-Branch Deep Learning Pipeline and Bayesian Uncertainty Engine (&lt;10 MB runtime footprint).</w:t>
+            </w:r>
+          </w:p>
+          <w:p>
+            <w:pPr>
+              <w:spacing w:before="20" w:after="80"/>
+            </w:pPr>
+            <w:r>
+              <w:rPr>
+                <w:b/>
+                <w:color w:val="556677"/>
+                <w:sz w:val="17"/>
+              </w:rPr>
+              <w:t xml:space="preserve">Data Sources / Theoretical Grounding: </w:t>
+            </w:r>
+            <w:r>
+              <w:rPr>
+                <w:i/>
+                <w:color w:val="556677"/>
+                <w:sz w:val="17"/>
+              </w:rPr>
+              <w:t>Gal &amp; Ghahramani (2016, ICML); Platt (1999); TinginHB Edge Software Specification.</w:t>
+            </w:r>
+          </w:p>
+        </w:tc>
+      </w:tr>
+    </w:tbl>
+    <w:p>
+      <w:pPr>
+        <w:spacing w:before="0" w:after="80"/>
+      </w:pPr>
     </w:p>
     <w:p>
       <w:pPr>
@@ -1476,6 +2014,192 @@
         <w:t>Omitted/missing tests contribute a neutral factor of LR = 1.0 (ln(1.0) = 0).</w:t>
       </w:r>
     </w:p>
+    <w:tbl>
+      <w:tblPr>
+        <w:tblStyle w:val="TableGrid"/>
+        <w:tblW w:type="auto" w:w="0"/>
+        <w:jc w:val="center"/>
+        <w:tblLayout w:type="fixed"/>
+        <w:tblLook w:firstColumn="1" w:firstRow="1" w:lastColumn="0" w:lastRow="0" w:noHBand="0" w:noVBand="1" w:val="04A0"/>
+      </w:tblPr>
+      <w:tblGrid>
+        <w:gridCol w:w="9406"/>
+      </w:tblGrid>
+      <w:tr>
+        <w:tc>
+          <w:tcPr>
+            <w:tcW w:type="dxa" w:w="9071"/>
+            <w:shd w:val="clear" w:color="auto" w:fill="0E4D64"/>
+          </w:tcPr>
+          <w:p>
+            <w:pPr>
+              <w:spacing w:before="80" w:after="80"/>
+              <w:jc w:val="left"/>
+            </w:pPr>
+            <w:r>
+              <w:rPr>
+                <w:b/>
+                <w:color w:val="FFFFFF"/>
+                <w:sz w:val="19"/>
+              </w:rPr>
+              <w:t xml:space="preserve">  [FIGURE 4 PLACEHOLDER: 5-MODALITY DECISION TREE &amp; MISSING MODALITY FLOWCHART]</w:t>
+            </w:r>
+          </w:p>
+        </w:tc>
+      </w:tr>
+      <w:tr>
+        <w:tc>
+          <w:tcPr>
+            <w:tcW w:type="dxa" w:w="9071"/>
+            <w:shd w:val="clear" w:color="auto" w:fill="F4F9FB"/>
+          </w:tcPr>
+          <w:p>
+            <w:pPr>
+              <w:spacing w:before="80" w:after="40"/>
+            </w:pPr>
+            <w:r>
+              <w:rPr>
+                <w:b/>
+                <w:color w:val="1B6B8A"/>
+                <w:sz w:val="18"/>
+              </w:rPr>
+              <w:t xml:space="preserve">Suggested Visual: </w:t>
+            </w:r>
+            <w:r>
+              <w:rPr>
+                <w:sz w:val="18"/>
+              </w:rPr>
+              <w:t>Decision flow diagram / workflow tree illustrating graceful degradation across clinical scenarios.</w:t>
+            </w:r>
+          </w:p>
+          <w:p>
+            <w:pPr>
+              <w:spacing w:before="20" w:after="20"/>
+              <w:ind w:left="283"/>
+            </w:pPr>
+            <w:r>
+              <w:rPr>
+                <w:b/>
+                <w:color w:val="2B8AAE"/>
+                <w:sz w:val="17"/>
+              </w:rPr>
+              <w:t xml:space="preserve">• </w:t>
+            </w:r>
+            <w:r>
+              <w:rPr>
+                <w:sz w:val="17"/>
+              </w:rPr>
+              <w:t>Modality Acquisition Gate: Simultaneous check for active inputs: Conjunctiva (35%), Nail Bed (25%), Patient Survey (15%), Palmar Creases (15%), BP / Pulse (10%).</w:t>
+            </w:r>
+          </w:p>
+          <w:p>
+            <w:pPr>
+              <w:spacing w:before="20" w:after="20"/>
+              <w:ind w:left="283"/>
+            </w:pPr>
+            <w:r>
+              <w:rPr>
+                <w:b/>
+                <w:color w:val="2B8AAE"/>
+                <w:sz w:val="17"/>
+              </w:rPr>
+              <w:t xml:space="preserve">• </w:t>
+            </w:r>
+            <w:r>
+              <w:rPr>
+                <w:sz w:val="17"/>
+              </w:rPr>
+              <w:t>Dynamic Weight Normalization Engine: Re-scaling formula w'_i = w_i / SUM(w_avail) adapting weights for Full Clinic (100%), Rapid Field Visit (75%), and Pediatric Fallback (55%).</w:t>
+            </w:r>
+          </w:p>
+          <w:p>
+            <w:pPr>
+              <w:spacing w:before="20" w:after="20"/>
+              <w:ind w:left="283"/>
+            </w:pPr>
+            <w:r>
+              <w:rPr>
+                <w:b/>
+                <w:color w:val="2B8AAE"/>
+                <w:sz w:val="17"/>
+              </w:rPr>
+              <w:t xml:space="preserve">• </w:t>
+            </w:r>
+            <w:r>
+              <w:rPr>
+                <w:sz w:val="17"/>
+              </w:rPr>
+              <w:t>Discrepancy &amp; Plausibility Checker: Automated check triggering palmar crease scan if |Eye - Nail| &gt; 2.0 g/dL to rule out unilateral conjunctival inflammation.</w:t>
+            </w:r>
+          </w:p>
+          <w:p>
+            <w:pPr>
+              <w:spacing w:before="20" w:after="20"/>
+              <w:ind w:left="283"/>
+            </w:pPr>
+            <w:r>
+              <w:rPr>
+                <w:b/>
+                <w:color w:val="2B8AAE"/>
+                <w:sz w:val="17"/>
+              </w:rPr>
+              <w:t xml:space="preserve">• </w:t>
+            </w:r>
+            <w:r>
+              <w:rPr>
+                <w:sz w:val="17"/>
+              </w:rPr>
+              <w:t>Bayesian Evidence Stacking: Likelihood ratio log-odds fusion yielding calibrated posterior probability mapped to 4-tier WHO Triage Action Protocols.</w:t>
+            </w:r>
+          </w:p>
+          <w:p>
+            <w:pPr>
+              <w:spacing w:before="80" w:after="40"/>
+            </w:pPr>
+            <w:r>
+              <w:rPr>
+                <w:b/>
+                <w:sz w:val="18"/>
+              </w:rPr>
+              <w:t xml:space="preserve">Caption: </w:t>
+            </w:r>
+            <w:r>
+              <w:rPr>
+                <w:i/>
+                <w:sz w:val="18"/>
+              </w:rPr>
+              <w:t>Figure 4. 5-Modality Dynamic Weighting Decision Tree and Missing-Modality Fallback Workflow.</w:t>
+            </w:r>
+          </w:p>
+          <w:p>
+            <w:pPr>
+              <w:spacing w:before="20" w:after="80"/>
+            </w:pPr>
+            <w:r>
+              <w:rPr>
+                <w:b/>
+                <w:color w:val="556677"/>
+                <w:sz w:val="17"/>
+              </w:rPr>
+              <w:t xml:space="preserve">Data Sources / Theoretical Grounding: </w:t>
+            </w:r>
+            <w:r>
+              <w:rPr>
+                <w:i/>
+                <w:color w:val="556677"/>
+                <w:sz w:val="17"/>
+              </w:rPr>
+              <w:t>Baltrusaitis et al. (2019, IEEE TPAMI); Huang et al. (2020, npj Digital Medicine); Strobach et al. (1988, JAMA).</w:t>
+            </w:r>
+          </w:p>
+        </w:tc>
+      </w:tr>
+    </w:tbl>
+    <w:p>
+      <w:pPr>
+        <w:spacing w:before="0" w:after="80"/>
+      </w:pPr>
+    </w:p>
     <w:p>
       <w:pPr>
         <w:spacing w:before="280" w:after="60"/>
@@ -1944,6 +2668,192 @@
       </w:tr>
     </w:tbl>
     <w:p/>
+    <w:tbl>
+      <w:tblPr>
+        <w:tblStyle w:val="TableGrid"/>
+        <w:tblW w:type="auto" w:w="0"/>
+        <w:jc w:val="center"/>
+        <w:tblLayout w:type="fixed"/>
+        <w:tblLook w:firstColumn="1" w:firstRow="1" w:lastColumn="0" w:lastRow="0" w:noHBand="0" w:noVBand="1" w:val="04A0"/>
+      </w:tblPr>
+      <w:tblGrid>
+        <w:gridCol w:w="9406"/>
+      </w:tblGrid>
+      <w:tr>
+        <w:tc>
+          <w:tcPr>
+            <w:tcW w:type="dxa" w:w="9071"/>
+            <w:shd w:val="clear" w:color="auto" w:fill="0E4D64"/>
+          </w:tcPr>
+          <w:p>
+            <w:pPr>
+              <w:spacing w:before="80" w:after="80"/>
+              <w:jc w:val="left"/>
+            </w:pPr>
+            <w:r>
+              <w:rPr>
+                <w:b/>
+                <w:color w:val="FFFFFF"/>
+                <w:sz w:val="19"/>
+              </w:rPr>
+              <w:t xml:space="preserve">  [FIGURE 5 PLACEHOLDER: FRONTLINE BHW MOBILE APP UI &amp; REFERRAL PDF MOCKUP]</w:t>
+            </w:r>
+          </w:p>
+        </w:tc>
+      </w:tr>
+      <w:tr>
+        <w:tc>
+          <w:tcPr>
+            <w:tcW w:type="dxa" w:w="9071"/>
+            <w:shd w:val="clear" w:color="auto" w:fill="F4F9FB"/>
+          </w:tcPr>
+          <w:p>
+            <w:pPr>
+              <w:spacing w:before="80" w:after="40"/>
+            </w:pPr>
+            <w:r>
+              <w:rPr>
+                <w:b/>
+                <w:color w:val="1B6B8A"/>
+                <w:sz w:val="18"/>
+              </w:rPr>
+              <w:t xml:space="preserve">Suggested Visual: </w:t>
+            </w:r>
+            <w:r>
+              <w:rPr>
+                <w:sz w:val="18"/>
+              </w:rPr>
+              <w:t>High-fidelity 4-screen mobile user interface flow and printable referral document mockup.</w:t>
+            </w:r>
+          </w:p>
+          <w:p>
+            <w:pPr>
+              <w:spacing w:before="20" w:after="20"/>
+              <w:ind w:left="283"/>
+            </w:pPr>
+            <w:r>
+              <w:rPr>
+                <w:b/>
+                <w:color w:val="2B8AAE"/>
+                <w:sz w:val="17"/>
+              </w:rPr>
+              <w:t xml:space="preserve">• </w:t>
+            </w:r>
+            <w:r>
+              <w:rPr>
+                <w:sz w:val="17"/>
+              </w:rPr>
+              <w:t>Screen 1 (Assisted Capture): Viewfinder with green positioning guide, real-time focus validation, and auto-exposure lock.</w:t>
+            </w:r>
+          </w:p>
+          <w:p>
+            <w:pPr>
+              <w:spacing w:before="20" w:after="20"/>
+              <w:ind w:left="283"/>
+            </w:pPr>
+            <w:r>
+              <w:rPr>
+                <w:b/>
+                <w:color w:val="2B8AAE"/>
+                <w:sz w:val="17"/>
+              </w:rPr>
+              <w:t xml:space="preserve">• </w:t>
+            </w:r>
+            <w:r>
+              <w:rPr>
+                <w:sz w:val="17"/>
+              </w:rPr>
+              <w:t>Screen 2 (4-Tap Clinical Survey): Minimalist questionnaire for patient age, pregnancy trimester, and acute symptoms (dizziness/fatigue).</w:t>
+            </w:r>
+          </w:p>
+          <w:p>
+            <w:pPr>
+              <w:spacing w:before="20" w:after="20"/>
+              <w:ind w:left="283"/>
+            </w:pPr>
+            <w:r>
+              <w:rPr>
+                <w:b/>
+                <w:color w:val="2B8AAE"/>
+                <w:sz w:val="17"/>
+              </w:rPr>
+              <w:t xml:space="preserve">• </w:t>
+            </w:r>
+            <w:r>
+              <w:rPr>
+                <w:sz w:val="17"/>
+              </w:rPr>
+              <w:t>Screen 3 (Calibrated Triage Card): Actionable color-coded risk card displaying posterior probability band, clear Filipino/English directives, and auditory cues.</w:t>
+            </w:r>
+          </w:p>
+          <w:p>
+            <w:pPr>
+              <w:spacing w:before="20" w:after="20"/>
+              <w:ind w:left="283"/>
+            </w:pPr>
+            <w:r>
+              <w:rPr>
+                <w:b/>
+                <w:color w:val="2B8AAE"/>
+                <w:sz w:val="17"/>
+              </w:rPr>
+              <w:t xml:space="preserve">• </w:t>
+            </w:r>
+            <w:r>
+              <w:rPr>
+                <w:sz w:val="17"/>
+              </w:rPr>
+              <w:t>Screen 4 (PhilHealth Konsulta Referral Letter): Automated 1-page PDF referral form with patient metadata, observed clinical cues, risk tier, and QR verification code for RHU doctor.</w:t>
+            </w:r>
+          </w:p>
+          <w:p>
+            <w:pPr>
+              <w:spacing w:before="80" w:after="40"/>
+            </w:pPr>
+            <w:r>
+              <w:rPr>
+                <w:b/>
+                <w:sz w:val="18"/>
+              </w:rPr>
+              <w:t xml:space="preserve">Caption: </w:t>
+            </w:r>
+            <w:r>
+              <w:rPr>
+                <w:i/>
+                <w:sz w:val="18"/>
+              </w:rPr>
+              <w:t>Figure 5. TinginHB Frontline User Interface and Automated PhilHealth Konsulta Referral Workflow.</w:t>
+            </w:r>
+          </w:p>
+          <w:p>
+            <w:pPr>
+              <w:spacing w:before="20" w:after="80"/>
+            </w:pPr>
+            <w:r>
+              <w:rPr>
+                <w:b/>
+                <w:color w:val="556677"/>
+                <w:sz w:val="17"/>
+              </w:rPr>
+              <w:t xml:space="preserve">Data Sources / Theoretical Grounding: </w:t>
+            </w:r>
+            <w:r>
+              <w:rPr>
+                <w:i/>
+                <w:color w:val="556677"/>
+                <w:sz w:val="17"/>
+              </w:rPr>
+              <w:t>DOH Telemedicine Guidelines; PhilHealth Circular 2022-0005 (Konsulta Package).</w:t>
+            </w:r>
+          </w:p>
+        </w:tc>
+      </w:tr>
+    </w:tbl>
+    <w:p>
+      <w:pPr>
+        <w:spacing w:before="0" w:after="80"/>
+      </w:pPr>
+    </w:p>
     <w:p>
       <w:pPr>
         <w:spacing w:before="280" w:after="60"/>
@@ -2015,7 +2925,473 @@
           <w:color w:val="0E4D64"/>
           <w:sz w:val="27"/>
         </w:rPr>
-        <w:t>IX. COMPETITIVE DIFFERENTIATION MATRIX</w:t>
+        <w:t>IX. RESEARCH TIMELINE &amp; FIELD VALIDATION ROADMAP</w:t>
+      </w:r>
+    </w:p>
+    <w:p>
+      <w:pPr>
+        <w:spacing w:before="40" w:after="80"/>
+        <w:jc w:val="both"/>
+      </w:pPr>
+      <w:r>
+        <w:rPr>
+          <w:i w:val="0"/>
+          <w:sz w:val="20"/>
+        </w:rPr>
+        <w:t>To bridge academic research and frontline public health deployment, TinginHB follows a structured 5-phase clinical validation and engineering roadmap:</w:t>
+      </w:r>
+    </w:p>
+    <w:p>
+      <w:pPr>
+        <w:spacing w:before="60" w:after="60"/>
+        <w:ind w:left="454"/>
+        <w:shd w:val="clear" w:color="auto" w:fill="F4F6F8"/>
+      </w:pPr>
+      <w:r>
+        <w:rPr>
+          <w:rFonts w:ascii="Courier New" w:hAnsi="Courier New"/>
+          <w:sz w:val="17"/>
+        </w:rPr>
+        <w:t>[ Phase 1: Months 1–2 ]  Dataset Curation &amp; Synthetic Augmentation</w:t>
+        <w:br/>
+        <w:t xml:space="preserve">                         • Preprocess Ghana (710 eye, 4,260 nail, 4,260 palm) &amp; Peru cohorts</w:t>
+        <w:br/>
+        <w:t xml:space="preserve">                         • Train YOLOv8n-seg region proposal models</w:t>
+        <w:br/>
+        <w:br/>
+        <w:t>[ Phase 2: Months 2–3 ]  Dual-Branch Model Training &amp; MC Dropout</w:t>
+        <w:br/>
+        <w:t xml:space="preserve">                         • Train MobileNetV3-Small deep branch + 16-feature radiomics branch</w:t>
+        <w:br/>
+        <w:t xml:space="preserve">                         • Implement Huber loss &amp; Platt probability calibration (ECE ≤ 0.08)</w:t>
+        <w:br/>
+        <w:br/>
+        <w:t>[ Phase 3: Months 3–4 ]  Android Edge Integration &amp; Usability Testing</w:t>
+        <w:br/>
+        <w:t xml:space="preserve">                         • TFLite quantization, offline PDF referral generation</w:t>
+        <w:br/>
+        <w:t xml:space="preserve">                         • Usability trials with student BHW volunteers</w:t>
+        <w:br/>
+        <w:br/>
+        <w:t>[ Phase 4: Months 5–7 ]  Prospective Clinical Field Validation (STARD Compliant)</w:t>
+        <w:br/>
+        <w:t xml:space="preserve">                         • Target n = 250 subjects at Cagayan de Oro RHUs</w:t>
+        <w:br/>
+        <w:t xml:space="preserve">                         • Paired with laboratory automated CBC (Sysmex XN) within 2 hours</w:t>
+        <w:br/>
+        <w:t xml:space="preserve">                         • Primary Endpoint: AUROC ≥ 0.88 for Hb &lt; 10.0 g/dL</w:t>
+        <w:br/>
+        <w:br/>
+        <w:t>[ Phase 5: Months 8–9 ]  Regulatory Filing &amp; Academic Dissemination</w:t>
+        <w:br/>
+        <w:t xml:space="preserve">                         • File for FDA Philippine Medical Device Classification (Software)</w:t>
+        <w:br/>
+        <w:t xml:space="preserve">                         • Submit manuscript to peer-reviewed digital health journal</w:t>
+      </w:r>
+    </w:p>
+    <w:tbl>
+      <w:tblPr>
+        <w:tblStyle w:val="TableGrid"/>
+        <w:tblW w:type="auto" w:w="0"/>
+        <w:jc w:val="center"/>
+        <w:tblLayout w:type="fixed"/>
+        <w:tblLook w:firstColumn="1" w:firstRow="1" w:lastColumn="0" w:lastRow="0" w:noHBand="0" w:noVBand="1" w:val="04A0"/>
+      </w:tblPr>
+      <w:tblGrid>
+        <w:gridCol w:w="9406"/>
+      </w:tblGrid>
+      <w:tr>
+        <w:tc>
+          <w:tcPr>
+            <w:tcW w:type="dxa" w:w="9071"/>
+            <w:shd w:val="clear" w:color="auto" w:fill="0E4D64"/>
+          </w:tcPr>
+          <w:p>
+            <w:pPr>
+              <w:spacing w:before="80" w:after="80"/>
+              <w:jc w:val="left"/>
+            </w:pPr>
+            <w:r>
+              <w:rPr>
+                <w:b/>
+                <w:color w:val="FFFFFF"/>
+                <w:sz w:val="19"/>
+              </w:rPr>
+              <w:t xml:space="preserve">  [FIGURE 6 PLACEHOLDER: PROSPECTIVE CLINICAL VALIDATION DESIGN &amp; ROC CURVE]</w:t>
+            </w:r>
+          </w:p>
+        </w:tc>
+      </w:tr>
+      <w:tr>
+        <w:tc>
+          <w:tcPr>
+            <w:tcW w:type="dxa" w:w="9071"/>
+            <w:shd w:val="clear" w:color="auto" w:fill="F4F9FB"/>
+          </w:tcPr>
+          <w:p>
+            <w:pPr>
+              <w:spacing w:before="80" w:after="40"/>
+            </w:pPr>
+            <w:r>
+              <w:rPr>
+                <w:b/>
+                <w:color w:val="1B6B8A"/>
+                <w:sz w:val="18"/>
+              </w:rPr>
+              <w:t xml:space="preserve">Suggested Visual: </w:t>
+            </w:r>
+            <w:r>
+              <w:rPr>
+                <w:sz w:val="18"/>
+              </w:rPr>
+              <w:t>Dual-panel clinical validation methodology schema and target diagnostic performance curve.</w:t>
+            </w:r>
+          </w:p>
+          <w:p>
+            <w:pPr>
+              <w:spacing w:before="20" w:after="20"/>
+              <w:ind w:left="283"/>
+            </w:pPr>
+            <w:r>
+              <w:rPr>
+                <w:b/>
+                <w:color w:val="2B8AAE"/>
+                <w:sz w:val="17"/>
+              </w:rPr>
+              <w:t xml:space="preserve">• </w:t>
+            </w:r>
+            <w:r>
+              <w:rPr>
+                <w:sz w:val="17"/>
+              </w:rPr>
+              <w:t>STARD Study Flowchart: Prospective recruitment schema of N=250 subjects at Cagayan de Oro City Health Centers (100 pregnant women, 75 infants/children, 75 general adults).</w:t>
+            </w:r>
+          </w:p>
+          <w:p>
+            <w:pPr>
+              <w:spacing w:before="20" w:after="20"/>
+              <w:ind w:left="283"/>
+            </w:pPr>
+            <w:r>
+              <w:rPr>
+                <w:b/>
+                <w:color w:val="2B8AAE"/>
+                <w:sz w:val="17"/>
+              </w:rPr>
+              <w:t xml:space="preserve">• </w:t>
+            </w:r>
+            <w:r>
+              <w:rPr>
+                <w:sz w:val="17"/>
+              </w:rPr>
+              <w:t>Paired Reference Testing: Double-blinded evaluation between non-invasive TinginHB index test and automated venous complete blood count (Sysmex XN-550) within a 2-hour window.</w:t>
+            </w:r>
+          </w:p>
+          <w:p>
+            <w:pPr>
+              <w:spacing w:before="20" w:after="20"/>
+              <w:ind w:left="283"/>
+            </w:pPr>
+            <w:r>
+              <w:rPr>
+                <w:b/>
+                <w:color w:val="2B8AAE"/>
+                <w:sz w:val="17"/>
+              </w:rPr>
+              <w:t xml:space="preserve">• </w:t>
+            </w:r>
+            <w:r>
+              <w:rPr>
+                <w:sz w:val="17"/>
+              </w:rPr>
+              <w:t>Target ROC / AUROC Curves: Expected Receiver Operating Characteristic curve displaying target AUROC &gt;= 0.88 for moderate-to-severe anemia (Hb &lt; 10.0 g/dL), with Sensitivity &gt;= 85% and Specificity &gt;= 80%.</w:t>
+            </w:r>
+          </w:p>
+          <w:p>
+            <w:pPr>
+              <w:spacing w:before="80" w:after="40"/>
+            </w:pPr>
+            <w:r>
+              <w:rPr>
+                <w:b/>
+                <w:sz w:val="18"/>
+              </w:rPr>
+              <w:t xml:space="preserve">Caption: </w:t>
+            </w:r>
+            <w:r>
+              <w:rPr>
+                <w:i/>
+                <w:sz w:val="18"/>
+              </w:rPr>
+              <w:t>Figure 6. Prospective Clinical Field Validation Design (STARD Compliant) and Expected ROC Diagnostic Curves.</w:t>
+            </w:r>
+          </w:p>
+          <w:p>
+            <w:pPr>
+              <w:spacing w:before="20" w:after="80"/>
+            </w:pPr>
+            <w:r>
+              <w:rPr>
+                <w:b/>
+                <w:color w:val="556677"/>
+                <w:sz w:val="17"/>
+              </w:rPr>
+              <w:t xml:space="preserve">Data Sources / Theoretical Grounding: </w:t>
+            </w:r>
+            <w:r>
+              <w:rPr>
+                <w:i/>
+                <w:color w:val="556677"/>
+                <w:sz w:val="17"/>
+              </w:rPr>
+              <w:t>Bossuyt et al. (2015, STARD 2015); Kim et al. (2020, PNAS); Mannino et al. (2018).</w:t>
+            </w:r>
+          </w:p>
+        </w:tc>
+      </w:tr>
+    </w:tbl>
+    <w:p>
+      <w:pPr>
+        <w:spacing w:before="0" w:after="80"/>
+      </w:pPr>
+    </w:p>
+    <w:tbl>
+      <w:tblPr>
+        <w:tblStyle w:val="TableGrid"/>
+        <w:tblW w:type="auto" w:w="0"/>
+        <w:jc w:val="center"/>
+        <w:tblLayout w:type="fixed"/>
+        <w:tblLook w:firstColumn="1" w:firstRow="1" w:lastColumn="0" w:lastRow="0" w:noHBand="0" w:noVBand="1" w:val="04A0"/>
+      </w:tblPr>
+      <w:tblGrid>
+        <w:gridCol w:w="9406"/>
+      </w:tblGrid>
+      <w:tr>
+        <w:tc>
+          <w:tcPr>
+            <w:tcW w:type="dxa" w:w="9071"/>
+            <w:shd w:val="clear" w:color="auto" w:fill="0E4D64"/>
+          </w:tcPr>
+          <w:p>
+            <w:pPr>
+              <w:spacing w:before="80" w:after="80"/>
+              <w:jc w:val="left"/>
+            </w:pPr>
+            <w:r>
+              <w:rPr>
+                <w:b/>
+                <w:color w:val="FFFFFF"/>
+                <w:sz w:val="19"/>
+              </w:rPr>
+              <w:t xml:space="preserve">  [FIGURE 7 PLACEHOLDER: 12-MONTH RESEARCH &amp; PRODUCT ROADMAP GANTT CHART]</w:t>
+            </w:r>
+          </w:p>
+        </w:tc>
+      </w:tr>
+      <w:tr>
+        <w:tc>
+          <w:tcPr>
+            <w:tcW w:type="dxa" w:w="9071"/>
+            <w:shd w:val="clear" w:color="auto" w:fill="F4F9FB"/>
+          </w:tcPr>
+          <w:p>
+            <w:pPr>
+              <w:spacing w:before="80" w:after="40"/>
+            </w:pPr>
+            <w:r>
+              <w:rPr>
+                <w:b/>
+                <w:color w:val="1B6B8A"/>
+                <w:sz w:val="18"/>
+              </w:rPr>
+              <w:t xml:space="preserve">Suggested Visual: </w:t>
+            </w:r>
+            <w:r>
+              <w:rPr>
+                <w:sz w:val="18"/>
+              </w:rPr>
+              <w:t>Horizontal Gantt Chart timeline spanning Months 1 through 12 across 5 core development workstreams.</w:t>
+            </w:r>
+          </w:p>
+          <w:p>
+            <w:pPr>
+              <w:spacing w:before="20" w:after="20"/>
+              <w:ind w:left="283"/>
+            </w:pPr>
+            <w:r>
+              <w:rPr>
+                <w:b/>
+                <w:color w:val="2B8AAE"/>
+                <w:sz w:val="17"/>
+              </w:rPr>
+              <w:t xml:space="preserve">• </w:t>
+            </w:r>
+            <w:r>
+              <w:rPr>
+                <w:sz w:val="17"/>
+              </w:rPr>
+              <w:t>Workstream 1 (Months 1–2): Dataset Curation &amp; Synthetic Augmentation (Ghana &amp; Peru cohorts, YOLOv8n-seg models).</w:t>
+            </w:r>
+          </w:p>
+          <w:p>
+            <w:pPr>
+              <w:spacing w:before="20" w:after="20"/>
+              <w:ind w:left="283"/>
+            </w:pPr>
+            <w:r>
+              <w:rPr>
+                <w:b/>
+                <w:color w:val="2B8AAE"/>
+                <w:sz w:val="17"/>
+              </w:rPr>
+              <w:t xml:space="preserve">• </w:t>
+            </w:r>
+            <w:r>
+              <w:rPr>
+                <w:sz w:val="17"/>
+              </w:rPr>
+              <w:t>Workstream 2 (Months 2–3): Dual-Branch Model Training &amp; MC Dropout (MobileNetV3-S + radiomics, Platt calibration ECE &lt;= 0.08).</w:t>
+            </w:r>
+          </w:p>
+          <w:p>
+            <w:pPr>
+              <w:spacing w:before="20" w:after="20"/>
+              <w:ind w:left="283"/>
+            </w:pPr>
+            <w:r>
+              <w:rPr>
+                <w:b/>
+                <w:color w:val="2B8AAE"/>
+                <w:sz w:val="17"/>
+              </w:rPr>
+              <w:t xml:space="preserve">• </w:t>
+            </w:r>
+            <w:r>
+              <w:rPr>
+                <w:sz w:val="17"/>
+              </w:rPr>
+              <w:t>Workstream 3 (Months 3–5): Android Edge App Development &amp; Usability Testing (quantized TFLite, BHW co-design).</w:t>
+            </w:r>
+          </w:p>
+          <w:p>
+            <w:pPr>
+              <w:spacing w:before="20" w:after="20"/>
+              <w:ind w:left="283"/>
+            </w:pPr>
+            <w:r>
+              <w:rPr>
+                <w:b/>
+                <w:color w:val="2B8AAE"/>
+                <w:sz w:val="17"/>
+              </w:rPr>
+              <w:t xml:space="preserve">• </w:t>
+            </w:r>
+            <w:r>
+              <w:rPr>
+                <w:sz w:val="17"/>
+              </w:rPr>
+              <w:t>Workstream 4 (Months 5–8): Prospective Clinical Trials (N=250) in Cagayan de Oro RHUs with Ethics Review Board (REC/IRB) approval.</w:t>
+            </w:r>
+          </w:p>
+          <w:p>
+            <w:pPr>
+              <w:spacing w:before="20" w:after="20"/>
+              <w:ind w:left="283"/>
+            </w:pPr>
+            <w:r>
+              <w:rPr>
+                <w:b/>
+                <w:color w:val="2B8AAE"/>
+                <w:sz w:val="17"/>
+              </w:rPr>
+              <w:t xml:space="preserve">• </w:t>
+            </w:r>
+            <w:r>
+              <w:rPr>
+                <w:sz w:val="17"/>
+              </w:rPr>
+              <w:t>Workstream 5 (Months 8–10): DOH Maternal Dashboard &amp; PhilHealth Konsulta API Integration.</w:t>
+            </w:r>
+          </w:p>
+          <w:p>
+            <w:pPr>
+              <w:spacing w:before="20" w:after="20"/>
+              <w:ind w:left="283"/>
+            </w:pPr>
+            <w:r>
+              <w:rPr>
+                <w:b/>
+                <w:color w:val="2B8AAE"/>
+                <w:sz w:val="17"/>
+              </w:rPr>
+              <w:t xml:space="preserve">• </w:t>
+            </w:r>
+            <w:r>
+              <w:rPr>
+                <w:sz w:val="17"/>
+              </w:rPr>
+              <w:t>Workstream 6 (Months 10–12): Philippine FDA Class B Medical Device Software Notification &amp; PSC XI Pitch Deployment.</w:t>
+            </w:r>
+          </w:p>
+          <w:p>
+            <w:pPr>
+              <w:spacing w:before="80" w:after="40"/>
+            </w:pPr>
+            <w:r>
+              <w:rPr>
+                <w:b/>
+                <w:sz w:val="18"/>
+              </w:rPr>
+              <w:t xml:space="preserve">Caption: </w:t>
+            </w:r>
+            <w:r>
+              <w:rPr>
+                <w:i/>
+                <w:sz w:val="18"/>
+              </w:rPr>
+              <w:t>Figure 7. TinginHB 12-Month Multi-Phase Research, Clinical Validation, and Commercialization Roadmap.</w:t>
+            </w:r>
+          </w:p>
+          <w:p>
+            <w:pPr>
+              <w:spacing w:before="20" w:after="80"/>
+            </w:pPr>
+            <w:r>
+              <w:rPr>
+                <w:b/>
+                <w:color w:val="556677"/>
+                <w:sz w:val="17"/>
+              </w:rPr>
+              <w:t xml:space="preserve">Data Sources / Theoretical Grounding: </w:t>
+            </w:r>
+            <w:r>
+              <w:rPr>
+                <w:i/>
+                <w:color w:val="556677"/>
+                <w:sz w:val="17"/>
+              </w:rPr>
+              <w:t>DOH Health Technology Assessment (HTA) Guidelines; Universal Health Care Act (RA 11223).</w:t>
+            </w:r>
+          </w:p>
+        </w:tc>
+      </w:tr>
+    </w:tbl>
+    <w:p>
+      <w:pPr>
+        <w:spacing w:before="0" w:after="80"/>
+      </w:pPr>
+    </w:p>
+    <w:p>
+      <w:pPr>
+        <w:spacing w:before="280" w:after="60"/>
+      </w:pPr>
+      <w:r>
+        <w:rPr>
+          <w:b/>
+          <w:color w:val="0E4D64"/>
+          <w:sz w:val="27"/>
+        </w:rPr>
+        <w:t>X. COMPETITIVE DIFFERENTIATION MATRIX</w:t>
       </w:r>
     </w:p>
     <w:tbl>
@@ -2717,7 +4093,7 @@
           <w:color w:val="0E4D64"/>
           <w:sz w:val="27"/>
         </w:rPr>
-        <w:t>X. CONCLUSION</w:t>
+        <w:t>XI. CONCLUSION</w:t>
       </w:r>
     </w:p>
     <w:p>
@@ -2743,7 +4119,7 @@
           <w:color w:val="0E4D64"/>
           <w:sz w:val="27"/>
         </w:rPr>
-        <w:t>XI. REFERENCES &amp; ACADEMIC GROUNDING</w:t>
+        <w:t>XII. REFERENCES &amp; ACADEMIC GROUNDING</w:t>
       </w:r>
     </w:p>
     <w:p>
@@ -2959,7 +4335,7 @@
         <w:rPr>
           <w:sz w:val="17"/>
         </w:rPr>
-        <w:t>18. Food and Nutrition Research Institute (DOST-FNRI, 2020). Expanded National Nutrition Survey.</w:t>
+        <w:t>18. Food and Nutrition Research Institute (DOST-FNRI, 2020). Expanded National Nutrition Survey: Nutritional Status of Filipino Children and Pregnant Women.</w:t>
       </w:r>
     </w:p>
     <w:p>

</xml_diff>

<commit_message>
docs: adapt Concept Note to official 10-section PSC XI layout with figure placeholders
</commit_message>
<xml_diff>
--- a/docs/TinginHB_Revised_Concept_Note_PSCXI.docx
+++ b/docs/TinginHB_Revised_Concept_Note_PSCXI.docx
@@ -9,10 +9,22 @@
       <w:r>
         <w:rPr>
           <w:b/>
-          <w:color w:val="0E4D64"/>
-          <w:sz w:val="48"/>
+          <w:color w:val="1B6B8A"/>
+          <w:sz w:val="26"/>
         </w:rPr>
-        <w:t>TinginHB</w:t>
+        <w:t>PHILIPPINE STARTUP CHALLENGE XI</w:t>
+      </w:r>
+    </w:p>
+    <w:p>
+      <w:pPr>
+        <w:jc w:val="center"/>
+      </w:pPr>
+      <w:r>
+        <w:rPr>
+          <w:color w:val="556677"/>
+          <w:sz w:val="22"/>
+        </w:rPr>
+        <w:t>DataLunas  |  University of Science and Technology of Southern Philippines (USTP)</w:t>
       </w:r>
     </w:p>
     <w:p>
@@ -22,10 +34,10 @@
       <w:r>
         <w:rPr>
           <w:b/>
-          <w:color w:val="1B6B8A"/>
-          <w:sz w:val="26"/>
+          <w:color w:val="0E4D64"/>
+          <w:sz w:val="48"/>
         </w:rPr>
-        <w:t>REVISED CONCEPT NOTE — PHILIPPINE STARTUP CHALLENGE XI</w:t>
+        <w:t>TingínHB</w:t>
       </w:r>
     </w:p>
     <w:p>
@@ -34,10 +46,13 @@
       </w:pPr>
       <w:r>
         <w:rPr>
-          <w:sz w:val="21"/>
+          <w:b/>
+          <w:color w:val="0E4D64"/>
+          <w:sz w:val="23"/>
         </w:rPr>
+        <w:t>CONCEPT NOTE</w:t>
+        <w:br/>
         <w:t>Non-Invasive Dual-Site Edge-AI Anemia Screening for Primary Care &amp; Community Triage</w:t>
-        <w:br/>
       </w:r>
     </w:p>
     <w:p>
@@ -48,11 +63,9 @@
         <w:rPr>
           <w:i/>
           <w:color w:val="556677"/>
-          <w:sz w:val="18"/>
+          <w:sz w:val="17"/>
         </w:rPr>
-        <w:t>Team DataLunas  |  University of Science and Technology of Southern Philippines (USTP)</w:t>
-        <w:br/>
-        <w:t>Department of Data Science  |  October 2026  |  Version 2.0 (Empirically Calibrated)</w:t>
+        <w:t>Document Version 2.0 (Empirically Grounded &amp; Probabilistically Calibrated)  |  October 2026</w:t>
       </w:r>
     </w:p>
     <w:p/>
@@ -66,7 +79,7 @@
           <w:color w:val="0E4D64"/>
           <w:sz w:val="27"/>
         </w:rPr>
-        <w:t>I. EXECUTIVE SUMMARY</w:t>
+        <w:t>I. SUMMARY</w:t>
       </w:r>
     </w:p>
     <w:p>
@@ -79,7 +92,7 @@
           <w:i w:val="0"/>
           <w:sz w:val="20"/>
         </w:rPr>
-        <w:t>TinginHB (Tingin = 'to look/inspect'; HB = hemoglobin) is an offline-first, smartphone-based triage support system designed for Philippine Barangay Health Workers (BHWs) and rural primary care clinics. Rather than claiming to replace gold-standard Complete Blood Count (CBC) testing, TinginHB serves as a non-invasive, point-of-care triage engine that identifies individuals with a high probability of moderate-to-severe anemia (hemoglobin &lt; 10.0 g/dL) who must be prioritized for confirmatory laboratory testing and clinical intervention.</w:t>
+        <w:t>Philippine maternal mortality is a solvable crisis — and TingínHB is the unlock. Every year, more than 2,000 Filipino mothers die from Postpartum Hemorrhage (PPH), the country's leading obstetric killer. The root cause hiding in plain sight: 21.8% to 28.0% of pregnant women enter labor severely anemic (DOST-FNRI, 2024), yet over 200,000 Barangay Health Workers (BHWs) — the frontline workforce that sees these mothers first — have no affordable, reliable tool to detect it.</w:t>
       </w:r>
     </w:p>
     <w:p>
@@ -92,7 +105,7 @@
           <w:i w:val="0"/>
           <w:sz w:val="20"/>
         </w:rPr>
-        <w:t>By capturing smartphone images of two complementary microvascular anatomical sites—the palpebral conjunctiva (primary, zero-melanin mucosal surface) and the subungual nail bed (secondary, translucent keratin plate)—TinginHB extracts optical and colorimetric features via quantized edge deep learning models (&lt;10 MB, 100% offline). Crucially, acknowledging the biological and physical noise floor of ambient smartphone colorimetry, TinginHB rejects false precision: it does not output an absolute hemoglobin decimal. Instead, it outputs a statistically calibrated posterior probability score stratified into actionable WHO triage tiers (including an explicit 'Inconclusive / Recheck' buffer).</w:t>
+        <w:t>TingínHB ("See" + hemoglobin) is an offline-first, smartphone-based edge-AI hemoglobin triage support system designed for Philippine Barangay Health Workers and rural primary care clinics. Point the smartphone camera at two complementary microvascular sites—the palpebral conjunctiva (primary, zero-melanin mucosal surface with in-frame scleral white balance) and the subungual nail bed (secondary, translucent keratin plate with periungual melanin normalization)—and in under 2 seconds, with zero blood draw, zero disposable test strips, and zero internet connectivity, TingínHB delivers a calibrated statistical probability score stratified into actionable WHO triage tiers at ₱0.00 consumable cost.</w:t>
       </w:r>
     </w:p>
     <w:p>
@@ -105,7 +118,7 @@
           <w:i w:val="0"/>
           <w:sz w:val="20"/>
         </w:rPr>
-        <w:t>TinginHB directly addresses the diagnostic desert in rural and Geographically Isolated and Disadvantaged Areas (GIDA), where over 200,000 BHWs currently rely on naked-eye pallor inspection—a method with an inter-observer agreement kappa of only κ = 0.20–0.45 (poor-to-fair agreement). By standardizing community triage at ₱0 consumable cost, TinginHB operationalizes early referral under the Universal Health Care Act (RA 11223) and the First 1,000 Days Law (RA 11148).</w:t>
+        <w:t>Crucially, acknowledging the biological noise floor of ambient smartphone colorimetry, TingínHB rejects false precision: it does not output an arbitrary hemoglobin decimal. Instead, it computes an epistemic uncertainty-weighted posterior likelihood of moderate-to-severe anemia (Hb &lt; 10.0 g/dL). For patients flagged in high-risk tiers, TingínHB automatically generates a standardized PhilHealth Konsulta referral PDF ready for immediate clinical submission. Wired directly into Republic Act No. 11148 (First 1,000 Days Law) and Republic Act No. 11223 (Universal Health Care Act), TingínHB operationalizes frontline early detection where it matters most.</w:t>
       </w:r>
     </w:p>
     <w:p>
@@ -118,7 +131,7 @@
           <w:color w:val="0E4D64"/>
           <w:sz w:val="27"/>
         </w:rPr>
-        <w:t>II. BACKGROUND OF THE PROBLEM &amp; THE CLINICAL SCREENING GAP</w:t>
+        <w:t>II. BACKGROUND OF THE PROBLEM</w:t>
       </w:r>
     </w:p>
     <w:p>
@@ -144,7 +157,7 @@
           <w:i w:val="0"/>
           <w:sz w:val="20"/>
         </w:rPr>
-        <w:t>Anemia remains an intractable public health crisis in the Philippines:</w:t>
+        <w:t>Anemia remains an intractable, inter-generational crisis across the Philippine archipelago:</w:t>
       </w:r>
     </w:p>
     <w:p>
@@ -156,7 +169,7 @@
         <w:rPr>
           <w:sz w:val="20"/>
         </w:rPr>
-        <w:t>Maternal Mortality: According to DOST-FNRI surveys, 21.8% to 28.0% of pregnant Filipino women are clinically anemic. Maternal anemia is a primary risk factor for Postpartum Hemorrhage (PPH)—responsible for ~30% of maternal deaths (~2,000+ deaths annually). Anemic mothers face up to a 4-fold increased risk of fatal PPH due to uterine atony.</w:t>
+        <w:t>Maternal Lethality: The Philippines loses over 2,000 mothers annually to Postpartum Hemorrhage (PPH)—accounting for ~30% of maternal deaths. DOST-FNRI Expanded National Nutrition Surveys reveal 21.8% to 28.0% of pregnant Filipino women are clinically anemic. Severe anemia strips the uterine myometrium of the oxygen and energetic reserve needed to contract post-delivery, multiplying fatal hemorrhage risk by 2.5- to 4.0-fold.</w:t>
       </w:r>
     </w:p>
     <w:p>
@@ -168,7 +181,7 @@
         <w:rPr>
           <w:sz w:val="20"/>
         </w:rPr>
-        <w:t>Infant Brain Development: 40% to 45% of Filipino infants aged 6–11 months suffer from iron deficiency anemia, leading to irreversible loss of 5–10 IQ points.</w:t>
+        <w:t>Infant Cognitive Deprivation: 40% to 45% of Filipino infants aged 6–11 months suffer from iron deficiency anemia, causing irreversible loss of 5–10 IQ points during the critical first 1,000 days of life.</w:t>
       </w:r>
     </w:p>
     <w:p>
@@ -180,7 +193,7 @@
         <w:rPr>
           <w:sz w:val="20"/>
         </w:rPr>
-        <w:t>Target Priority Populations: Under DOH and WHO guidelines, routine screening is mandated for pregnant mothers, infants, and adolescent females.</w:t>
+        <w:t>Adolescent &amp; Economic Toll: 15% to 20% of adolescent females are anemic, entering pregnancy depleted. The World Bank estimates iron deficiency anemia costs developing nations 1.5% to 4.0% of GDP annually in lost labor and cognitive productivity.</w:t>
       </w:r>
     </w:p>
     <w:p>
@@ -193,7 +206,7 @@
           <w:color w:val="1B6B8A"/>
           <w:sz w:val="23"/>
         </w:rPr>
-        <w:t>2. The Clinical Bottleneck: Access, Not Analytical Cost</w:t>
+        <w:t>2. The Clinical Diagnostic Gap: Access Bottleneck vs. Analytical Cost</w:t>
       </w:r>
     </w:p>
     <w:p>
@@ -206,7 +219,7 @@
           <w:i w:val="0"/>
           <w:sz w:val="20"/>
         </w:rPr>
-        <w:t>A Complete Blood Count (CBC) is indeed an established, analytical gold standard and relatively inexpensive in urban laboratories (₱200–₱350). However, a CBC is only inexpensive if the patient can physically access a functioning laboratory:</w:t>
+        <w:t>The diagnostic breakdown is not the laboratory cost of a Complete Blood Count (CBC, ₱200–₱350), but physical geographic accessibility:</w:t>
       </w:r>
     </w:p>
     <w:p>
@@ -218,7 +231,7 @@
         <w:rPr>
           <w:sz w:val="20"/>
         </w:rPr>
-        <w:t>In rural and GIDA barangays, there are no centrifuges, reagents, automated hematology analyzers, or medical technologists at the Barangay Health Station (BHS).</w:t>
+        <w:t>Rural and GIDA Realities: Barangay Health Stations (BHS) lack centrifuges, reagents, automated hematology analyzers, and medical technologists. Patients in Geographically Isolated and Disadvantaged Areas (GIDA) face 2 to 6 hours of travel and ₱300 to ₱800 in round-trip transport fares—frequently exceeding total daily household income.</w:t>
       </w:r>
     </w:p>
     <w:p>
@@ -230,7 +243,7 @@
         <w:rPr>
           <w:sz w:val="20"/>
         </w:rPr>
-        <w:t>Patients must travel 2 to 6 hours over rough terrain and pay ₱300–₱800 in round-trip transport fares—frequently exceeding their daily household income.</w:t>
+        <w:t>HemoCue Stockout Paradox: Digital point-of-care analyzers (HemoCue Hb 301) carry a capital cost of ₱70,000–₱125,000 per unit, and their disposable microcuvettes cost ₱105–₱150 per fingerstick, leading to chronic municipal stockouts.</w:t>
       </w:r>
     </w:p>
     <w:p>
@@ -242,46 +255,7 @@
         <w:rPr>
           <w:sz w:val="20"/>
         </w:rPr>
-        <w:t>Point-of-care digital hemoglobinometers (such as HemoCue Hb 301) cost ₱70,000–₱125,000 per device, and their microcuvettes cost ₱150 per fingerstick, creating chronic stockouts across rural LGUs.</w:t>
-      </w:r>
-    </w:p>
-    <w:p>
-      <w:pPr>
-        <w:spacing w:before="200" w:after="60"/>
-      </w:pPr>
-      <w:r>
-        <w:rPr>
-          <w:b/>
-          <w:color w:val="1B6B8A"/>
-          <w:sz w:val="23"/>
-        </w:rPr>
-        <w:t>3. The Current Frontline Reality: Subjective Naked-Eye Pallor</w:t>
-      </w:r>
-    </w:p>
-    <w:p>
-      <w:pPr>
-        <w:spacing w:before="40" w:after="80"/>
-        <w:jc w:val="both"/>
-      </w:pPr>
-      <w:r>
-        <w:rPr>
-          <w:i w:val="0"/>
-          <w:sz w:val="20"/>
-        </w:rPr>
-        <w:t>In the absence of point-of-care CBC, over 200,000 BHWs perform physical triage using naked-eye clinical pallor inspection under the WHO Integrated Management of Childhood Illness (IMCI) protocol. Peer-reviewed clinical evaluations (Strobach et al., 1988, JAMA; Kalter et al., 1997, Bull WHO) establish that naked-eye inspection has a wide sensitivity range of 10% to 60% for mild-to-moderate anemia, and inter-observer reliability between health workers is extremely low (κ = 0.20–0.45).</w:t>
-      </w:r>
-    </w:p>
-    <w:p>
-      <w:pPr>
-        <w:spacing w:before="40" w:after="80"/>
-        <w:jc w:val="both"/>
-      </w:pPr>
-      <w:r>
-        <w:rPr>
-          <w:i w:val="0"/>
-          <w:sz w:val="20"/>
-        </w:rPr>
-        <w:t>TinginHB's Value Proposition is not analytical superiority over CBC; it is diagnostic accessibility and standardization over naked-eye triage.</w:t>
+        <w:t>Naked-Eye Subjectivity: Over 200,000 BHWs rely on naked-eye physical pallor inspection under WHO IMCI protocols. Peer-reviewed clinical literature (Strobach et al., 1988, JAMA; Kalter et al., 1997, Bull WHO) proves naked-eye sensitivity is only 10% to 60%, with an inter-observer agreement kappa of only κ = 0.20–0.45 (poor to slight agreement).</w:t>
       </w:r>
     </w:p>
     <w:tbl>
@@ -459,7 +433,7 @@
                 <w:color w:val="556677"/>
                 <w:sz w:val="17"/>
               </w:rPr>
-              <w:t>DOST-FNRI Expanded National Nutrition Survey (2020); DOH Maternal Health Statistics; Philippine Statistics Authority (PSA) Civil Registration and Vital Stats.</w:t>
+              <w:t>DOST-FNRI Expanded National Nutrition Survey (2020); DOH Maternal Health Statistics; Philippine Statistics Authority (PSA) Vital Statistics.</w:t>
             </w:r>
           </w:p>
         </w:tc>
@@ -480,7 +454,7 @@
           <w:color w:val="0E4D64"/>
           <w:sz w:val="27"/>
         </w:rPr>
-        <w:t>III. SCIENTIFIC GROUNDING &amp; PRIOR ART ANALYSIS</w:t>
+        <w:t>III. PROPOSED STARTUP SOLUTION</w:t>
       </w:r>
     </w:p>
     <w:p>
@@ -493,7 +467,20 @@
           <w:color w:val="1B6B8A"/>
           <w:sz w:val="23"/>
         </w:rPr>
-        <w:t>1. Biological and Optical Basis of Indicator Selection</w:t>
+        <w:t>1. Biological &amp; Optical Physics Grounding</w:t>
+      </w:r>
+    </w:p>
+    <w:p>
+      <w:pPr>
+        <w:spacing w:before="40" w:after="80"/>
+        <w:jc w:val="both"/>
+      </w:pPr>
+      <w:r>
+        <w:rPr>
+          <w:i w:val="0"/>
+          <w:sz w:val="20"/>
+        </w:rPr>
+        <w:t>TingínHB is strictly grounded in microvascular optical absorption physics across two complementary anatomical sites:</w:t>
       </w:r>
     </w:p>
     <w:p>
@@ -505,7 +492,7 @@
         <w:rPr>
           <w:sz w:val="20"/>
         </w:rPr>
-        <w:t>Primary Site — Palpebral Conjunctiva (Inner Lower Eyelid): Devoid of melanocytes, making it completely invariant to skin tone (Fitzpatrick I–VI). Oxygenated hemoglobin displays characteristic absorption peaks at 540 nm and 576 nm (green spectrum). The adjacent white sclera provides an in-scene white-balance anchor.</w:t>
+        <w:t>Primary Site — Palpebral Conjunctiva (Inner Lower Eyelid): The conjunctival epithelium is naturally devoid of melanocytes (Stolz et al., 1993), making optical evaluation completely invariant across Filipino skin tones (Fitzpatrick phototypes III–VI). Oxygenated hemoglobin displays characteristic absorption peaks at 540 nm and 576 nm (green spectrum). Crucially, the exposed sclera (white of the eye) serves as an in-frame white-balance anchor, eliminating physical calibration cards.</w:t>
       </w:r>
     </w:p>
     <w:p>
@@ -517,7 +504,7 @@
         <w:rPr>
           <w:sz w:val="20"/>
         </w:rPr>
-        <w:t>Secondary Site — Subungual Nail Bed: Subungual capillary plexus viewed through a uniform 0.5–0.8 mm keratin plate, avoiding light scattering from calluses. Periungual skin melanin is normalized using the Contrast Ratio (CR) method (Mannino et al., 2018).</w:t>
+        <w:t>Secondary Site — Subungual Nail Bed: Visualizes the subungual capillary plexus through a uniform 0.5–0.8 mm translucent keratin plate, avoiding light scattering from skin calluses. Periungual skin melanin is computationally normalized using the Contrast Ratio (CR) formula: CR = (G_nail - G_skin) / (G_nail + G_skin) (Mannino et al., 2018).</w:t>
       </w:r>
     </w:p>
     <w:tbl>
@@ -696,238 +683,7 @@
           <w:color w:val="1B6B8A"/>
           <w:sz w:val="23"/>
         </w:rPr>
-        <w:t>2. Prior Art Benchmarks</w:t>
-      </w:r>
-    </w:p>
-    <w:tbl>
-      <w:tblPr>
-        <w:tblStyle w:val="TableGrid"/>
-        <w:tblW w:type="auto" w:w="0"/>
-        <w:jc w:val="center"/>
-        <w:tblLook w:firstColumn="1" w:firstRow="1" w:lastColumn="0" w:lastRow="0" w:noHBand="0" w:noVBand="1" w:val="04A0"/>
-      </w:tblPr>
-      <w:tblGrid>
-        <w:gridCol w:w="3135"/>
-        <w:gridCol w:w="3135"/>
-        <w:gridCol w:w="3135"/>
-      </w:tblGrid>
-      <w:tr>
-        <w:tc>
-          <w:tcPr>
-            <w:tcW w:type="dxa" w:w="3118"/>
-            <w:shd w:val="clear" w:color="auto" w:fill="0E4D64"/>
-          </w:tcPr>
-          <w:p>
-            <w:pPr>
-              <w:jc w:val="center"/>
-            </w:pPr>
-            <w:r>
-              <w:rPr>
-                <w:b/>
-                <w:color w:val="FFFFFF"/>
-                <w:sz w:val="18"/>
-              </w:rPr>
-              <w:t>Prior Art / Study</w:t>
-            </w:r>
-          </w:p>
-        </w:tc>
-        <w:tc>
-          <w:tcPr>
-            <w:tcW w:type="dxa" w:w="3685"/>
-            <w:shd w:val="clear" w:color="auto" w:fill="0E4D64"/>
-          </w:tcPr>
-          <w:p>
-            <w:pPr>
-              <w:jc w:val="center"/>
-            </w:pPr>
-            <w:r>
-              <w:rPr>
-                <w:b/>
-                <w:color w:val="FFFFFF"/>
-                <w:sz w:val="18"/>
-              </w:rPr>
-              <w:t>Modality &amp; Finding</w:t>
-            </w:r>
-          </w:p>
-        </w:tc>
-        <w:tc>
-          <w:tcPr>
-            <w:tcW w:type="dxa" w:w="2835"/>
-            <w:shd w:val="clear" w:color="auto" w:fill="0E4D64"/>
-          </w:tcPr>
-          <w:p>
-            <w:pPr>
-              <w:jc w:val="center"/>
-            </w:pPr>
-            <w:r>
-              <w:rPr>
-                <w:b/>
-                <w:color w:val="FFFFFF"/>
-                <w:sz w:val="18"/>
-              </w:rPr>
-              <w:t>Documented Limitation</w:t>
-            </w:r>
-          </w:p>
-        </w:tc>
-      </w:tr>
-      <w:tr>
-        <w:tc>
-          <w:tcPr>
-            <w:tcW w:type="dxa" w:w="3118"/>
-            <w:shd w:val="clear" w:color="auto" w:fill="FFFFFF"/>
-          </w:tcPr>
-          <w:p>
-            <w:r>
-              <w:rPr>
-                <w:sz w:val="18"/>
-              </w:rPr>
-              <w:t>Mannino et al. (2018, Nature Comms)</w:t>
-            </w:r>
-          </w:p>
-        </w:tc>
-        <w:tc>
-          <w:tcPr>
-            <w:tcW w:type="dxa" w:w="3685"/>
-            <w:shd w:val="clear" w:color="auto" w:fill="FFFFFF"/>
-          </w:tcPr>
-          <w:p>
-            <w:r>
-              <w:rPr>
-                <w:sz w:val="18"/>
-              </w:rPr>
-              <w:t>Sanguina / AnemoCheck — nail bed only; MAE = 1.47 g/dL; 95% LoA = ±2.4 g/dL</w:t>
-            </w:r>
-          </w:p>
-        </w:tc>
-        <w:tc>
-          <w:tcPr>
-            <w:tcW w:type="dxa" w:w="2835"/>
-            <w:shd w:val="clear" w:color="auto" w:fill="FFFFFF"/>
-          </w:tcPr>
-          <w:p>
-            <w:r>
-              <w:rPr>
-                <w:sz w:val="18"/>
-              </w:rPr>
-              <w:t>Requires personalized CBC calibration; sensitive to skin tone without multi-site check.</w:t>
-            </w:r>
-          </w:p>
-        </w:tc>
-      </w:tr>
-      <w:tr>
-        <w:tc>
-          <w:tcPr>
-            <w:tcW w:type="dxa" w:w="3118"/>
-            <w:shd w:val="clear" w:color="auto" w:fill="EAF4F8"/>
-          </w:tcPr>
-          <w:p>
-            <w:r>
-              <w:rPr>
-                <w:sz w:val="18"/>
-              </w:rPr>
-              <w:t>Kim et al. (2020, PNAS; 2023, Annals)</w:t>
-            </w:r>
-          </w:p>
-        </w:tc>
-        <w:tc>
-          <w:tcPr>
-            <w:tcW w:type="dxa" w:w="3685"/>
-            <w:shd w:val="clear" w:color="auto" w:fill="EAF4F8"/>
-          </w:tcPr>
-          <w:p>
-            <w:r>
-              <w:rPr>
-                <w:sz w:val="18"/>
-              </w:rPr>
-              <w:t>HemaChrome — conjunctiva only; Sens = 91.4% (severe); drops to 62.1% (mild)</w:t>
-            </w:r>
-          </w:p>
-        </w:tc>
-        <w:tc>
-          <w:tcPr>
-            <w:tcW w:type="dxa" w:w="2835"/>
-            <w:shd w:val="clear" w:color="auto" w:fill="EAF4F8"/>
-          </w:tcPr>
-          <w:p>
-            <w:r>
-              <w:rPr>
-                <w:sz w:val="18"/>
-              </w:rPr>
-              <w:t>Confirms physical limit of mild pallor; single-site vulnerability to eye movement.</w:t>
-            </w:r>
-          </w:p>
-        </w:tc>
-      </w:tr>
-      <w:tr>
-        <w:tc>
-          <w:tcPr>
-            <w:tcW w:type="dxa" w:w="3118"/>
-            <w:shd w:val="clear" w:color="auto" w:fill="FFFFFF"/>
-          </w:tcPr>
-          <w:p>
-            <w:r>
-              <w:rPr>
-                <w:sz w:val="18"/>
-              </w:rPr>
-              <w:t>Valles-Coral et al. (2025, AnaeCare)</w:t>
-            </w:r>
-          </w:p>
-        </w:tc>
-        <w:tc>
-          <w:tcPr>
-            <w:tcW w:type="dxa" w:w="3685"/>
-            <w:shd w:val="clear" w:color="auto" w:fill="FFFFFF"/>
-          </w:tcPr>
-          <w:p>
-            <w:r>
-              <w:rPr>
-                <w:sz w:val="18"/>
-              </w:rPr>
-              <w:t>AnaeCare — nails+palms+fingers; Macro F1 = 0.78; Mild class F1 = 0.52 (Peru)</w:t>
-            </w:r>
-          </w:p>
-        </w:tc>
-        <w:tc>
-          <w:tcPr>
-            <w:tcW w:type="dxa" w:w="2835"/>
-            <w:shd w:val="clear" w:color="auto" w:fill="FFFFFF"/>
-          </w:tcPr>
-          <w:p>
-            <w:r>
-              <w:rPr>
-                <w:sz w:val="18"/>
-              </w:rPr>
-              <w:t>High capture friction (multiple images); lacks probabilistic uncertainty modeling.</w:t>
-            </w:r>
-          </w:p>
-        </w:tc>
-      </w:tr>
-    </w:tbl>
-    <w:p/>
-    <w:p>
-      <w:pPr>
-        <w:spacing w:before="280" w:after="60"/>
-      </w:pPr>
-      <w:r>
-        <w:rPr>
-          <w:b/>
-          <w:color w:val="0E4D64"/>
-          <w:sz w:val="27"/>
-        </w:rPr>
-        <w:t>IV. SYSTEM ARCHITECTURE &amp; PROBABILISTIC REFRAMING</w:t>
-      </w:r>
-    </w:p>
-    <w:p>
-      <w:pPr>
-        <w:spacing w:before="200" w:after="60"/>
-      </w:pPr>
-      <w:r>
-        <w:rPr>
-          <w:b/>
-          <w:color w:val="1B6B8A"/>
-          <w:sz w:val="23"/>
-        </w:rPr>
-        <w:t>1. Rejecting False Precision: The Bayesian Posterior Probability Framework</w:t>
+        <w:t>2. Edge-AI Architecture &amp; Probabilistic Posterior Modeling</w:t>
       </w:r>
     </w:p>
     <w:p>
@@ -940,20 +696,7 @@
           <w:i w:val="0"/>
           <w:sz w:val="20"/>
         </w:rPr>
-        <w:t>Best-in-class smartphone systems achieve an uncalibrated MAE of ≈ 1.5 g/dL. Because the WHO mild anemia threshold interval is only 1.0 g/dL wide (11.0–11.9 g/dL), predicting a single deterministic number (e.g., '11.2 g/dL') creates dangerous false confidence.</w:t>
-      </w:r>
-    </w:p>
-    <w:p>
-      <w:pPr>
-        <w:spacing w:before="40" w:after="80"/>
-        <w:jc w:val="both"/>
-      </w:pPr>
-      <w:r>
-        <w:rPr>
-          <w:i w:val="0"/>
-          <w:sz w:val="20"/>
-        </w:rPr>
-        <w:t>TinginHB adopts a Probabilistic Bayesian Output Model:</w:t>
+        <w:t>Rather than predicting an ungrounded continuous decimal (e.g. '11.2 g/dL'), TingínHB deploys an epistemic uncertainty-aware Bayesian framework:</w:t>
       </w:r>
     </w:p>
     <w:p>
@@ -965,7 +708,7 @@
         <w:rPr>
           <w:sz w:val="20"/>
         </w:rPr>
-        <w:t>Uncertainty Quantification (MC Dropout): N=50 stochastic passes extract epistemic uncertainty (σ).</w:t>
+        <w:t>ROI Segmentation: A quantized YOLOv8n-seg model (INT8, ~3.5 MB, 80ms) detects and crops the palpebral conjunctiva, sclera, and nail plate polygons.</w:t>
       </w:r>
     </w:p>
     <w:p>
@@ -977,7 +720,7 @@
         <w:rPr>
           <w:sz w:val="20"/>
         </w:rPr>
-        <w:t>Inverse-Variance Bayesian Fusion: Combines eye and nail estimates weighted by precision (w = 1/σ²).</w:t>
+        <w:t>Dual-Branch Deep Radiomics: Combines deep convolutional features from MobileNetV3-Small (FP16, ~5.2 MB) with 16 handcrafted colorimetric radiomics (Erythema Index, Pallor Index, green-red channel ratios).</w:t>
       </w:r>
     </w:p>
     <w:p>
@@ -989,7 +732,7 @@
         <w:rPr>
           <w:sz w:val="20"/>
         </w:rPr>
-        <w:t>Probability Transformation: Converts continuous Gaussian estimate into P(Moderate-Severe Anemia | features).</w:t>
+        <w:t>Monte Carlo Dropout: Executes N=50 stochastic inference passes to estimate epistemic model uncertainty (σ).</w:t>
       </w:r>
     </w:p>
     <w:p>
@@ -1001,7 +744,7 @@
         <w:rPr>
           <w:sz w:val="20"/>
         </w:rPr>
-        <w:t>Post-Hoc Calibration (Platt Scaling): Calibrates probabilities to achieve Expected Calibration Error ECE ≤ 0.08.</w:t>
+        <w:t>Post-Hoc Probability Calibration: Maps continuous estimates into a calibrated posterior probability of moderate-to-severe anemia (Hb &lt; 10.0 g/dL) using Platt Scaling, maintaining Expected Calibration Error ECE ≤ 0.08.</w:t>
       </w:r>
     </w:p>
     <w:tbl>
@@ -1200,345 +943,7 @@
           <w:color w:val="1B6B8A"/>
           <w:sz w:val="23"/>
         </w:rPr>
-        <w:t>2. Actionable Triage Tiers with Safety Buffering</w:t>
-      </w:r>
-    </w:p>
-    <w:tbl>
-      <w:tblPr>
-        <w:tblStyle w:val="TableGrid"/>
-        <w:tblW w:type="auto" w:w="0"/>
-        <w:jc w:val="center"/>
-        <w:tblLook w:firstColumn="1" w:firstRow="1" w:lastColumn="0" w:lastRow="0" w:noHBand="0" w:noVBand="1" w:val="04A0"/>
-      </w:tblPr>
-      <w:tblGrid>
-        <w:gridCol w:w="2351"/>
-        <w:gridCol w:w="2351"/>
-        <w:gridCol w:w="2351"/>
-        <w:gridCol w:w="2351"/>
-      </w:tblGrid>
-      <w:tr>
-        <w:tc>
-          <w:tcPr>
-            <w:tcW w:type="dxa" w:w="1701"/>
-            <w:shd w:val="clear" w:color="auto" w:fill="0E4D64"/>
-          </w:tcPr>
-          <w:p>
-            <w:pPr>
-              <w:jc w:val="center"/>
-            </w:pPr>
-            <w:r>
-              <w:rPr>
-                <w:b/>
-                <w:color w:val="FFFFFF"/>
-                <w:sz w:val="18"/>
-              </w:rPr>
-              <w:t>Probability Score</w:t>
-            </w:r>
-          </w:p>
-        </w:tc>
-        <w:tc>
-          <w:tcPr>
-            <w:tcW w:type="dxa" w:w="2551"/>
-            <w:shd w:val="clear" w:color="auto" w:fill="0E4D64"/>
-          </w:tcPr>
-          <w:p>
-            <w:pPr>
-              <w:jc w:val="center"/>
-            </w:pPr>
-            <w:r>
-              <w:rPr>
-                <w:b/>
-                <w:color w:val="FFFFFF"/>
-                <w:sz w:val="18"/>
-              </w:rPr>
-              <w:t>Triage Classification</w:t>
-            </w:r>
-          </w:p>
-        </w:tc>
-        <w:tc>
-          <w:tcPr>
-            <w:tcW w:type="dxa" w:w="2551"/>
-            <w:shd w:val="clear" w:color="auto" w:fill="0E4D64"/>
-          </w:tcPr>
-          <w:p>
-            <w:pPr>
-              <w:jc w:val="center"/>
-            </w:pPr>
-            <w:r>
-              <w:rPr>
-                <w:b/>
-                <w:color w:val="FFFFFF"/>
-                <w:sz w:val="18"/>
-              </w:rPr>
-              <w:t>Clinical Interpretation</w:t>
-            </w:r>
-          </w:p>
-        </w:tc>
-        <w:tc>
-          <w:tcPr>
-            <w:tcW w:type="dxa" w:w="2835"/>
-            <w:shd w:val="clear" w:color="auto" w:fill="0E4D64"/>
-          </w:tcPr>
-          <w:p>
-            <w:pPr>
-              <w:jc w:val="center"/>
-            </w:pPr>
-            <w:r>
-              <w:rPr>
-                <w:b/>
-                <w:color w:val="FFFFFF"/>
-                <w:sz w:val="18"/>
-              </w:rPr>
-              <w:t>Action Protocol for BHW</w:t>
-            </w:r>
-          </w:p>
-        </w:tc>
-      </w:tr>
-      <w:tr>
-        <w:tc>
-          <w:tcPr>
-            <w:tcW w:type="dxa" w:w="1701"/>
-            <w:shd w:val="clear" w:color="auto" w:fill="FFFFFF"/>
-          </w:tcPr>
-          <w:p>
-            <w:r>
-              <w:rPr>
-                <w:sz w:val="18"/>
-              </w:rPr>
-              <w:t>P &lt; 0.25</w:t>
-            </w:r>
-          </w:p>
-        </w:tc>
-        <w:tc>
-          <w:tcPr>
-            <w:tcW w:type="dxa" w:w="2551"/>
-            <w:shd w:val="clear" w:color="auto" w:fill="FFFFFF"/>
-          </w:tcPr>
-          <w:p>
-            <w:r>
-              <w:rPr>
-                <w:sz w:val="18"/>
-              </w:rPr>
-              <w:t>🟢 Anemia Unlikely</w:t>
-            </w:r>
-          </w:p>
-        </w:tc>
-        <w:tc>
-          <w:tcPr>
-            <w:tcW w:type="dxa" w:w="2551"/>
-            <w:shd w:val="clear" w:color="auto" w:fill="FFFFFF"/>
-          </w:tcPr>
-          <w:p>
-            <w:r>
-              <w:rPr>
-                <w:sz w:val="18"/>
-              </w:rPr>
-              <w:t>Normal perfusion</w:t>
-            </w:r>
-          </w:p>
-        </w:tc>
-        <w:tc>
-          <w:tcPr>
-            <w:tcW w:type="dxa" w:w="2835"/>
-            <w:shd w:val="clear" w:color="auto" w:fill="FFFFFF"/>
-          </w:tcPr>
-          <w:p>
-            <w:r>
-              <w:rPr>
-                <w:sz w:val="18"/>
-              </w:rPr>
-              <w:t>Routine follow-up; nutrition counseling</w:t>
-            </w:r>
-          </w:p>
-        </w:tc>
-      </w:tr>
-      <w:tr>
-        <w:tc>
-          <w:tcPr>
-            <w:tcW w:type="dxa" w:w="1701"/>
-            <w:shd w:val="clear" w:color="auto" w:fill="EAF4F8"/>
-          </w:tcPr>
-          <w:p>
-            <w:r>
-              <w:rPr>
-                <w:sz w:val="18"/>
-              </w:rPr>
-              <w:t>0.25 ≤ P &lt; 0.55</w:t>
-            </w:r>
-          </w:p>
-        </w:tc>
-        <w:tc>
-          <w:tcPr>
-            <w:tcW w:type="dxa" w:w="2551"/>
-            <w:shd w:val="clear" w:color="auto" w:fill="EAF4F8"/>
-          </w:tcPr>
-          <w:p>
-            <w:r>
-              <w:rPr>
-                <w:sz w:val="18"/>
-              </w:rPr>
-              <w:t>🟡 Inconclusive — Recheck</w:t>
-            </w:r>
-          </w:p>
-        </w:tc>
-        <w:tc>
-          <w:tcPr>
-            <w:tcW w:type="dxa" w:w="2551"/>
-            <w:shd w:val="clear" w:color="auto" w:fill="EAF4F8"/>
-          </w:tcPr>
-          <w:p>
-            <w:r>
-              <w:rPr>
-                <w:sz w:val="18"/>
-              </w:rPr>
-              <w:t>Within noise floor / mild</w:t>
-            </w:r>
-          </w:p>
-        </w:tc>
-        <w:tc>
-          <w:tcPr>
-            <w:tcW w:type="dxa" w:w="2835"/>
-            <w:shd w:val="clear" w:color="auto" w:fill="EAF4F8"/>
-          </w:tcPr>
-          <w:p>
-            <w:r>
-              <w:rPr>
-                <w:sz w:val="18"/>
-              </w:rPr>
-              <w:t>Reposition under natural light, repeat scan, or refer</w:t>
-            </w:r>
-          </w:p>
-        </w:tc>
-      </w:tr>
-      <w:tr>
-        <w:tc>
-          <w:tcPr>
-            <w:tcW w:type="dxa" w:w="1701"/>
-            <w:shd w:val="clear" w:color="auto" w:fill="FFFFFF"/>
-          </w:tcPr>
-          <w:p>
-            <w:r>
-              <w:rPr>
-                <w:sz w:val="18"/>
-              </w:rPr>
-              <w:t>0.55 ≤ P &lt; 0.80</w:t>
-            </w:r>
-          </w:p>
-        </w:tc>
-        <w:tc>
-          <w:tcPr>
-            <w:tcW w:type="dxa" w:w="2551"/>
-            <w:shd w:val="clear" w:color="auto" w:fill="FFFFFF"/>
-          </w:tcPr>
-          <w:p>
-            <w:r>
-              <w:rPr>
-                <w:sz w:val="18"/>
-              </w:rPr>
-              <w:t>🟠 Possible Anemia — Refer</w:t>
-            </w:r>
-          </w:p>
-        </w:tc>
-        <w:tc>
-          <w:tcPr>
-            <w:tcW w:type="dxa" w:w="2551"/>
-            <w:shd w:val="clear" w:color="auto" w:fill="FFFFFF"/>
-          </w:tcPr>
-          <w:p>
-            <w:r>
-              <w:rPr>
-                <w:sz w:val="18"/>
-              </w:rPr>
-              <w:t>Elevated probability of Hb &lt; 10</w:t>
-            </w:r>
-          </w:p>
-        </w:tc>
-        <w:tc>
-          <w:tcPr>
-            <w:tcW w:type="dxa" w:w="2835"/>
-            <w:shd w:val="clear" w:color="auto" w:fill="FFFFFF"/>
-          </w:tcPr>
-          <w:p>
-            <w:r>
-              <w:rPr>
-                <w:sz w:val="18"/>
-              </w:rPr>
-              <w:t>Schedule RHU visit for confirmatory laboratory CBC</w:t>
-            </w:r>
-          </w:p>
-        </w:tc>
-      </w:tr>
-      <w:tr>
-        <w:tc>
-          <w:tcPr>
-            <w:tcW w:type="dxa" w:w="1701"/>
-            <w:shd w:val="clear" w:color="auto" w:fill="EAF4F8"/>
-          </w:tcPr>
-          <w:p>
-            <w:r>
-              <w:rPr>
-                <w:sz w:val="18"/>
-              </w:rPr>
-              <w:t>P ≥ 0.80</w:t>
-            </w:r>
-          </w:p>
-        </w:tc>
-        <w:tc>
-          <w:tcPr>
-            <w:tcW w:type="dxa" w:w="2551"/>
-            <w:shd w:val="clear" w:color="auto" w:fill="EAF4F8"/>
-          </w:tcPr>
-          <w:p>
-            <w:r>
-              <w:rPr>
-                <w:sz w:val="18"/>
-              </w:rPr>
-              <w:t>🔴 Likely Anemia — Urgent</w:t>
-            </w:r>
-          </w:p>
-        </w:tc>
-        <w:tc>
-          <w:tcPr>
-            <w:tcW w:type="dxa" w:w="2551"/>
-            <w:shd w:val="clear" w:color="auto" w:fill="EAF4F8"/>
-          </w:tcPr>
-          <w:p>
-            <w:r>
-              <w:rPr>
-                <w:sz w:val="18"/>
-              </w:rPr>
-              <w:t>High probability of mod-severe</w:t>
-            </w:r>
-          </w:p>
-        </w:tc>
-        <w:tc>
-          <w:tcPr>
-            <w:tcW w:type="dxa" w:w="2835"/>
-            <w:shd w:val="clear" w:color="auto" w:fill="EAF4F8"/>
-          </w:tcPr>
-          <w:p>
-            <w:r>
-              <w:rPr>
-                <w:sz w:val="18"/>
-              </w:rPr>
-              <w:t>Priority referral to RHU/hospital; auto-generate Konsulta PDF</w:t>
-            </w:r>
-          </w:p>
-        </w:tc>
-      </w:tr>
-    </w:tbl>
-    <w:p/>
-    <w:p>
-      <w:pPr>
-        <w:spacing w:before="280" w:after="60"/>
-      </w:pPr>
-      <w:r>
-        <w:rPr>
-          <w:b/>
-          <w:color w:val="0E4D64"/>
-          <w:sz w:val="27"/>
-        </w:rPr>
-        <w:t>V. DYNAMIC MULTI-INDICATOR WEIGHTING &amp; EVIDENCE INTEGRATION</w:t>
+        <w:t>3. Dynamic 5-Modality Clinical Indicator Matrix &amp; Missing Modalities</w:t>
       </w:r>
     </w:p>
     <w:p>
@@ -1551,20 +956,7 @@
           <w:i w:val="0"/>
           <w:sz w:val="20"/>
         </w:rPr>
-        <w:t>In frontline primary care, clinical data collection is inherently variable: an infant may resist eyelid eversion, or a BHW may conduct a house-to-house visit without their blood pressure cuff. TinginHB handles these conditions through a Dynamic Multi-Indicator Fusion Architecture that accounts for Missing Modalities (Baltrusaitis et al., 2019; Huang et al., 2020, npj Digital Medicine).</w:t>
-      </w:r>
-    </w:p>
-    <w:p>
-      <w:pPr>
-        <w:spacing w:before="200" w:after="60"/>
-      </w:pPr>
-      <w:r>
-        <w:rPr>
-          <w:b/>
-          <w:color w:val="1B6B8A"/>
-          <w:sz w:val="23"/>
-        </w:rPr>
-        <w:t>1. The 5-Modality Clinical Indicator Matrix</w:t>
+        <w:t>To ensure robustness when a child resists eyelid eversion or a BHW lacks a blood pressure cuff, TinginHB employs a dynamic multi-modal fusion architecture that gracefully handles missing inputs (Baltrusaitis et al., 2019; Huang et al., 2020):</w:t>
       </w:r>
     </w:p>
     <w:tbl>
@@ -1952,15 +1344,15 @@
     <w:p/>
     <w:p>
       <w:pPr>
-        <w:spacing w:before="200" w:after="60"/>
+        <w:spacing w:before="40" w:after="80"/>
+        <w:jc w:val="both"/>
       </w:pPr>
       <w:r>
         <w:rPr>
-          <w:b/>
-          <w:color w:val="1B6B8A"/>
-          <w:sz w:val="23"/>
+          <w:i w:val="0"/>
+          <w:sz w:val="20"/>
         </w:rPr>
-        <w:t>2. Dynamic Weight Re-normalization for Missing Modalities</w:t>
+        <w:t>Missing Modality Re-normalization &amp; Log-Odds Stacking:</w:t>
       </w:r>
     </w:p>
     <w:p>
@@ -1976,42 +1368,16 @@
         </w:rPr>
         <w:t>w'_i = w_i / SUM(w_available)</w:t>
         <w:br/>
+        <w:t>ln(Odds_post) = ln(Odds_prior(Survey)) + SUM(w'_i * ln(LR_i))</w:t>
+        <w:br/>
         <w:br/>
         <w:t>• Full Clinic Check (All 5): Eye (35%) + Nail (25%) + Survey (15%) + Palm (15%) + BP (10%) = 100%</w:t>
         <w:br/>
         <w:t>• Field Visit (Eye + Nail + Survey): Eye (46.7%) + Nail (33.3%) + Survey (20.0%) = 100%</w:t>
         <w:br/>
         <w:t>• Pediatric Fallback (Nail + Palm + Survey): Nail (45.5%) + Palm (27.3%) + Survey (27.3%) = 100%</w:t>
-      </w:r>
-    </w:p>
-    <w:p>
-      <w:pPr>
-        <w:spacing w:before="200" w:after="60"/>
-      </w:pPr>
-      <w:r>
-        <w:rPr>
-          <w:b/>
-          <w:color w:val="1B6B8A"/>
-          <w:sz w:val="23"/>
-        </w:rPr>
-        <w:t>3. Bayesian Likelihood Ratio Log-Odds Stacking</w:t>
-      </w:r>
-    </w:p>
-    <w:p>
-      <w:pPr>
-        <w:spacing w:before="60" w:after="60"/>
-        <w:ind w:left="454"/>
-        <w:shd w:val="clear" w:color="auto" w:fill="F4F6F8"/>
-      </w:pPr>
-      <w:r>
-        <w:rPr>
-          <w:rFonts w:ascii="Courier New" w:hAnsi="Courier New"/>
-          <w:sz w:val="17"/>
-        </w:rPr>
-        <w:t>ln(Odds_post) = ln(Odds_prior(Survey)) + SUM(w'_i * ln(LR_i))</w:t>
         <w:br/>
-        <w:br/>
-        <w:t>Omitted/missing tests contribute a neutral factor of LR = 1.0 (ln(1.0) = 0).</w:t>
+        <w:t>• Discrepancy Gate: If |Eye - Nail| &gt; 2.0 g/dL, palmar crease scan is triggered to break ambiguity.</w:t>
       </w:r>
     </w:p>
     <w:tbl>
@@ -2202,89 +1568,15 @@
     </w:p>
     <w:p>
       <w:pPr>
-        <w:spacing w:before="280" w:after="60"/>
+        <w:spacing w:before="200" w:after="60"/>
       </w:pPr>
       <w:r>
         <w:rPr>
           <w:b/>
-          <w:color w:val="0E4D64"/>
-          <w:sz w:val="27"/>
+          <w:color w:val="1B6B8A"/>
+          <w:sz w:val="23"/>
         </w:rPr>
-        <w:t>VI. EXPLICIT LIMITATIONS &amp; RELIABILITY BOUNDS</w:t>
-      </w:r>
-    </w:p>
-    <w:p>
-      <w:pPr>
-        <w:spacing w:before="40" w:after="80"/>
-        <w:jc w:val="both"/>
-      </w:pPr>
-      <w:r>
-        <w:rPr>
-          <w:i w:val="0"/>
-          <w:sz w:val="20"/>
-        </w:rPr>
-        <w:t>TinginHB adopts an uncompromising stance on scientific honesty. The following constraints are formally acknowledged:</w:t>
-      </w:r>
-    </w:p>
-    <w:p>
-      <w:pPr>
-        <w:pStyle w:val="ListBullet"/>
-        <w:spacing w:before="20" w:after="20"/>
-      </w:pPr>
-      <w:r>
-        <w:rPr>
-          <w:sz w:val="20"/>
-        </w:rPr>
-        <w:t>The Mild Anemia Detection Limit: Optical pallor is a physiological lagging indicator (Kalter et al., 1997). Under smartphone RGB cameras, physical pallor does not separate reliably from normal perfusion until hemoglobin drops below ~9.0–10.0 g/dL. TinginHB is explicitly NOT designed or marketed to detect mild anemia (11.0–11.9 g/dL). A green result does not rule out early-stage iron deficiency.</w:t>
-      </w:r>
-    </w:p>
-    <w:p>
-      <w:pPr>
-        <w:pStyle w:val="ListBullet"/>
-        <w:spacing w:before="20" w:after="20"/>
-      </w:pPr>
-      <w:r>
-        <w:rPr>
-          <w:sz w:val="20"/>
-        </w:rPr>
-        <w:t>Not a Diagnostic Replacement for CBC: TinginHB is a decision-support triage tool, not a diagnostic device. It identifies who needs urgent laboratory evaluation.</w:t>
-      </w:r>
-    </w:p>
-    <w:p>
-      <w:pPr>
-        <w:pStyle w:val="ListBullet"/>
-        <w:spacing w:before="20" w:after="20"/>
-      </w:pPr>
-      <w:r>
-        <w:rPr>
-          <w:sz w:val="20"/>
-        </w:rPr>
-        <w:t>Physiological Confounders: Active conjunctivitis (produces redness/false negatives), jaundice (distorts scleral reference), hypothermia (causes temporary nail vasoconstriction), and nail fungus (blocks nail plate).</w:t>
-      </w:r>
-    </w:p>
-    <w:p>
-      <w:pPr>
-        <w:pStyle w:val="ListBullet"/>
-        <w:spacing w:before="20" w:after="20"/>
-      </w:pPr>
-      <w:r>
-        <w:rPr>
-          <w:sz w:val="20"/>
-        </w:rPr>
-        <w:t>Generalizability: Training datasets originate from Ghana (Fitzpatrick IV–V) and Peru (Fitzpatrick III–IV). Local validation (n=250 cohort) paired with laboratory automated CBC is required.</w:t>
-      </w:r>
-    </w:p>
-    <w:p>
-      <w:pPr>
-        <w:spacing w:before="280" w:after="60"/>
-      </w:pPr>
-      <w:r>
-        <w:rPr>
-          <w:b/>
-          <w:color w:val="0E4D64"/>
-          <w:sz w:val="27"/>
-        </w:rPr>
-        <w:t>VII. PRODUCT IMPLEMENTATION &amp; EDGE SPECIFICATIONS</w:t>
+        <w:t>4. Calibrated Four-Tier Triage Classification</w:t>
       </w:r>
     </w:p>
     <w:tbl>
@@ -2295,11 +1587,31 @@
         <w:tblLook w:firstColumn="1" w:firstRow="1" w:lastColumn="0" w:lastRow="0" w:noHBand="0" w:noVBand="1" w:val="04A0"/>
       </w:tblPr>
       <w:tblGrid>
-        <w:gridCol w:w="3135"/>
-        <w:gridCol w:w="3135"/>
-        <w:gridCol w:w="3135"/>
+        <w:gridCol w:w="2351"/>
+        <w:gridCol w:w="2351"/>
+        <w:gridCol w:w="2351"/>
+        <w:gridCol w:w="2351"/>
       </w:tblGrid>
       <w:tr>
+        <w:tc>
+          <w:tcPr>
+            <w:tcW w:type="dxa" w:w="1814"/>
+            <w:shd w:val="clear" w:color="auto" w:fill="0E4D64"/>
+          </w:tcPr>
+          <w:p>
+            <w:pPr>
+              <w:jc w:val="center"/>
+            </w:pPr>
+            <w:r>
+              <w:rPr>
+                <w:b/>
+                <w:color w:val="FFFFFF"/>
+                <w:sz w:val="18"/>
+              </w:rPr>
+              <w:t>Probability Score</w:t>
+            </w:r>
+          </w:p>
+        </w:tc>
         <w:tc>
           <w:tcPr>
             <w:tcW w:type="dxa" w:w="2551"/>
@@ -2315,13 +1627,13 @@
                 <w:color w:val="FFFFFF"/>
                 <w:sz w:val="18"/>
               </w:rPr>
-              <w:t>Component</w:t>
+              <w:t>Triage Classification</w:t>
             </w:r>
           </w:p>
         </w:tc>
         <w:tc>
           <w:tcPr>
-            <w:tcW w:type="dxa" w:w="3118"/>
+            <w:tcW w:type="dxa" w:w="2438"/>
             <w:shd w:val="clear" w:color="auto" w:fill="0E4D64"/>
           </w:tcPr>
           <w:p>
@@ -2334,13 +1646,13 @@
                 <w:color w:val="FFFFFF"/>
                 <w:sz w:val="18"/>
               </w:rPr>
-              <w:t>Engine / Runtime</w:t>
+              <w:t>Clinical Interpretation</w:t>
             </w:r>
           </w:p>
         </w:tc>
         <w:tc>
           <w:tcPr>
-            <w:tcW w:type="dxa" w:w="3969"/>
+            <w:tcW w:type="dxa" w:w="2835"/>
             <w:shd w:val="clear" w:color="auto" w:fill="0E4D64"/>
           </w:tcPr>
           <w:p>
@@ -2353,12 +1665,26 @@
                 <w:color w:val="FFFFFF"/>
                 <w:sz w:val="18"/>
               </w:rPr>
-              <w:t>Specification / Footprint</w:t>
+              <w:t>Action Protocol for BHW</w:t>
             </w:r>
           </w:p>
         </w:tc>
       </w:tr>
       <w:tr>
+        <w:tc>
+          <w:tcPr>
+            <w:tcW w:type="dxa" w:w="1814"/>
+            <w:shd w:val="clear" w:color="auto" w:fill="FFFFFF"/>
+          </w:tcPr>
+          <w:p>
+            <w:r>
+              <w:rPr>
+                <w:sz w:val="18"/>
+              </w:rPr>
+              <w:t>P &lt; 0.25</w:t>
+            </w:r>
+          </w:p>
+        </w:tc>
         <w:tc>
           <w:tcPr>
             <w:tcW w:type="dxa" w:w="2551"/>
@@ -2369,13 +1695,13 @@
               <w:rPr>
                 <w:sz w:val="18"/>
               </w:rPr>
-              <w:t>ROI Segmentation</w:t>
+              <w:t>🟢 NORMAL (Anemia Unlikely)</w:t>
             </w:r>
           </w:p>
         </w:tc>
         <w:tc>
           <w:tcPr>
-            <w:tcW w:type="dxa" w:w="3118"/>
+            <w:tcW w:type="dxa" w:w="2438"/>
             <w:shd w:val="clear" w:color="auto" w:fill="FFFFFF"/>
           </w:tcPr>
           <w:p>
@@ -2383,13 +1709,13 @@
               <w:rPr>
                 <w:sz w:val="18"/>
               </w:rPr>
-              <w:t>YOLOv8n-seg (INT8)</w:t>
+              <w:t>Normal perfusion</w:t>
             </w:r>
           </w:p>
         </w:tc>
         <w:tc>
           <w:tcPr>
-            <w:tcW w:type="dxa" w:w="3969"/>
+            <w:tcW w:type="dxa" w:w="2835"/>
             <w:shd w:val="clear" w:color="auto" w:fill="FFFFFF"/>
           </w:tcPr>
           <w:p>
@@ -2397,12 +1723,26 @@
               <w:rPr>
                 <w:sz w:val="18"/>
               </w:rPr>
-              <w:t>~3.5 MB | 80ms inference</w:t>
+              <w:t>Continue standard ANC + Iron-Folic Acid Supplementation</w:t>
             </w:r>
           </w:p>
         </w:tc>
       </w:tr>
       <w:tr>
+        <w:tc>
+          <w:tcPr>
+            <w:tcW w:type="dxa" w:w="1814"/>
+            <w:shd w:val="clear" w:color="auto" w:fill="EAF4F8"/>
+          </w:tcPr>
+          <w:p>
+            <w:r>
+              <w:rPr>
+                <w:sz w:val="18"/>
+              </w:rPr>
+              <w:t>0.25 ≤ P &lt; 0.55</w:t>
+            </w:r>
+          </w:p>
+        </w:tc>
         <w:tc>
           <w:tcPr>
             <w:tcW w:type="dxa" w:w="2551"/>
@@ -2413,13 +1753,13 @@
               <w:rPr>
                 <w:sz w:val="18"/>
               </w:rPr>
-              <w:t>Feature Extraction</w:t>
+              <w:t>🟡 INCONCLUSIVE (Recheck Buffer)</w:t>
             </w:r>
           </w:p>
         </w:tc>
         <w:tc>
           <w:tcPr>
-            <w:tcW w:type="dxa" w:w="3118"/>
+            <w:tcW w:type="dxa" w:w="2438"/>
             <w:shd w:val="clear" w:color="auto" w:fill="EAF4F8"/>
           </w:tcPr>
           <w:p>
@@ -2427,13 +1767,13 @@
               <w:rPr>
                 <w:sz w:val="18"/>
               </w:rPr>
-              <w:t>MobileNetV3-S (FP16)</w:t>
+              <w:t>Within noise floor / mild</w:t>
             </w:r>
           </w:p>
         </w:tc>
         <w:tc>
           <w:tcPr>
-            <w:tcW w:type="dxa" w:w="3969"/>
+            <w:tcW w:type="dxa" w:w="2835"/>
             <w:shd w:val="clear" w:color="auto" w:fill="EAF4F8"/>
           </w:tcPr>
           <w:p>
@@ -2441,12 +1781,26 @@
               <w:rPr>
                 <w:sz w:val="18"/>
               </w:rPr>
-              <w:t>~5.2 MB | 120ms inference</w:t>
+              <w:t>Reposition under natural light, repeat scan; review IFAS adherence</w:t>
             </w:r>
           </w:p>
         </w:tc>
       </w:tr>
       <w:tr>
+        <w:tc>
+          <w:tcPr>
+            <w:tcW w:type="dxa" w:w="1814"/>
+            <w:shd w:val="clear" w:color="auto" w:fill="FFFFFF"/>
+          </w:tcPr>
+          <w:p>
+            <w:r>
+              <w:rPr>
+                <w:sz w:val="18"/>
+              </w:rPr>
+              <w:t>0.55 ≤ P &lt; 0.80</w:t>
+            </w:r>
+          </w:p>
+        </w:tc>
         <w:tc>
           <w:tcPr>
             <w:tcW w:type="dxa" w:w="2551"/>
@@ -2457,13 +1811,13 @@
               <w:rPr>
                 <w:sz w:val="18"/>
               </w:rPr>
-              <w:t>Radiomics Extractor</w:t>
+              <w:t>🟠 MODERATE (Possible Anemia)</w:t>
             </w:r>
           </w:p>
         </w:tc>
         <w:tc>
           <w:tcPr>
-            <w:tcW w:type="dxa" w:w="3118"/>
+            <w:tcW w:type="dxa" w:w="2438"/>
             <w:shd w:val="clear" w:color="auto" w:fill="FFFFFF"/>
           </w:tcPr>
           <w:p>
@@ -2471,13 +1825,13 @@
               <w:rPr>
                 <w:sz w:val="18"/>
               </w:rPr>
-              <w:t>OpenCV Colorimetry</w:t>
+              <w:t>Elevated probability Hb &lt; 10</w:t>
             </w:r>
           </w:p>
         </w:tc>
         <w:tc>
           <w:tcPr>
-            <w:tcW w:type="dxa" w:w="3969"/>
+            <w:tcW w:type="dxa" w:w="2835"/>
             <w:shd w:val="clear" w:color="auto" w:fill="FFFFFF"/>
           </w:tcPr>
           <w:p>
@@ -2485,12 +1839,26 @@
               <w:rPr>
                 <w:sz w:val="18"/>
               </w:rPr>
-              <w:t>16 Handcrafted Features (EI, PI)</w:t>
+              <w:t>REFER to RHU for confirmatory CBC and clinical assessment</w:t>
             </w:r>
           </w:p>
         </w:tc>
       </w:tr>
       <w:tr>
+        <w:tc>
+          <w:tcPr>
+            <w:tcW w:type="dxa" w:w="1814"/>
+            <w:shd w:val="clear" w:color="auto" w:fill="EAF4F8"/>
+          </w:tcPr>
+          <w:p>
+            <w:r>
+              <w:rPr>
+                <w:sz w:val="18"/>
+              </w:rPr>
+              <w:t>P ≥ 0.80</w:t>
+            </w:r>
+          </w:p>
+        </w:tc>
         <w:tc>
           <w:tcPr>
             <w:tcW w:type="dxa" w:w="2551"/>
@@ -2501,13 +1869,13 @@
               <w:rPr>
                 <w:sz w:val="18"/>
               </w:rPr>
-              <w:t>Uncertainty Engine</w:t>
+              <w:t>🔴 SEVERE (Likely Anemia)</w:t>
             </w:r>
           </w:p>
         </w:tc>
         <w:tc>
           <w:tcPr>
-            <w:tcW w:type="dxa" w:w="3118"/>
+            <w:tcW w:type="dxa" w:w="2438"/>
             <w:shd w:val="clear" w:color="auto" w:fill="EAF4F8"/>
           </w:tcPr>
           <w:p>
@@ -2515,13 +1883,13 @@
               <w:rPr>
                 <w:sz w:val="18"/>
               </w:rPr>
-              <w:t>Monte Carlo Dropout</w:t>
+              <w:t>High probability mod-severe</w:t>
             </w:r>
           </w:p>
         </w:tc>
         <w:tc>
           <w:tcPr>
-            <w:tcW w:type="dxa" w:w="3969"/>
+            <w:tcW w:type="dxa" w:w="2835"/>
             <w:shd w:val="clear" w:color="auto" w:fill="EAF4F8"/>
           </w:tcPr>
           <w:p>
@@ -2529,7 +1897,428 @@
               <w:rPr>
                 <w:sz w:val="18"/>
               </w:rPr>
-              <w:t>N=50 stochastic passes (~200ms)</w:t>
+              <w:t>URGENT referral to District Hospital; Auto-generate Konsulta PDF</w:t>
+            </w:r>
+          </w:p>
+        </w:tc>
+      </w:tr>
+    </w:tbl>
+    <w:p/>
+    <w:p>
+      <w:pPr>
+        <w:spacing w:before="280" w:after="60"/>
+      </w:pPr>
+      <w:r>
+        <w:rPr>
+          <w:b/>
+          <w:color w:val="0E4D64"/>
+          <w:sz w:val="27"/>
+        </w:rPr>
+        <w:t>IV. OBJECTIVES</w:t>
+      </w:r>
+    </w:p>
+    <w:p>
+      <w:pPr>
+        <w:pStyle w:val="ListBullet"/>
+        <w:spacing w:before="20" w:after="20"/>
+      </w:pPr>
+      <w:r>
+        <w:rPr>
+          <w:sz w:val="20"/>
+        </w:rPr>
+        <w:t>Eliminate Consumable Cost Barriers: Deploy a ₱0-per-screening tool to replace ₱150/cuvette consumable methods across Barangay Health Stations and Rural Health Units.</w:t>
+      </w:r>
+    </w:p>
+    <w:p>
+      <w:pPr>
+        <w:pStyle w:val="ListBullet"/>
+        <w:spacing w:before="20" w:after="20"/>
+      </w:pPr>
+      <w:r>
+        <w:rPr>
+          <w:sz w:val="20"/>
+        </w:rPr>
+        <w:t>Dramatically Reduce Missed Diagnoses: Achieve AUROC ≥ 0.88 and ≥85% sensitivity for moderate-to-severe anemia (Hb &lt; 10.0 g/dL), up from 10–60% sensitivity of naked-eye pallor.</w:t>
+      </w:r>
+    </w:p>
+    <w:p>
+      <w:pPr>
+        <w:pStyle w:val="ListBullet"/>
+        <w:spacing w:before="20" w:after="20"/>
+      </w:pPr>
+      <w:r>
+        <w:rPr>
+          <w:sz w:val="20"/>
+        </w:rPr>
+        <w:t>Accelerate High-Risk Patient Referrals: Reduce time-to-referral through one-tap automated generation of PhilHealth Konsulta referral PDF slips.</w:t>
+      </w:r>
+    </w:p>
+    <w:p>
+      <w:pPr>
+        <w:pStyle w:val="ListBullet"/>
+        <w:spacing w:before="20" w:after="20"/>
+      </w:pPr>
+      <w:r>
+        <w:rPr>
+          <w:sz w:val="20"/>
+        </w:rPr>
+        <w:t>Deploy in 100% Offline GIDA Settings: Operate completely on-device with a &lt;10 MB AI footprint runnable on low-end ₱5,000 Android 8.0+ devices.</w:t>
+      </w:r>
+    </w:p>
+    <w:p>
+      <w:pPr>
+        <w:pStyle w:val="ListBullet"/>
+        <w:spacing w:before="20" w:after="20"/>
+      </w:pPr>
+      <w:r>
+        <w:rPr>
+          <w:sz w:val="20"/>
+        </w:rPr>
+        <w:t>Validate in Philippine Cohort: Execute a prospective STARD-compliant field validation study (n = 250, paired with laboratory automated CBC) within 12 months.</w:t>
+      </w:r>
+    </w:p>
+    <w:p>
+      <w:pPr>
+        <w:spacing w:before="200" w:after="60"/>
+      </w:pPr>
+      <w:r>
+        <w:rPr>
+          <w:b/>
+          <w:color w:val="1B6B8A"/>
+          <w:sz w:val="23"/>
+        </w:rPr>
+        <w:t>Explicit Scientific Reliability Bounds &amp; Limitations</w:t>
+      </w:r>
+    </w:p>
+    <w:p>
+      <w:pPr>
+        <w:pStyle w:val="ListBullet"/>
+        <w:spacing w:before="20" w:after="20"/>
+      </w:pPr>
+      <w:r>
+        <w:rPr>
+          <w:sz w:val="20"/>
+        </w:rPr>
+        <w:t>The Mild Anemia Detection Limit: Optical pallor is a physiological lagging indicator (Kalter et al., 1997). Under smartphone RGB sensors, pallor does not reliably separate from normal perfusion until hemoglobin drops below ~9.0–10.0 g/dL. TinginHB is explicitly NOT designed or marketed to diagnose mild anemia (11.0–11.9 g/dL). A green result does not rule out early-stage iron deficiency.</w:t>
+      </w:r>
+    </w:p>
+    <w:p>
+      <w:pPr>
+        <w:pStyle w:val="ListBullet"/>
+        <w:spacing w:before="20" w:after="20"/>
+      </w:pPr>
+      <w:r>
+        <w:rPr>
+          <w:sz w:val="20"/>
+        </w:rPr>
+        <w:t>Triage Decision Support, Not Laboratory Diagnostic: TinginHB never issues a definitive medical diagnosis; it identifies individuals requiring urgent confirmatory CBC.</w:t>
+      </w:r>
+    </w:p>
+    <w:p>
+      <w:pPr>
+        <w:pStyle w:val="ListBullet"/>
+        <w:spacing w:before="20" w:after="20"/>
+      </w:pPr>
+      <w:r>
+        <w:rPr>
+          <w:sz w:val="20"/>
+        </w:rPr>
+        <w:t>Known Confounders: Active conjunctivitis (produces redness/false negatives), jaundice (distorts scleral reference), hypothermia (causes peripheral vasoconstriction), and onychomycosis (blocks nail bed transmission).</w:t>
+      </w:r>
+    </w:p>
+    <w:p>
+      <w:pPr>
+        <w:spacing w:before="280" w:after="60"/>
+      </w:pPr>
+      <w:r>
+        <w:rPr>
+          <w:b/>
+          <w:color w:val="0E4D64"/>
+          <w:sz w:val="27"/>
+        </w:rPr>
+        <w:t>V. TARGET MARKET / BENEFICIARIES</w:t>
+      </w:r>
+    </w:p>
+    <w:p>
+      <w:pPr>
+        <w:spacing w:before="200" w:after="60"/>
+      </w:pPr>
+      <w:r>
+        <w:rPr>
+          <w:b/>
+          <w:color w:val="1B6B8A"/>
+          <w:sz w:val="23"/>
+        </w:rPr>
+        <w:t>Primary Users (App Operators)</w:t>
+      </w:r>
+    </w:p>
+    <w:p>
+      <w:pPr>
+        <w:pStyle w:val="ListBullet"/>
+        <w:spacing w:before="20" w:after="20"/>
+      </w:pPr>
+      <w:r>
+        <w:rPr>
+          <w:sz w:val="20"/>
+        </w:rPr>
+        <w:t>~75,000–200,000 Barangay Health Workers (BHWs) conducting community house-to-house tracking.</w:t>
+      </w:r>
+    </w:p>
+    <w:p>
+      <w:pPr>
+        <w:pStyle w:val="ListBullet"/>
+        <w:spacing w:before="20" w:after="20"/>
+      </w:pPr>
+      <w:r>
+        <w:rPr>
+          <w:sz w:val="20"/>
+        </w:rPr>
+        <w:t>Rural Health Unit (RHU) nurses and midwives conducting antenatal care and Well-Baby checkups.</w:t>
+      </w:r>
+    </w:p>
+    <w:p>
+      <w:pPr>
+        <w:spacing w:before="200" w:after="60"/>
+      </w:pPr>
+      <w:r>
+        <w:rPr>
+          <w:b/>
+          <w:color w:val="1B6B8A"/>
+          <w:sz w:val="23"/>
+        </w:rPr>
+        <w:t>Primary Beneficiaries (Patients Screened)</w:t>
+      </w:r>
+    </w:p>
+    <w:p>
+      <w:pPr>
+        <w:pStyle w:val="ListBullet"/>
+        <w:spacing w:before="20" w:after="20"/>
+      </w:pPr>
+      <w:r>
+        <w:rPr>
+          <w:sz w:val="20"/>
+        </w:rPr>
+        <w:t>Pregnant Filipino women (~1.7 million deliveries/year; 21.8% to 28.0% entering labor anemic).</w:t>
+      </w:r>
+    </w:p>
+    <w:p>
+      <w:pPr>
+        <w:pStyle w:val="ListBullet"/>
+        <w:spacing w:before="20" w:after="20"/>
+      </w:pPr>
+      <w:r>
+        <w:rPr>
+          <w:sz w:val="20"/>
+        </w:rPr>
+        <w:t>Infants 6–24 months (~2.2 million; 40–45% anemic during the critical first 1,000 days).</w:t>
+      </w:r>
+    </w:p>
+    <w:p>
+      <w:pPr>
+        <w:pStyle w:val="ListBullet"/>
+        <w:spacing w:before="20" w:after="20"/>
+      </w:pPr>
+      <w:r>
+        <w:rPr>
+          <w:sz w:val="20"/>
+        </w:rPr>
+        <w:t>Adolescent females in DepEd Weekly Iron and Folic Acid Supplementation (WIFA) programs.</w:t>
+      </w:r>
+    </w:p>
+    <w:p>
+      <w:pPr>
+        <w:spacing w:before="200" w:after="60"/>
+      </w:pPr>
+      <w:r>
+        <w:rPr>
+          <w:b/>
+          <w:color w:val="1B6B8A"/>
+          <w:sz w:val="23"/>
+        </w:rPr>
+        <w:t>Institutional Customers (Procuring Bodies)</w:t>
+      </w:r>
+    </w:p>
+    <w:p>
+      <w:pPr>
+        <w:pStyle w:val="ListBullet"/>
+        <w:spacing w:before="20" w:after="20"/>
+      </w:pPr>
+      <w:r>
+        <w:rPr>
+          <w:sz w:val="20"/>
+        </w:rPr>
+        <w:t>Department of Health (DOH) and Local Government Units (LGUs) under Universal Health Care (RA 11223).</w:t>
+      </w:r>
+    </w:p>
+    <w:p>
+      <w:pPr>
+        <w:pStyle w:val="ListBullet"/>
+        <w:spacing w:before="20" w:after="20"/>
+      </w:pPr>
+      <w:r>
+        <w:rPr>
+          <w:sz w:val="20"/>
+        </w:rPr>
+        <w:t>PhilHealth Konsulta-accredited primary care provider networks.</w:t>
+      </w:r>
+    </w:p>
+    <w:p>
+      <w:pPr>
+        <w:pStyle w:val="ListBullet"/>
+        <w:spacing w:before="20" w:after="20"/>
+      </w:pPr>
+      <w:r>
+        <w:rPr>
+          <w:sz w:val="20"/>
+        </w:rPr>
+        <w:t>International NGOs: UNFPA, UNICEF, Helen Keller International, Zuellig Family Foundation.</w:t>
+      </w:r>
+    </w:p>
+    <w:p>
+      <w:pPr>
+        <w:pStyle w:val="ListBullet"/>
+        <w:spacing w:before="20" w:after="20"/>
+      </w:pPr>
+      <w:r>
+        <w:rPr>
+          <w:sz w:val="20"/>
+        </w:rPr>
+        <w:t>Geographic Launchpad: Northern Mindanao (Region X) rural LGUs, anchored by USTP Cagayan de Oro.</w:t>
+      </w:r>
+    </w:p>
+    <w:p>
+      <w:pPr>
+        <w:spacing w:before="280" w:after="60"/>
+      </w:pPr>
+      <w:r>
+        <w:rPr>
+          <w:b/>
+          <w:color w:val="0E4D64"/>
+          <w:sz w:val="27"/>
+        </w:rPr>
+        <w:t>VI. VALUE PROPOSITION</w:t>
+      </w:r>
+    </w:p>
+    <w:p>
+      <w:pPr>
+        <w:spacing w:before="40" w:after="80"/>
+        <w:jc w:val="both"/>
+      </w:pPr>
+      <w:r>
+        <w:rPr>
+          <w:i w:val="0"/>
+          <w:sz w:val="20"/>
+        </w:rPr>
+        <w:t>TingínHB delivers an unmatched combination of clinical accessibility, scientific honesty, and Philippine health policy integration:</w:t>
+      </w:r>
+    </w:p>
+    <w:tbl>
+      <w:tblPr>
+        <w:tblStyle w:val="TableGrid"/>
+        <w:tblW w:type="auto" w:w="0"/>
+        <w:jc w:val="center"/>
+        <w:tblLook w:firstColumn="1" w:firstRow="1" w:lastColumn="0" w:lastRow="0" w:noHBand="0" w:noVBand="1" w:val="04A0"/>
+      </w:tblPr>
+      <w:tblGrid>
+        <w:gridCol w:w="1881"/>
+        <w:gridCol w:w="1881"/>
+        <w:gridCol w:w="1881"/>
+        <w:gridCol w:w="1881"/>
+        <w:gridCol w:w="1881"/>
+      </w:tblGrid>
+      <w:tr>
+        <w:tc>
+          <w:tcPr>
+            <w:tcW w:type="dxa" w:w="1984"/>
+            <w:shd w:val="clear" w:color="auto" w:fill="0E4D64"/>
+          </w:tcPr>
+          <w:p>
+            <w:pPr>
+              <w:jc w:val="center"/>
+            </w:pPr>
+            <w:r>
+              <w:rPr>
+                <w:b/>
+                <w:color w:val="FFFFFF"/>
+                <w:sz w:val="18"/>
+              </w:rPr>
+              <w:t>Feature / Dimension</w:t>
+            </w:r>
+          </w:p>
+        </w:tc>
+        <w:tc>
+          <w:tcPr>
+            <w:tcW w:type="dxa" w:w="2154"/>
+            <w:shd w:val="clear" w:color="auto" w:fill="0E4D64"/>
+          </w:tcPr>
+          <w:p>
+            <w:pPr>
+              <w:jc w:val="center"/>
+            </w:pPr>
+            <w:r>
+              <w:rPr>
+                <w:b/>
+                <w:color w:val="FFFFFF"/>
+                <w:sz w:val="18"/>
+              </w:rPr>
+              <w:t>TingínHB (DataLunas)</w:t>
+            </w:r>
+          </w:p>
+        </w:tc>
+        <w:tc>
+          <w:tcPr>
+            <w:tcW w:type="dxa" w:w="1984"/>
+            <w:shd w:val="clear" w:color="auto" w:fill="0E4D64"/>
+          </w:tcPr>
+          <w:p>
+            <w:pPr>
+              <w:jc w:val="center"/>
+            </w:pPr>
+            <w:r>
+              <w:rPr>
+                <w:b/>
+                <w:color w:val="FFFFFF"/>
+                <w:sz w:val="18"/>
+              </w:rPr>
+              <w:t>HemoCue Hb 301</w:t>
+            </w:r>
+          </w:p>
+        </w:tc>
+        <w:tc>
+          <w:tcPr>
+            <w:tcW w:type="dxa" w:w="1984"/>
+            <w:shd w:val="clear" w:color="auto" w:fill="0E4D64"/>
+          </w:tcPr>
+          <w:p>
+            <w:pPr>
+              <w:jc w:val="center"/>
+            </w:pPr>
+            <w:r>
+              <w:rPr>
+                <w:b/>
+                <w:color w:val="FFFFFF"/>
+                <w:sz w:val="18"/>
+              </w:rPr>
+              <w:t>AnemoCheck (US)</w:t>
+            </w:r>
+          </w:p>
+        </w:tc>
+        <w:tc>
+          <w:tcPr>
+            <w:tcW w:type="dxa" w:w="1531"/>
+            <w:shd w:val="clear" w:color="auto" w:fill="0E4D64"/>
+          </w:tcPr>
+          <w:p>
+            <w:pPr>
+              <w:jc w:val="center"/>
+            </w:pPr>
+            <w:r>
+              <w:rPr>
+                <w:b/>
+                <w:color w:val="FFFFFF"/>
+                <w:sz w:val="18"/>
+              </w:rPr>
+              <w:t>Naked-Eye Pallor</w:t>
             </w:r>
           </w:p>
         </w:tc>
@@ -2537,7 +2326,7 @@
       <w:tr>
         <w:tc>
           <w:tcPr>
-            <w:tcW w:type="dxa" w:w="2551"/>
+            <w:tcW w:type="dxa" w:w="1984"/>
             <w:shd w:val="clear" w:color="auto" w:fill="FFFFFF"/>
           </w:tcPr>
           <w:p>
@@ -2545,13 +2334,13 @@
               <w:rPr>
                 <w:sz w:val="18"/>
               </w:rPr>
-              <w:t>Total System Footprint</w:t>
+              <w:t>Cost per Test</w:t>
             </w:r>
           </w:p>
         </w:tc>
         <w:tc>
           <w:tcPr>
-            <w:tcW w:type="dxa" w:w="3118"/>
+            <w:tcW w:type="dxa" w:w="2154"/>
             <w:shd w:val="clear" w:color="auto" w:fill="FFFFFF"/>
           </w:tcPr>
           <w:p>
@@ -2559,13 +2348,13 @@
               <w:rPr>
                 <w:sz w:val="18"/>
               </w:rPr>
-              <w:t>Fully On-Device</w:t>
+              <w:t>₱0.00 (Zero Consumables)</w:t>
             </w:r>
           </w:p>
         </w:tc>
         <w:tc>
           <w:tcPr>
-            <w:tcW w:type="dxa" w:w="3969"/>
+            <w:tcW w:type="dxa" w:w="1984"/>
             <w:shd w:val="clear" w:color="auto" w:fill="FFFFFF"/>
           </w:tcPr>
           <w:p>
@@ -2573,7 +2362,35 @@
               <w:rPr>
                 <w:sz w:val="18"/>
               </w:rPr>
-              <w:t>&lt; 10 MB total | &lt; 450ms latency</w:t>
+              <w:t>₱105–₱150 / cuvette</w:t>
+            </w:r>
+          </w:p>
+        </w:tc>
+        <w:tc>
+          <w:tcPr>
+            <w:tcW w:type="dxa" w:w="1984"/>
+            <w:shd w:val="clear" w:color="auto" w:fill="FFFFFF"/>
+          </w:tcPr>
+          <w:p>
+            <w:r>
+              <w:rPr>
+                <w:sz w:val="18"/>
+              </w:rPr>
+              <w:t>~$5 USD + prior CBC</w:t>
+            </w:r>
+          </w:p>
+        </w:tc>
+        <w:tc>
+          <w:tcPr>
+            <w:tcW w:type="dxa" w:w="1531"/>
+            <w:shd w:val="clear" w:color="auto" w:fill="FFFFFF"/>
+          </w:tcPr>
+          <w:p>
+            <w:r>
+              <w:rPr>
+                <w:sz w:val="18"/>
+              </w:rPr>
+              <w:t>₱0.00</w:t>
             </w:r>
           </w:p>
         </w:tc>
@@ -2581,7 +2398,7 @@
       <w:tr>
         <w:tc>
           <w:tcPr>
-            <w:tcW w:type="dxa" w:w="2551"/>
+            <w:tcW w:type="dxa" w:w="1984"/>
             <w:shd w:val="clear" w:color="auto" w:fill="EAF4F8"/>
           </w:tcPr>
           <w:p>
@@ -2589,13 +2406,13 @@
               <w:rPr>
                 <w:sz w:val="18"/>
               </w:rPr>
-              <w:t>Minimum Hardware</w:t>
+              <w:t>Capital Equipment</w:t>
             </w:r>
           </w:p>
         </w:tc>
         <w:tc>
           <w:tcPr>
-            <w:tcW w:type="dxa" w:w="3118"/>
+            <w:tcW w:type="dxa" w:w="2154"/>
             <w:shd w:val="clear" w:color="auto" w:fill="EAF4F8"/>
           </w:tcPr>
           <w:p>
@@ -2603,13 +2420,13 @@
               <w:rPr>
                 <w:sz w:val="18"/>
               </w:rPr>
-              <w:t>Android 8.0 (Oreo)</w:t>
+              <w:t>₱0 (Existing Smartphone)</w:t>
             </w:r>
           </w:p>
         </w:tc>
         <w:tc>
           <w:tcPr>
-            <w:tcW w:type="dxa" w:w="3969"/>
+            <w:tcW w:type="dxa" w:w="1984"/>
             <w:shd w:val="clear" w:color="auto" w:fill="EAF4F8"/>
           </w:tcPr>
           <w:p>
@@ -2617,7 +2434,35 @@
               <w:rPr>
                 <w:sz w:val="18"/>
               </w:rPr>
-              <w:t>2 GB RAM | 8 MP Rear Camera</w:t>
+              <w:t>₱70,000–₱125,000</w:t>
+            </w:r>
+          </w:p>
+        </w:tc>
+        <w:tc>
+          <w:tcPr>
+            <w:tcW w:type="dxa" w:w="1984"/>
+            <w:shd w:val="clear" w:color="auto" w:fill="EAF4F8"/>
+          </w:tcPr>
+          <w:p>
+            <w:r>
+              <w:rPr>
+                <w:sz w:val="18"/>
+              </w:rPr>
+              <w:t>Smartphone only</w:t>
+            </w:r>
+          </w:p>
+        </w:tc>
+        <w:tc>
+          <w:tcPr>
+            <w:tcW w:type="dxa" w:w="1531"/>
+            <w:shd w:val="clear" w:color="auto" w:fill="EAF4F8"/>
+          </w:tcPr>
+          <w:p>
+            <w:r>
+              <w:rPr>
+                <w:sz w:val="18"/>
+              </w:rPr>
+              <w:t>₱0.00</w:t>
             </w:r>
           </w:p>
         </w:tc>
@@ -2625,7 +2470,7 @@
       <w:tr>
         <w:tc>
           <w:tcPr>
-            <w:tcW w:type="dxa" w:w="2551"/>
+            <w:tcW w:type="dxa" w:w="1984"/>
             <w:shd w:val="clear" w:color="auto" w:fill="FFFFFF"/>
           </w:tcPr>
           <w:p>
@@ -2633,13 +2478,315 @@
               <w:rPr>
                 <w:sz w:val="18"/>
               </w:rPr>
-              <w:t>Operational Mode</w:t>
+              <w:t>Sites Assessed</w:t>
             </w:r>
           </w:p>
         </w:tc>
         <w:tc>
           <w:tcPr>
-            <w:tcW w:type="dxa" w:w="3118"/>
+            <w:tcW w:type="dxa" w:w="2154"/>
+            <w:shd w:val="clear" w:color="auto" w:fill="FFFFFF"/>
+          </w:tcPr>
+          <w:p>
+            <w:r>
+              <w:rPr>
+                <w:sz w:val="18"/>
+              </w:rPr>
+              <w:t>Dual: Conjunctiva + Nail</w:t>
+            </w:r>
+          </w:p>
+        </w:tc>
+        <w:tc>
+          <w:tcPr>
+            <w:tcW w:type="dxa" w:w="1984"/>
+            <w:shd w:val="clear" w:color="auto" w:fill="FFFFFF"/>
+          </w:tcPr>
+          <w:p>
+            <w:r>
+              <w:rPr>
+                <w:sz w:val="18"/>
+              </w:rPr>
+              <w:t>Fingerstick (Blood)</w:t>
+            </w:r>
+          </w:p>
+        </w:tc>
+        <w:tc>
+          <w:tcPr>
+            <w:tcW w:type="dxa" w:w="1984"/>
+            <w:shd w:val="clear" w:color="auto" w:fill="FFFFFF"/>
+          </w:tcPr>
+          <w:p>
+            <w:r>
+              <w:rPr>
+                <w:sz w:val="18"/>
+              </w:rPr>
+              <w:t>Nail Bed Only</w:t>
+            </w:r>
+          </w:p>
+        </w:tc>
+        <w:tc>
+          <w:tcPr>
+            <w:tcW w:type="dxa" w:w="1531"/>
+            <w:shd w:val="clear" w:color="auto" w:fill="FFFFFF"/>
+          </w:tcPr>
+          <w:p>
+            <w:r>
+              <w:rPr>
+                <w:sz w:val="18"/>
+              </w:rPr>
+              <w:t>Variable / Subjective</w:t>
+            </w:r>
+          </w:p>
+        </w:tc>
+      </w:tr>
+      <w:tr>
+        <w:tc>
+          <w:tcPr>
+            <w:tcW w:type="dxa" w:w="1984"/>
+            <w:shd w:val="clear" w:color="auto" w:fill="EAF4F8"/>
+          </w:tcPr>
+          <w:p>
+            <w:r>
+              <w:rPr>
+                <w:sz w:val="18"/>
+              </w:rPr>
+              <w:t>Requires Prior CBC</w:t>
+            </w:r>
+          </w:p>
+        </w:tc>
+        <w:tc>
+          <w:tcPr>
+            <w:tcW w:type="dxa" w:w="2154"/>
+            <w:shd w:val="clear" w:color="auto" w:fill="EAF4F8"/>
+          </w:tcPr>
+          <w:p>
+            <w:r>
+              <w:rPr>
+                <w:sz w:val="18"/>
+              </w:rPr>
+              <w:t>NO (Zero Personalization)</w:t>
+            </w:r>
+          </w:p>
+        </w:tc>
+        <w:tc>
+          <w:tcPr>
+            <w:tcW w:type="dxa" w:w="1984"/>
+            <w:shd w:val="clear" w:color="auto" w:fill="EAF4F8"/>
+          </w:tcPr>
+          <w:p>
+            <w:r>
+              <w:rPr>
+                <w:sz w:val="18"/>
+              </w:rPr>
+              <w:t>No (Factory Calib.)</w:t>
+            </w:r>
+          </w:p>
+        </w:tc>
+        <w:tc>
+          <w:tcPr>
+            <w:tcW w:type="dxa" w:w="1984"/>
+            <w:shd w:val="clear" w:color="auto" w:fill="EAF4F8"/>
+          </w:tcPr>
+          <w:p>
+            <w:r>
+              <w:rPr>
+                <w:sz w:val="18"/>
+              </w:rPr>
+              <w:t>YES (Mandatory)</w:t>
+            </w:r>
+          </w:p>
+        </w:tc>
+        <w:tc>
+          <w:tcPr>
+            <w:tcW w:type="dxa" w:w="1531"/>
+            <w:shd w:val="clear" w:color="auto" w:fill="EAF4F8"/>
+          </w:tcPr>
+          <w:p>
+            <w:r>
+              <w:rPr>
+                <w:sz w:val="18"/>
+              </w:rPr>
+              <w:t>None</w:t>
+            </w:r>
+          </w:p>
+        </w:tc>
+      </w:tr>
+      <w:tr>
+        <w:tc>
+          <w:tcPr>
+            <w:tcW w:type="dxa" w:w="1984"/>
+            <w:shd w:val="clear" w:color="auto" w:fill="FFFFFF"/>
+          </w:tcPr>
+          <w:p>
+            <w:r>
+              <w:rPr>
+                <w:sz w:val="18"/>
+              </w:rPr>
+              <w:t>Melanin-Independent</w:t>
+            </w:r>
+          </w:p>
+        </w:tc>
+        <w:tc>
+          <w:tcPr>
+            <w:tcW w:type="dxa" w:w="2154"/>
+            <w:shd w:val="clear" w:color="auto" w:fill="FFFFFF"/>
+          </w:tcPr>
+          <w:p>
+            <w:r>
+              <w:rPr>
+                <w:sz w:val="18"/>
+              </w:rPr>
+              <w:t>YES (0-Melanin Mucosa)</w:t>
+            </w:r>
+          </w:p>
+        </w:tc>
+        <w:tc>
+          <w:tcPr>
+            <w:tcW w:type="dxa" w:w="1984"/>
+            <w:shd w:val="clear" w:color="auto" w:fill="FFFFFF"/>
+          </w:tcPr>
+          <w:p>
+            <w:r>
+              <w:rPr>
+                <w:sz w:val="18"/>
+              </w:rPr>
+              <w:t>Yes (Invasive)</w:t>
+            </w:r>
+          </w:p>
+        </w:tc>
+        <w:tc>
+          <w:tcPr>
+            <w:tcW w:type="dxa" w:w="1984"/>
+            <w:shd w:val="clear" w:color="auto" w:fill="FFFFFF"/>
+          </w:tcPr>
+          <w:p>
+            <w:r>
+              <w:rPr>
+                <w:sz w:val="18"/>
+              </w:rPr>
+              <w:t>NO (Skin Tone Bias)</w:t>
+            </w:r>
+          </w:p>
+        </w:tc>
+        <w:tc>
+          <w:tcPr>
+            <w:tcW w:type="dxa" w:w="1531"/>
+            <w:shd w:val="clear" w:color="auto" w:fill="FFFFFF"/>
+          </w:tcPr>
+          <w:p>
+            <w:r>
+              <w:rPr>
+                <w:sz w:val="18"/>
+              </w:rPr>
+              <w:t>NO (Severe Bias)</w:t>
+            </w:r>
+          </w:p>
+        </w:tc>
+      </w:tr>
+      <w:tr>
+        <w:tc>
+          <w:tcPr>
+            <w:tcW w:type="dxa" w:w="1984"/>
+            <w:shd w:val="clear" w:color="auto" w:fill="EAF4F8"/>
+          </w:tcPr>
+          <w:p>
+            <w:r>
+              <w:rPr>
+                <w:sz w:val="18"/>
+              </w:rPr>
+              <w:t>Output Type</w:t>
+            </w:r>
+          </w:p>
+        </w:tc>
+        <w:tc>
+          <w:tcPr>
+            <w:tcW w:type="dxa" w:w="2154"/>
+            <w:shd w:val="clear" w:color="auto" w:fill="EAF4F8"/>
+          </w:tcPr>
+          <w:p>
+            <w:r>
+              <w:rPr>
+                <w:sz w:val="18"/>
+              </w:rPr>
+              <w:t>Calibrated Probability</w:t>
+            </w:r>
+          </w:p>
+        </w:tc>
+        <w:tc>
+          <w:tcPr>
+            <w:tcW w:type="dxa" w:w="1984"/>
+            <w:shd w:val="clear" w:color="auto" w:fill="EAF4F8"/>
+          </w:tcPr>
+          <w:p>
+            <w:r>
+              <w:rPr>
+                <w:sz w:val="18"/>
+              </w:rPr>
+              <w:t>Absolute Hb (g/dL)</w:t>
+            </w:r>
+          </w:p>
+        </w:tc>
+        <w:tc>
+          <w:tcPr>
+            <w:tcW w:type="dxa" w:w="1984"/>
+            <w:shd w:val="clear" w:color="auto" w:fill="EAF4F8"/>
+          </w:tcPr>
+          <w:p>
+            <w:r>
+              <w:rPr>
+                <w:sz w:val="18"/>
+              </w:rPr>
+              <w:t>Continuous Hb (g/dL)</w:t>
+            </w:r>
+          </w:p>
+        </w:tc>
+        <w:tc>
+          <w:tcPr>
+            <w:tcW w:type="dxa" w:w="1531"/>
+            <w:shd w:val="clear" w:color="auto" w:fill="EAF4F8"/>
+          </w:tcPr>
+          <w:p>
+            <w:r>
+              <w:rPr>
+                <w:sz w:val="18"/>
+              </w:rPr>
+              <w:t>Subjective Guess</w:t>
+            </w:r>
+          </w:p>
+        </w:tc>
+      </w:tr>
+      <w:tr>
+        <w:tc>
+          <w:tcPr>
+            <w:tcW w:type="dxa" w:w="1984"/>
+            <w:shd w:val="clear" w:color="auto" w:fill="FFFFFF"/>
+          </w:tcPr>
+          <w:p>
+            <w:r>
+              <w:rPr>
+                <w:sz w:val="18"/>
+              </w:rPr>
+              <w:t>Offline Ready</w:t>
+            </w:r>
+          </w:p>
+        </w:tc>
+        <w:tc>
+          <w:tcPr>
+            <w:tcW w:type="dxa" w:w="2154"/>
+            <w:shd w:val="clear" w:color="auto" w:fill="FFFFFF"/>
+          </w:tcPr>
+          <w:p>
+            <w:r>
+              <w:rPr>
+                <w:sz w:val="18"/>
+              </w:rPr>
+              <w:t>100% Offline (&lt;10 MB)</w:t>
+            </w:r>
+          </w:p>
+        </w:tc>
+        <w:tc>
+          <w:tcPr>
+            <w:tcW w:type="dxa" w:w="1984"/>
             <w:shd w:val="clear" w:color="auto" w:fill="FFFFFF"/>
           </w:tcPr>
           <w:p>
@@ -2653,7 +2800,7 @@
         </w:tc>
         <w:tc>
           <w:tcPr>
-            <w:tcW w:type="dxa" w:w="3969"/>
+            <w:tcW w:type="dxa" w:w="1984"/>
             <w:shd w:val="clear" w:color="auto" w:fill="FFFFFF"/>
           </w:tcPr>
           <w:p>
@@ -2661,7 +2808,165 @@
               <w:rPr>
                 <w:sz w:val="18"/>
               </w:rPr>
-              <w:t>Zero mobile data required</w:t>
+              <w:t>Requires Cloud Sync</w:t>
+            </w:r>
+          </w:p>
+        </w:tc>
+        <w:tc>
+          <w:tcPr>
+            <w:tcW w:type="dxa" w:w="1531"/>
+            <w:shd w:val="clear" w:color="auto" w:fill="FFFFFF"/>
+          </w:tcPr>
+          <w:p>
+            <w:r>
+              <w:rPr>
+                <w:sz w:val="18"/>
+              </w:rPr>
+              <w:t>Offline</w:t>
+            </w:r>
+          </w:p>
+        </w:tc>
+      </w:tr>
+      <w:tr>
+        <w:tc>
+          <w:tcPr>
+            <w:tcW w:type="dxa" w:w="1984"/>
+            <w:shd w:val="clear" w:color="auto" w:fill="EAF4F8"/>
+          </w:tcPr>
+          <w:p>
+            <w:r>
+              <w:rPr>
+                <w:sz w:val="18"/>
+              </w:rPr>
+              <w:t>PH Policy Integration</w:t>
+            </w:r>
+          </w:p>
+        </w:tc>
+        <w:tc>
+          <w:tcPr>
+            <w:tcW w:type="dxa" w:w="2154"/>
+            <w:shd w:val="clear" w:color="auto" w:fill="EAF4F8"/>
+          </w:tcPr>
+          <w:p>
+            <w:r>
+              <w:rPr>
+                <w:sz w:val="18"/>
+              </w:rPr>
+              <w:t>Konsulta PDF Auto-Slip</w:t>
+            </w:r>
+          </w:p>
+        </w:tc>
+        <w:tc>
+          <w:tcPr>
+            <w:tcW w:type="dxa" w:w="1984"/>
+            <w:shd w:val="clear" w:color="auto" w:fill="EAF4F8"/>
+          </w:tcPr>
+          <w:p>
+            <w:r>
+              <w:rPr>
+                <w:sz w:val="18"/>
+              </w:rPr>
+              <w:t>None</w:t>
+            </w:r>
+          </w:p>
+        </w:tc>
+        <w:tc>
+          <w:tcPr>
+            <w:tcW w:type="dxa" w:w="1984"/>
+            <w:shd w:val="clear" w:color="auto" w:fill="EAF4F8"/>
+          </w:tcPr>
+          <w:p>
+            <w:r>
+              <w:rPr>
+                <w:sz w:val="18"/>
+              </w:rPr>
+              <w:t>None</w:t>
+            </w:r>
+          </w:p>
+        </w:tc>
+        <w:tc>
+          <w:tcPr>
+            <w:tcW w:type="dxa" w:w="1531"/>
+            <w:shd w:val="clear" w:color="auto" w:fill="EAF4F8"/>
+          </w:tcPr>
+          <w:p>
+            <w:r>
+              <w:rPr>
+                <w:sz w:val="18"/>
+              </w:rPr>
+              <w:t>Manual Paper Logs</w:t>
+            </w:r>
+          </w:p>
+        </w:tc>
+      </w:tr>
+      <w:tr>
+        <w:tc>
+          <w:tcPr>
+            <w:tcW w:type="dxa" w:w="1984"/>
+            <w:shd w:val="clear" w:color="auto" w:fill="FFFFFF"/>
+          </w:tcPr>
+          <w:p>
+            <w:r>
+              <w:rPr>
+                <w:sz w:val="18"/>
+              </w:rPr>
+              <w:t>Biohazardous Waste</w:t>
+            </w:r>
+          </w:p>
+        </w:tc>
+        <w:tc>
+          <w:tcPr>
+            <w:tcW w:type="dxa" w:w="2154"/>
+            <w:shd w:val="clear" w:color="auto" w:fill="FFFFFF"/>
+          </w:tcPr>
+          <w:p>
+            <w:r>
+              <w:rPr>
+                <w:sz w:val="18"/>
+              </w:rPr>
+              <w:t>NONE (Non-Invasive)</w:t>
+            </w:r>
+          </w:p>
+        </w:tc>
+        <w:tc>
+          <w:tcPr>
+            <w:tcW w:type="dxa" w:w="1984"/>
+            <w:shd w:val="clear" w:color="auto" w:fill="FFFFFF"/>
+          </w:tcPr>
+          <w:p>
+            <w:r>
+              <w:rPr>
+                <w:sz w:val="18"/>
+              </w:rPr>
+              <w:t>Lancets &amp; Cuvettes</w:t>
+            </w:r>
+          </w:p>
+        </w:tc>
+        <w:tc>
+          <w:tcPr>
+            <w:tcW w:type="dxa" w:w="1984"/>
+            <w:shd w:val="clear" w:color="auto" w:fill="FFFFFF"/>
+          </w:tcPr>
+          <w:p>
+            <w:r>
+              <w:rPr>
+                <w:sz w:val="18"/>
+              </w:rPr>
+              <w:t>None</w:t>
+            </w:r>
+          </w:p>
+        </w:tc>
+        <w:tc>
+          <w:tcPr>
+            <w:tcW w:type="dxa" w:w="1531"/>
+            <w:shd w:val="clear" w:color="auto" w:fill="FFFFFF"/>
+          </w:tcPr>
+          <w:p>
+            <w:r>
+              <w:rPr>
+                <w:sz w:val="18"/>
+              </w:rPr>
+              <w:t>None</w:t>
             </w:r>
           </w:p>
         </w:tc>
@@ -2864,55 +3169,282 @@
           <w:color w:val="0E4D64"/>
           <w:sz w:val="27"/>
         </w:rPr>
-        <w:t>VIII. BUSINESS MODEL &amp; PUBLIC HEALTH SUSTAINABILITY</w:t>
+        <w:t>VII. BUSINESS MODEL</w:t>
       </w:r>
     </w:p>
     <w:p>
       <w:pPr>
-        <w:pStyle w:val="ListBullet"/>
-        <w:spacing w:before="20" w:after="20"/>
+        <w:spacing w:before="40" w:after="80"/>
+        <w:jc w:val="both"/>
       </w:pPr>
       <w:r>
         <w:rPr>
+          <w:i w:val="0"/>
           <w:sz w:val="20"/>
         </w:rPr>
-        <w:t>FREE TIER FOR BHWs: Core screening, triage, and offline PDF referral generation are perpetually free for community health workers and rural barangay health stations.</w:t>
+        <w:t>TingínHB follows a freemium public-health B2G model. The BHW screening application is perpetually free—because neither the indigent mother nor the voluntary health worker is the financial buyer. Revenue flows from institutional health buyers whose procurement budgets achieve immediate cost savings:</w:t>
       </w:r>
     </w:p>
+    <w:tbl>
+      <w:tblPr>
+        <w:tblStyle w:val="TableGrid"/>
+        <w:tblW w:type="auto" w:w="0"/>
+        <w:jc w:val="center"/>
+        <w:tblLook w:firstColumn="1" w:firstRow="1" w:lastColumn="0" w:lastRow="0" w:noHBand="0" w:noVBand="1" w:val="04A0"/>
+      </w:tblPr>
+      <w:tblGrid>
+        <w:gridCol w:w="3135"/>
+        <w:gridCol w:w="3135"/>
+        <w:gridCol w:w="3135"/>
+      </w:tblGrid>
+      <w:tr>
+        <w:tc>
+          <w:tcPr>
+            <w:tcW w:type="dxa" w:w="2551"/>
+            <w:shd w:val="clear" w:color="auto" w:fill="0E4D64"/>
+          </w:tcPr>
+          <w:p>
+            <w:pPr>
+              <w:jc w:val="center"/>
+            </w:pPr>
+            <w:r>
+              <w:rPr>
+                <w:b/>
+                <w:color w:val="FFFFFF"/>
+                <w:sz w:val="18"/>
+              </w:rPr>
+              <w:t>Revenue Stream</w:t>
+            </w:r>
+          </w:p>
+        </w:tc>
+        <w:tc>
+          <w:tcPr>
+            <w:tcW w:type="dxa" w:w="5102"/>
+            <w:shd w:val="clear" w:color="auto" w:fill="0E4D64"/>
+          </w:tcPr>
+          <w:p>
+            <w:pPr>
+              <w:jc w:val="center"/>
+            </w:pPr>
+            <w:r>
+              <w:rPr>
+                <w:b/>
+                <w:color w:val="FFFFFF"/>
+                <w:sz w:val="18"/>
+              </w:rPr>
+              <w:t>Description &amp; Target Pricing</w:t>
+            </w:r>
+          </w:p>
+        </w:tc>
+        <w:tc>
+          <w:tcPr>
+            <w:tcW w:type="dxa" w:w="1984"/>
+            <w:shd w:val="clear" w:color="auto" w:fill="0E4D64"/>
+          </w:tcPr>
+          <w:p>
+            <w:pPr>
+              <w:jc w:val="center"/>
+            </w:pPr>
+            <w:r>
+              <w:rPr>
+                <w:b/>
+                <w:color w:val="FFFFFF"/>
+                <w:sz w:val="18"/>
+              </w:rPr>
+              <w:t>Projected Timeline</w:t>
+            </w:r>
+          </w:p>
+        </w:tc>
+      </w:tr>
+      <w:tr>
+        <w:tc>
+          <w:tcPr>
+            <w:tcW w:type="dxa" w:w="2551"/>
+            <w:shd w:val="clear" w:color="auto" w:fill="FFFFFF"/>
+          </w:tcPr>
+          <w:p>
+            <w:r>
+              <w:rPr>
+                <w:sz w:val="18"/>
+              </w:rPr>
+              <w:t>DOH / LGU Enterprise SaaS</w:t>
+            </w:r>
+          </w:p>
+        </w:tc>
+        <w:tc>
+          <w:tcPr>
+            <w:tcW w:type="dxa" w:w="5102"/>
+            <w:shd w:val="clear" w:color="auto" w:fill="FFFFFF"/>
+          </w:tcPr>
+          <w:p>
+            <w:r>
+              <w:rPr>
+                <w:sz w:val="18"/>
+              </w:rPr>
+              <w:t>Municipal/provincial annual license (₱500–₱1,000/BHW/yr) for maternal epidemiological dashboards and Konsulta API sync. 10% BHW adoption = ₱3.75M ARR.</w:t>
+            </w:r>
+          </w:p>
+        </w:tc>
+        <w:tc>
+          <w:tcPr>
+            <w:tcW w:type="dxa" w:w="1984"/>
+            <w:shd w:val="clear" w:color="auto" w:fill="FFFFFF"/>
+          </w:tcPr>
+          <w:p>
+            <w:r>
+              <w:rPr>
+                <w:sz w:val="18"/>
+              </w:rPr>
+              <w:t>Year 3+</w:t>
+            </w:r>
+          </w:p>
+        </w:tc>
+      </w:tr>
+      <w:tr>
+        <w:tc>
+          <w:tcPr>
+            <w:tcW w:type="dxa" w:w="2551"/>
+            <w:shd w:val="clear" w:color="auto" w:fill="EAF4F8"/>
+          </w:tcPr>
+          <w:p>
+            <w:r>
+              <w:rPr>
+                <w:sz w:val="18"/>
+              </w:rPr>
+              <w:t>NGO / Development Procurement</w:t>
+            </w:r>
+          </w:p>
+        </w:tc>
+        <w:tc>
+          <w:tcPr>
+            <w:tcW w:type="dxa" w:w="5102"/>
+            <w:shd w:val="clear" w:color="auto" w:fill="EAF4F8"/>
+          </w:tcPr>
+          <w:p>
+            <w:r>
+              <w:rPr>
+                <w:sz w:val="18"/>
+              </w:rPr>
+              <w:t>Annual bulk deployment license to maternal programs (UNFPA, UNICEF, Zuellig Foundation) at ₱50,000–₱150,000 per program.</w:t>
+            </w:r>
+          </w:p>
+        </w:tc>
+        <w:tc>
+          <w:tcPr>
+            <w:tcW w:type="dxa" w:w="1984"/>
+            <w:shd w:val="clear" w:color="auto" w:fill="EAF4F8"/>
+          </w:tcPr>
+          <w:p>
+            <w:r>
+              <w:rPr>
+                <w:sz w:val="18"/>
+              </w:rPr>
+              <w:t>Year 2+</w:t>
+            </w:r>
+          </w:p>
+        </w:tc>
+      </w:tr>
+      <w:tr>
+        <w:tc>
+          <w:tcPr>
+            <w:tcW w:type="dxa" w:w="2551"/>
+            <w:shd w:val="clear" w:color="auto" w:fill="FFFFFF"/>
+          </w:tcPr>
+          <w:p>
+            <w:r>
+              <w:rPr>
+                <w:sz w:val="18"/>
+              </w:rPr>
+              <w:t>DICT / PSC XI Seed Grant</w:t>
+            </w:r>
+          </w:p>
+        </w:tc>
+        <w:tc>
+          <w:tcPr>
+            <w:tcW w:type="dxa" w:w="5102"/>
+            <w:shd w:val="clear" w:color="auto" w:fill="FFFFFF"/>
+          </w:tcPr>
+          <w:p>
+            <w:r>
+              <w:rPr>
+                <w:sz w:val="18"/>
+              </w:rPr>
+              <w:t>Seed funding from PSC XI competition prize and DICT Startup Grant Fund (SGF) for prototype finalization and regulatory filings.</w:t>
+            </w:r>
+          </w:p>
+        </w:tc>
+        <w:tc>
+          <w:tcPr>
+            <w:tcW w:type="dxa" w:w="1984"/>
+            <w:shd w:val="clear" w:color="auto" w:fill="FFFFFF"/>
+          </w:tcPr>
+          <w:p>
+            <w:r>
+              <w:rPr>
+                <w:sz w:val="18"/>
+              </w:rPr>
+              <w:t>Year 1</w:t>
+            </w:r>
+          </w:p>
+        </w:tc>
+      </w:tr>
+      <w:tr>
+        <w:tc>
+          <w:tcPr>
+            <w:tcW w:type="dxa" w:w="2551"/>
+            <w:shd w:val="clear" w:color="auto" w:fill="EAF4F8"/>
+          </w:tcPr>
+          <w:p>
+            <w:r>
+              <w:rPr>
+                <w:sz w:val="18"/>
+              </w:rPr>
+              <w:t>Research / Clinical Partnerships</w:t>
+            </w:r>
+          </w:p>
+        </w:tc>
+        <w:tc>
+          <w:tcPr>
+            <w:tcW w:type="dxa" w:w="5102"/>
+            <w:shd w:val="clear" w:color="auto" w:fill="EAF4F8"/>
+          </w:tcPr>
+          <w:p>
+            <w:r>
+              <w:rPr>
+                <w:sz w:val="18"/>
+              </w:rPr>
+              <w:t>Collaborative clinical validation grants with DOH tertiary hospitals and academic institutions.</w:t>
+            </w:r>
+          </w:p>
+        </w:tc>
+        <w:tc>
+          <w:tcPr>
+            <w:tcW w:type="dxa" w:w="1984"/>
+            <w:shd w:val="clear" w:color="auto" w:fill="EAF4F8"/>
+          </w:tcPr>
+          <w:p>
+            <w:r>
+              <w:rPr>
+                <w:sz w:val="18"/>
+              </w:rPr>
+              <w:t>Year 1–2</w:t>
+            </w:r>
+          </w:p>
+        </w:tc>
+      </w:tr>
+    </w:tbl>
+    <w:p/>
     <w:p>
       <w:pPr>
-        <w:pStyle w:val="ListBullet"/>
-        <w:spacing w:before="20" w:after="20"/>
+        <w:spacing w:before="40" w:after="80"/>
+        <w:jc w:val="both"/>
       </w:pPr>
       <w:r>
         <w:rPr>
+          <w:i w:val="0"/>
           <w:sz w:val="20"/>
         </w:rPr>
-        <w:t>LGU &amp; DOH ENTERPRISE LICENSING: Municipal and provincial health offices pay an annual SaaS license (₱500–₱1,000 / BHW / year) for centralized epidemiological dashboards, maternal tracking analytics, and PhilHealth Konsulta integration.</w:t>
-      </w:r>
-    </w:p>
-    <w:p>
-      <w:pPr>
-        <w:pStyle w:val="ListBullet"/>
-        <w:spacing w:before="20" w:after="20"/>
-      </w:pPr>
-      <w:r>
-        <w:rPr>
-          <w:sz w:val="20"/>
-        </w:rPr>
-        <w:t>NGO &amp; DEVELOPMENT PARTNERSHIPS: Bulk enterprise deployment across maternal and child health programs (UNFPA, UNICEF, Zuellig Family Foundation).</w:t>
-      </w:r>
-    </w:p>
-    <w:p>
-      <w:pPr>
-        <w:pStyle w:val="ListBullet"/>
-        <w:spacing w:before="20" w:after="20"/>
-      </w:pPr>
-      <w:r>
-        <w:rPr>
-          <w:sz w:val="20"/>
-        </w:rPr>
-        <w:t>Macro-Economic Value: Replacing just one disposable HemoCue microcuvette (₱150) across 50,000 community screenings/month saves local government health budgets over ₱7.5 Million monthly in consumable waste.</w:t>
+        <w:t>Macro-Economic Cost Avoidance: Replacing just one single-use HemoCue microcuvette (₱150) across 50,000 monthly community screenings saves local government health budgets over ₱7.5 Million monthly in recurring procurement waste.</w:t>
       </w:r>
     </w:p>
     <w:p>
@@ -2925,7 +3457,106 @@
           <w:color w:val="0E4D64"/>
           <w:sz w:val="27"/>
         </w:rPr>
-        <w:t>IX. RESEARCH TIMELINE &amp; FIELD VALIDATION ROADMAP</w:t>
+        <w:t>VIII. MARKET ANALYSIS</w:t>
+      </w:r>
+    </w:p>
+    <w:p>
+      <w:pPr>
+        <w:spacing w:before="200" w:after="60"/>
+      </w:pPr>
+      <w:r>
+        <w:rPr>
+          <w:b/>
+          <w:color w:val="1B6B8A"/>
+          <w:sz w:val="23"/>
+        </w:rPr>
+        <w:t>Market Sizing</w:t>
+      </w:r>
+    </w:p>
+    <w:p>
+      <w:pPr>
+        <w:pStyle w:val="ListBullet"/>
+        <w:spacing w:before="20" w:after="20"/>
+      </w:pPr>
+      <w:r>
+        <w:rPr>
+          <w:sz w:val="20"/>
+        </w:rPr>
+        <w:t>Total Addressable Market (TAM): 75,000 BHWs × 12 antenatal screenings/BHW/month = ~900,000 screenings/month nationwide. At ₱150/avoided HemoCue cuvette, this represents ₱135M/month in quantifiable government cost avoidance at full national scale.</w:t>
+      </w:r>
+    </w:p>
+    <w:p>
+      <w:pPr>
+        <w:pStyle w:val="ListBullet"/>
+        <w:spacing w:before="20" w:after="20"/>
+      </w:pPr>
+      <w:r>
+        <w:rPr>
+          <w:sz w:val="20"/>
+        </w:rPr>
+        <w:t>Serviceable Addressable Market (SAM, Years 1–2): 5–10 GIDA municipalities in Northern Mindanao (1,500–3,000 BHWs, 18,000–36,000 screenings/month) acting as the primary regional evidence-building cohort.</w:t>
+      </w:r>
+    </w:p>
+    <w:p>
+      <w:pPr>
+        <w:spacing w:before="200" w:after="60"/>
+      </w:pPr>
+      <w:r>
+        <w:rPr>
+          <w:b/>
+          <w:color w:val="1B6B8A"/>
+          <w:sz w:val="23"/>
+        </w:rPr>
+        <w:t>Competitive Landscape &amp; Market Drivers</w:t>
+      </w:r>
+    </w:p>
+    <w:p>
+      <w:pPr>
+        <w:pStyle w:val="ListBullet"/>
+        <w:spacing w:before="20" w:after="20"/>
+      </w:pPr>
+      <w:r>
+        <w:rPr>
+          <w:sz w:val="20"/>
+        </w:rPr>
+        <w:t>HemoCue Hb 301: The analytical point-of-care gold standard, but limited by device capital cost (₱125,000) and cuvette stockouts. TinginHB acts as a pre-filter, reserving HemoCue cuvettes for high-probability cases.</w:t>
+      </w:r>
+    </w:p>
+    <w:p>
+      <w:pPr>
+        <w:pStyle w:val="ListBullet"/>
+        <w:spacing w:before="20" w:after="20"/>
+      </w:pPr>
+      <w:r>
+        <w:rPr>
+          <w:sz w:val="20"/>
+        </w:rPr>
+        <w:t>AnemoCheck (Sanguina, US): Consumer-focused, nail-only, melanin-sensitive, requires lab CBC calibration, and is unavailable in the Philippines.</w:t>
+      </w:r>
+    </w:p>
+    <w:p>
+      <w:pPr>
+        <w:pStyle w:val="ListBullet"/>
+        <w:spacing w:before="20" w:after="20"/>
+      </w:pPr>
+      <w:r>
+        <w:rPr>
+          <w:sz w:val="20"/>
+        </w:rPr>
+        <w:t>Regulatory &amp; Policy Tailwinds: DOH Digital Health Transformation Roadmap (2023–2028), Universal Health Care Act (RA 11223), and First 1,000 Days Law (RA 11148) mandate diagnostic coverage expansion to GIDAs.</w:t>
+      </w:r>
+    </w:p>
+    <w:p>
+      <w:pPr>
+        <w:spacing w:before="280" w:after="60"/>
+      </w:pPr>
+      <w:r>
+        <w:rPr>
+          <w:b/>
+          <w:color w:val="0E4D64"/>
+          <w:sz w:val="27"/>
+        </w:rPr>
+        <w:t>IX. OPERATIONS PLAN</w:t>
       </w:r>
     </w:p>
     <w:p>
@@ -2938,7 +3569,7 @@
           <w:i w:val="0"/>
           <w:sz w:val="20"/>
         </w:rPr>
-        <w:t>To bridge academic research and frontline public health deployment, TinginHB follows a structured 5-phase clinical validation and engineering roadmap:</w:t>
+        <w:t>TingínHB executes a structured 12-month research and deployment roadmap across five workstreams:</w:t>
       </w:r>
     </w:p>
     <w:p>
@@ -2966,25 +3597,30 @@
         <w:t xml:space="preserve">                         • Implement Huber loss &amp; Platt probability calibration (ECE ≤ 0.08)</w:t>
         <w:br/>
         <w:br/>
-        <w:t>[ Phase 3: Months 3–4 ]  Android Edge Integration &amp; Usability Testing</w:t>
+        <w:t>[ Phase 3: Months 3–5 ]  Android Edge Integration &amp; Usability Testing</w:t>
         <w:br/>
         <w:t xml:space="preserve">                         • TFLite quantization, offline PDF referral generation</w:t>
         <w:br/>
-        <w:t xml:space="preserve">                         • Usability trials with student BHW volunteers</w:t>
+        <w:t xml:space="preserve">                         • Co-design usability trials with student and rural BHW volunteers</w:t>
         <w:br/>
         <w:br/>
-        <w:t>[ Phase 4: Months 5–7 ]  Prospective Clinical Field Validation (STARD Compliant)</w:t>
+        <w:t>[ Phase 4: Months 5–8 ]  Prospective Clinical Field Validation (STARD Compliant)</w:t>
         <w:br/>
         <w:t xml:space="preserve">                         • Target n = 250 subjects at Cagayan de Oro RHUs</w:t>
         <w:br/>
-        <w:t xml:space="preserve">                         • Paired with laboratory automated CBC (Sysmex XN) within 2 hours</w:t>
+        <w:t xml:space="preserve">                         • Paired with laboratory automated CBC (Sysmex XN-550) within 2 hours</w:t>
         <w:br/>
         <w:t xml:space="preserve">                         • Primary Endpoint: AUROC ≥ 0.88 for Hb &lt; 10.0 g/dL</w:t>
         <w:br/>
         <w:br/>
-        <w:t>[ Phase 5: Months 8–9 ]  Regulatory Filing &amp; Academic Dissemination</w:t>
+        <w:t>[ Phase 5: Months 8–10]  PhilHealth Konsulta &amp; DOH Maternal Dashboard Linking</w:t>
         <w:br/>
-        <w:t xml:space="preserve">                         • File for FDA Philippine Medical Device Classification (Software)</w:t>
+        <w:t xml:space="preserve">                         • Cloud synchronization for municipal health officers</w:t>
+        <w:br/>
+        <w:br/>
+        <w:t>[ Phase 6: Months 10–12] Regulatory Filing &amp; Academic Dissemination</w:t>
+        <w:br/>
+        <w:t xml:space="preserve">                         • File for Philippine FDA Medical Device Classification (Software)</w:t>
         <w:br/>
         <w:t xml:space="preserve">                         • Submit manuscript to peer-reviewed digital health journal</w:t>
       </w:r>
@@ -3383,6 +4019,67 @@
     </w:p>
     <w:p>
       <w:pPr>
+        <w:spacing w:before="200" w:after="60"/>
+      </w:pPr>
+      <w:r>
+        <w:rPr>
+          <w:b/>
+          <w:color w:val="1B6B8A"/>
+          <w:sz w:val="23"/>
+        </w:rPr>
+        <w:t>Team Roles &amp; Responsibilities</w:t>
+      </w:r>
+    </w:p>
+    <w:p>
+      <w:pPr>
+        <w:pStyle w:val="ListBullet"/>
+        <w:spacing w:before="20" w:after="20"/>
+      </w:pPr>
+      <w:r>
+        <w:rPr>
+          <w:sz w:val="20"/>
+        </w:rPr>
+        <w:t>Rogelio Q. Mandamian III — Lead AI/ML Engineer: Model architecture, TFLite INT8 quantization, Monte Carlo Dropout uncertainty engine, dual-site Bayesian fusion.</w:t>
+      </w:r>
+    </w:p>
+    <w:p>
+      <w:pPr>
+        <w:pStyle w:val="ListBullet"/>
+        <w:spacing w:before="20" w:after="20"/>
+      </w:pPr>
+      <w:r>
+        <w:rPr>
+          <w:sz w:val="20"/>
+        </w:rPr>
+        <w:t>Kirsten Roise Moog — Mobile Application Developer: Flutter cross-platform UI, CameraX optical guided capture, offline SQLite patient registry, PhilHealth Konsulta PDF generation.</w:t>
+      </w:r>
+    </w:p>
+    <w:p>
+      <w:pPr>
+        <w:pStyle w:val="ListBullet"/>
+        <w:spacing w:before="20" w:after="20"/>
+      </w:pPr>
+      <w:r>
+        <w:rPr>
+          <w:sz w:val="20"/>
+        </w:rPr>
+        <w:t>[3rd Member — TBD] — Data Engineer &amp; Field Liaison: Dataset curation, BHW field training, clinical pilot coordination.</w:t>
+      </w:r>
+    </w:p>
+    <w:p>
+      <w:pPr>
+        <w:pStyle w:val="ListBullet"/>
+        <w:spacing w:before="20" w:after="20"/>
+      </w:pPr>
+      <w:r>
+        <w:rPr>
+          <w:sz w:val="20"/>
+        </w:rPr>
+        <w:t>[Faculty Mentor — TBD] — Research &amp; Clinical Adviser: Institutional endorsement, Ethics Review Committee (REC/IRB) supervision, hospital network liaison.</w:t>
+      </w:r>
+    </w:p>
+    <w:p>
+      <w:pPr>
         <w:spacing w:before="280" w:after="60"/>
       </w:pPr>
       <w:r>
@@ -3391,7 +4088,20 @@
           <w:color w:val="0E4D64"/>
           <w:sz w:val="27"/>
         </w:rPr>
-        <w:t>X. COMPETITIVE DIFFERENTIATION MATRIX</w:t>
+        <w:t>X. FINANCIAL REQUIREMENT</w:t>
+      </w:r>
+    </w:p>
+    <w:p>
+      <w:pPr>
+        <w:spacing w:before="40" w:after="80"/>
+        <w:jc w:val="both"/>
+      </w:pPr>
+      <w:r>
+        <w:rPr>
+          <w:i w:val="0"/>
+          <w:sz w:val="20"/>
+        </w:rPr>
+        <w:t>TingínHB requests ₱280,000 in seed capital to cover prototype finalization, Philippine clinical validation, and initial field pilot deployment. This constitutes a one-time development investment—subsequent deployments carry ₱0 per-device or per-screening cost:</w:t>
       </w:r>
     </w:p>
     <w:tbl>
@@ -3402,16 +4112,14 @@
         <w:tblLook w:firstColumn="1" w:firstRow="1" w:lastColumn="0" w:lastRow="0" w:noHBand="0" w:noVBand="1" w:val="04A0"/>
       </w:tblPr>
       <w:tblGrid>
-        <w:gridCol w:w="1881"/>
-        <w:gridCol w:w="1881"/>
-        <w:gridCol w:w="1881"/>
-        <w:gridCol w:w="1881"/>
-        <w:gridCol w:w="1881"/>
+        <w:gridCol w:w="3135"/>
+        <w:gridCol w:w="3135"/>
+        <w:gridCol w:w="3135"/>
       </w:tblGrid>
       <w:tr>
         <w:tc>
           <w:tcPr>
-            <w:tcW w:type="dxa" w:w="1984"/>
+            <w:tcW w:type="dxa" w:w="3685"/>
             <w:shd w:val="clear" w:color="auto" w:fill="0E4D64"/>
           </w:tcPr>
           <w:p>
@@ -3424,13 +4132,13 @@
                 <w:color w:val="FFFFFF"/>
                 <w:sz w:val="18"/>
               </w:rPr>
-              <w:t>Parameter</w:t>
+              <w:t>Budget Line Item</w:t>
             </w:r>
           </w:p>
         </w:tc>
         <w:tc>
           <w:tcPr>
-            <w:tcW w:type="dxa" w:w="2154"/>
+            <w:tcW w:type="dxa" w:w="1814"/>
             <w:shd w:val="clear" w:color="auto" w:fill="0E4D64"/>
           </w:tcPr>
           <w:p>
@@ -3443,13 +4151,13 @@
                 <w:color w:val="FFFFFF"/>
                 <w:sz w:val="18"/>
               </w:rPr>
-              <w:t>TinginHB (DataLunas)</w:t>
+              <w:t>Amount (PHP)</w:t>
             </w:r>
           </w:p>
         </w:tc>
         <w:tc>
           <w:tcPr>
-            <w:tcW w:type="dxa" w:w="1984"/>
+            <w:tcW w:type="dxa" w:w="4139"/>
             <w:shd w:val="clear" w:color="auto" w:fill="0E4D64"/>
           </w:tcPr>
           <w:p>
@@ -3462,45 +4170,7 @@
                 <w:color w:val="FFFFFF"/>
                 <w:sz w:val="18"/>
               </w:rPr>
-              <w:t>HemoCue Hb 301</w:t>
-            </w:r>
-          </w:p>
-        </w:tc>
-        <w:tc>
-          <w:tcPr>
-            <w:tcW w:type="dxa" w:w="1984"/>
-            <w:shd w:val="clear" w:color="auto" w:fill="0E4D64"/>
-          </w:tcPr>
-          <w:p>
-            <w:pPr>
-              <w:jc w:val="center"/>
-            </w:pPr>
-            <w:r>
-              <w:rPr>
-                <w:b/>
-                <w:color w:val="FFFFFF"/>
-                <w:sz w:val="18"/>
-              </w:rPr>
-              <w:t>AnemoCheck / Sanguina</w:t>
-            </w:r>
-          </w:p>
-        </w:tc>
-        <w:tc>
-          <w:tcPr>
-            <w:tcW w:type="dxa" w:w="1531"/>
-            <w:shd w:val="clear" w:color="auto" w:fill="0E4D64"/>
-          </w:tcPr>
-          <w:p>
-            <w:pPr>
-              <w:jc w:val="center"/>
-            </w:pPr>
-            <w:r>
-              <w:rPr>
-                <w:b/>
-                <w:color w:val="FFFFFF"/>
-                <w:sz w:val="18"/>
-              </w:rPr>
-              <w:t>Naked-Eye Pallor</w:t>
+              <w:t>Justification &amp; Milestone</w:t>
             </w:r>
           </w:p>
         </w:tc>
@@ -3508,7 +4178,7 @@
       <w:tr>
         <w:tc>
           <w:tcPr>
-            <w:tcW w:type="dxa" w:w="1984"/>
+            <w:tcW w:type="dxa" w:w="3685"/>
             <w:shd w:val="clear" w:color="auto" w:fill="FFFFFF"/>
           </w:tcPr>
           <w:p>
@@ -3516,13 +4186,13 @@
               <w:rPr>
                 <w:sz w:val="18"/>
               </w:rPr>
-              <w:t>Cost per Test</w:t>
+              <w:t>GPU Compute / Cloud Credits for AI Training</w:t>
             </w:r>
           </w:p>
         </w:tc>
         <w:tc>
           <w:tcPr>
-            <w:tcW w:type="dxa" w:w="2154"/>
+            <w:tcW w:type="dxa" w:w="1814"/>
             <w:shd w:val="clear" w:color="auto" w:fill="FFFFFF"/>
           </w:tcPr>
           <w:p>
@@ -3530,13 +4200,13 @@
               <w:rPr>
                 <w:sz w:val="18"/>
               </w:rPr>
-              <w:t>₱0 (Zero Consumables)</w:t>
+              <w:t>₱ 80,000</w:t>
             </w:r>
           </w:p>
         </w:tc>
         <w:tc>
           <w:tcPr>
-            <w:tcW w:type="dxa" w:w="1984"/>
+            <w:tcW w:type="dxa" w:w="4139"/>
             <w:shd w:val="clear" w:color="auto" w:fill="FFFFFF"/>
           </w:tcPr>
           <w:p>
@@ -3544,13 +4214,59 @@
               <w:rPr>
                 <w:sz w:val="18"/>
               </w:rPr>
-              <w:t>₱150 / cuvette</w:t>
+              <w:t>Model training, hyperparameter sweep, synthetic augmentation, INT8 quantization.</w:t>
+            </w:r>
+          </w:p>
+        </w:tc>
+      </w:tr>
+      <w:tr>
+        <w:tc>
+          <w:tcPr>
+            <w:tcW w:type="dxa" w:w="3685"/>
+            <w:shd w:val="clear" w:color="auto" w:fill="EAF4F8"/>
+          </w:tcPr>
+          <w:p>
+            <w:r>
+              <w:rPr>
+                <w:sz w:val="18"/>
+              </w:rPr>
+              <w:t>Mobile Test Devices (3× Low/Mid/High Tier)</w:t>
             </w:r>
           </w:p>
         </w:tc>
         <w:tc>
           <w:tcPr>
-            <w:tcW w:type="dxa" w:w="1984"/>
+            <w:tcW w:type="dxa" w:w="1814"/>
+            <w:shd w:val="clear" w:color="auto" w:fill="EAF4F8"/>
+          </w:tcPr>
+          <w:p>
+            <w:r>
+              <w:rPr>
+                <w:sz w:val="18"/>
+              </w:rPr>
+              <w:t>₱ 30,000</w:t>
+            </w:r>
+          </w:p>
+        </w:tc>
+        <w:tc>
+          <w:tcPr>
+            <w:tcW w:type="dxa" w:w="4139"/>
+            <w:shd w:val="clear" w:color="auto" w:fill="EAF4F8"/>
+          </w:tcPr>
+          <w:p>
+            <w:r>
+              <w:rPr>
+                <w:sz w:val="18"/>
+              </w:rPr>
+              <w:t>Cross-device camera sensor calibration, CameraX QA, low-end SoC latency testing.</w:t>
+            </w:r>
+          </w:p>
+        </w:tc>
+      </w:tr>
+      <w:tr>
+        <w:tc>
+          <w:tcPr>
+            <w:tcW w:type="dxa" w:w="3685"/>
             <w:shd w:val="clear" w:color="auto" w:fill="FFFFFF"/>
           </w:tcPr>
           <w:p>
@@ -3558,13 +4274,13 @@
               <w:rPr>
                 <w:sz w:val="18"/>
               </w:rPr>
-              <w:t>~$5 USD / test</w:t>
+              <w:t>Philippine Clinical Validation Study (n=250)</w:t>
             </w:r>
           </w:p>
         </w:tc>
         <w:tc>
           <w:tcPr>
-            <w:tcW w:type="dxa" w:w="1531"/>
+            <w:tcW w:type="dxa" w:w="1814"/>
             <w:shd w:val="clear" w:color="auto" w:fill="FFFFFF"/>
           </w:tcPr>
           <w:p>
@@ -3572,7 +4288,21 @@
               <w:rPr>
                 <w:sz w:val="18"/>
               </w:rPr>
-              <w:t>₱0</w:t>
+              <w:t>₱ 80,000</w:t>
+            </w:r>
+          </w:p>
+        </w:tc>
+        <w:tc>
+          <w:tcPr>
+            <w:tcW w:type="dxa" w:w="4139"/>
+            <w:shd w:val="clear" w:color="auto" w:fill="FFFFFF"/>
+          </w:tcPr>
+          <w:p>
+            <w:r>
+              <w:rPr>
+                <w:sz w:val="18"/>
+              </w:rPr>
+              <w:t>Paired Sysmex CBC testing fees, IRB review fees, travel to CDO health stations.</w:t>
             </w:r>
           </w:p>
         </w:tc>
@@ -3580,7 +4310,7 @@
       <w:tr>
         <w:tc>
           <w:tcPr>
-            <w:tcW w:type="dxa" w:w="1984"/>
+            <w:tcW w:type="dxa" w:w="3685"/>
             <w:shd w:val="clear" w:color="auto" w:fill="EAF4F8"/>
           </w:tcPr>
           <w:p>
@@ -3588,13 +4318,13 @@
               <w:rPr>
                 <w:sz w:val="18"/>
               </w:rPr>
-              <w:t>Device Hardware</w:t>
+              <w:t>App Development Tools &amp; PDF Deployment</w:t>
             </w:r>
           </w:p>
         </w:tc>
         <w:tc>
           <w:tcPr>
-            <w:tcW w:type="dxa" w:w="2154"/>
+            <w:tcW w:type="dxa" w:w="1814"/>
             <w:shd w:val="clear" w:color="auto" w:fill="EAF4F8"/>
           </w:tcPr>
           <w:p>
@@ -3602,13 +4332,13 @@
               <w:rPr>
                 <w:sz w:val="18"/>
               </w:rPr>
-              <w:t>₱0 (Existing Phone)</w:t>
+              <w:t>₱ 20,000</w:t>
             </w:r>
           </w:p>
         </w:tc>
         <w:tc>
           <w:tcPr>
-            <w:tcW w:type="dxa" w:w="1984"/>
+            <w:tcW w:type="dxa" w:w="4139"/>
             <w:shd w:val="clear" w:color="auto" w:fill="EAF4F8"/>
           </w:tcPr>
           <w:p>
@@ -3616,13 +4346,59 @@
               <w:rPr>
                 <w:sz w:val="18"/>
               </w:rPr>
-              <w:t>₱70,000–₱125,000</w:t>
+              <w:t>Flutter production build, offline SQLite encryption, PDF reporting libraries.</w:t>
+            </w:r>
+          </w:p>
+        </w:tc>
+      </w:tr>
+      <w:tr>
+        <w:tc>
+          <w:tcPr>
+            <w:tcW w:type="dxa" w:w="3685"/>
+            <w:shd w:val="clear" w:color="auto" w:fill="FFFFFF"/>
+          </w:tcPr>
+          <w:p>
+            <w:r>
+              <w:rPr>
+                <w:sz w:val="18"/>
+              </w:rPr>
+              <w:t>PFDA Regulatory Consultation &amp; SaMD Filing</w:t>
             </w:r>
           </w:p>
         </w:tc>
         <w:tc>
           <w:tcPr>
-            <w:tcW w:type="dxa" w:w="1984"/>
+            <w:tcW w:type="dxa" w:w="1814"/>
+            <w:shd w:val="clear" w:color="auto" w:fill="FFFFFF"/>
+          </w:tcPr>
+          <w:p>
+            <w:r>
+              <w:rPr>
+                <w:sz w:val="18"/>
+              </w:rPr>
+              <w:t>₱ 30,000</w:t>
+            </w:r>
+          </w:p>
+        </w:tc>
+        <w:tc>
+          <w:tcPr>
+            <w:tcW w:type="dxa" w:w="4139"/>
+            <w:shd w:val="clear" w:color="auto" w:fill="FFFFFF"/>
+          </w:tcPr>
+          <w:p>
+            <w:r>
+              <w:rPr>
+                <w:sz w:val="18"/>
+              </w:rPr>
+              <w:t>Class B Medical Device Software regulatory pre-assessment consultation.</w:t>
+            </w:r>
+          </w:p>
+        </w:tc>
+      </w:tr>
+      <w:tr>
+        <w:tc>
+          <w:tcPr>
+            <w:tcW w:type="dxa" w:w="3685"/>
             <w:shd w:val="clear" w:color="auto" w:fill="EAF4F8"/>
           </w:tcPr>
           <w:p>
@@ -3630,13 +4406,13 @@
               <w:rPr>
                 <w:sz w:val="18"/>
               </w:rPr>
-              <w:t>Existing Phone</w:t>
+              <w:t>BHW Training Materials &amp; Orientation Media</w:t>
             </w:r>
           </w:p>
         </w:tc>
         <w:tc>
           <w:tcPr>
-            <w:tcW w:type="dxa" w:w="1531"/>
+            <w:tcW w:type="dxa" w:w="1814"/>
             <w:shd w:val="clear" w:color="auto" w:fill="EAF4F8"/>
           </w:tcPr>
           <w:p>
@@ -3644,7 +4420,21 @@
               <w:rPr>
                 <w:sz w:val="18"/>
               </w:rPr>
-              <w:t>₱0</w:t>
+              <w:t>₱ 15,000</w:t>
+            </w:r>
+          </w:p>
+        </w:tc>
+        <w:tc>
+          <w:tcPr>
+            <w:tcW w:type="dxa" w:w="4139"/>
+            <w:shd w:val="clear" w:color="auto" w:fill="EAF4F8"/>
+          </w:tcPr>
+          <w:p>
+            <w:r>
+              <w:rPr>
+                <w:sz w:val="18"/>
+              </w:rPr>
+              <w:t>Laminated quick-start pocket guides, video orientation modules.</w:t>
             </w:r>
           </w:p>
         </w:tc>
@@ -3652,7 +4442,7 @@
       <w:tr>
         <w:tc>
           <w:tcPr>
-            <w:tcW w:type="dxa" w:w="1984"/>
+            <w:tcW w:type="dxa" w:w="3685"/>
             <w:shd w:val="clear" w:color="auto" w:fill="FFFFFF"/>
           </w:tcPr>
           <w:p>
@@ -3660,13 +4450,13 @@
               <w:rPr>
                 <w:sz w:val="18"/>
               </w:rPr>
-              <w:t>Lab Calibration</w:t>
+              <w:t>Contingency Buffer (10%)</w:t>
             </w:r>
           </w:p>
         </w:tc>
         <w:tc>
           <w:tcPr>
-            <w:tcW w:type="dxa" w:w="2154"/>
+            <w:tcW w:type="dxa" w:w="1814"/>
             <w:shd w:val="clear" w:color="auto" w:fill="FFFFFF"/>
           </w:tcPr>
           <w:p>
@@ -3674,13 +4464,13 @@
               <w:rPr>
                 <w:sz w:val="18"/>
               </w:rPr>
-              <w:t>Not Required</w:t>
+              <w:t>₱ 25,000</w:t>
             </w:r>
           </w:p>
         </w:tc>
         <w:tc>
           <w:tcPr>
-            <w:tcW w:type="dxa" w:w="1984"/>
+            <w:tcW w:type="dxa" w:w="4139"/>
             <w:shd w:val="clear" w:color="auto" w:fill="FFFFFF"/>
           </w:tcPr>
           <w:p>
@@ -3688,35 +4478,7 @@
               <w:rPr>
                 <w:sz w:val="18"/>
               </w:rPr>
-              <w:t>Factory Calibrated</w:t>
-            </w:r>
-          </w:p>
-        </w:tc>
-        <w:tc>
-          <w:tcPr>
-            <w:tcW w:type="dxa" w:w="1984"/>
-            <w:shd w:val="clear" w:color="auto" w:fill="FFFFFF"/>
-          </w:tcPr>
-          <w:p>
-            <w:r>
-              <w:rPr>
-                <w:sz w:val="18"/>
-              </w:rPr>
-              <w:t>Required (Prior CBC)</w:t>
-            </w:r>
-          </w:p>
-        </w:tc>
-        <w:tc>
-          <w:tcPr>
-            <w:tcW w:type="dxa" w:w="1531"/>
-            <w:shd w:val="clear" w:color="auto" w:fill="FFFFFF"/>
-          </w:tcPr>
-          <w:p>
-            <w:r>
-              <w:rPr>
-                <w:sz w:val="18"/>
-              </w:rPr>
-              <w:t>None</w:t>
+              <w:t>Unforeseen field logistics or technical adjustments.</w:t>
             </w:r>
           </w:p>
         </w:tc>
@@ -3724,7 +4486,7 @@
       <w:tr>
         <w:tc>
           <w:tcPr>
-            <w:tcW w:type="dxa" w:w="1984"/>
+            <w:tcW w:type="dxa" w:w="3685"/>
             <w:shd w:val="clear" w:color="auto" w:fill="EAF4F8"/>
           </w:tcPr>
           <w:p>
@@ -3732,13 +4494,13 @@
               <w:rPr>
                 <w:sz w:val="18"/>
               </w:rPr>
-              <w:t>Anatomical Sites</w:t>
+              <w:t>TOTAL SEED BUDGET</w:t>
             </w:r>
           </w:p>
         </w:tc>
         <w:tc>
           <w:tcPr>
-            <w:tcW w:type="dxa" w:w="2154"/>
+            <w:tcW w:type="dxa" w:w="1814"/>
             <w:shd w:val="clear" w:color="auto" w:fill="EAF4F8"/>
           </w:tcPr>
           <w:p>
@@ -3746,13 +4508,13 @@
               <w:rPr>
                 <w:sz w:val="18"/>
               </w:rPr>
-              <w:t>Dual: Conjunctiva + Nail</w:t>
+              <w:t>₱ 280,000</w:t>
             </w:r>
           </w:p>
         </w:tc>
         <w:tc>
           <w:tcPr>
-            <w:tcW w:type="dxa" w:w="1984"/>
+            <w:tcW w:type="dxa" w:w="4139"/>
             <w:shd w:val="clear" w:color="auto" w:fill="EAF4F8"/>
           </w:tcPr>
           <w:p>
@@ -3760,323 +4522,7 @@
               <w:rPr>
                 <w:sz w:val="18"/>
               </w:rPr>
-              <w:t>Blood (Fingerstick)</w:t>
-            </w:r>
-          </w:p>
-        </w:tc>
-        <w:tc>
-          <w:tcPr>
-            <w:tcW w:type="dxa" w:w="1984"/>
-            <w:shd w:val="clear" w:color="auto" w:fill="EAF4F8"/>
-          </w:tcPr>
-          <w:p>
-            <w:r>
-              <w:rPr>
-                <w:sz w:val="18"/>
-              </w:rPr>
-              <w:t>Nail Bed Only</w:t>
-            </w:r>
-          </w:p>
-        </w:tc>
-        <w:tc>
-          <w:tcPr>
-            <w:tcW w:type="dxa" w:w="1531"/>
-            <w:shd w:val="clear" w:color="auto" w:fill="EAF4F8"/>
-          </w:tcPr>
-          <w:p>
-            <w:r>
-              <w:rPr>
-                <w:sz w:val="18"/>
-              </w:rPr>
-              <w:t>Subjective / Variable</w:t>
-            </w:r>
-          </w:p>
-        </w:tc>
-      </w:tr>
-      <w:tr>
-        <w:tc>
-          <w:tcPr>
-            <w:tcW w:type="dxa" w:w="1984"/>
-            <w:shd w:val="clear" w:color="auto" w:fill="FFFFFF"/>
-          </w:tcPr>
-          <w:p>
-            <w:r>
-              <w:rPr>
-                <w:sz w:val="18"/>
-              </w:rPr>
-              <w:t>Skin Bias</w:t>
-            </w:r>
-          </w:p>
-        </w:tc>
-        <w:tc>
-          <w:tcPr>
-            <w:tcW w:type="dxa" w:w="2154"/>
-            <w:shd w:val="clear" w:color="auto" w:fill="FFFFFF"/>
-          </w:tcPr>
-          <w:p>
-            <w:r>
-              <w:rPr>
-                <w:sz w:val="18"/>
-              </w:rPr>
-              <w:t>Minimal (0-melanin eye)</w:t>
-            </w:r>
-          </w:p>
-        </w:tc>
-        <w:tc>
-          <w:tcPr>
-            <w:tcW w:type="dxa" w:w="1984"/>
-            <w:shd w:val="clear" w:color="auto" w:fill="FFFFFF"/>
-          </w:tcPr>
-          <w:p>
-            <w:r>
-              <w:rPr>
-                <w:sz w:val="18"/>
-              </w:rPr>
-              <w:t>None (Invasive)</w:t>
-            </w:r>
-          </w:p>
-        </w:tc>
-        <w:tc>
-          <w:tcPr>
-            <w:tcW w:type="dxa" w:w="1984"/>
-            <w:shd w:val="clear" w:color="auto" w:fill="FFFFFF"/>
-          </w:tcPr>
-          <w:p>
-            <w:r>
-              <w:rPr>
-                <w:sz w:val="18"/>
-              </w:rPr>
-              <w:t>High (Skin sensitive)</w:t>
-            </w:r>
-          </w:p>
-        </w:tc>
-        <w:tc>
-          <w:tcPr>
-            <w:tcW w:type="dxa" w:w="1531"/>
-            <w:shd w:val="clear" w:color="auto" w:fill="FFFFFF"/>
-          </w:tcPr>
-          <w:p>
-            <w:r>
-              <w:rPr>
-                <w:sz w:val="18"/>
-              </w:rPr>
-              <w:t>Severe</w:t>
-            </w:r>
-          </w:p>
-        </w:tc>
-      </w:tr>
-      <w:tr>
-        <w:tc>
-          <w:tcPr>
-            <w:tcW w:type="dxa" w:w="1984"/>
-            <w:shd w:val="clear" w:color="auto" w:fill="EAF4F8"/>
-          </w:tcPr>
-          <w:p>
-            <w:r>
-              <w:rPr>
-                <w:sz w:val="18"/>
-              </w:rPr>
-              <w:t>Output Type</w:t>
-            </w:r>
-          </w:p>
-        </w:tc>
-        <w:tc>
-          <w:tcPr>
-            <w:tcW w:type="dxa" w:w="2154"/>
-            <w:shd w:val="clear" w:color="auto" w:fill="EAF4F8"/>
-          </w:tcPr>
-          <w:p>
-            <w:r>
-              <w:rPr>
-                <w:sz w:val="18"/>
-              </w:rPr>
-              <w:t>Calibrated Probability</w:t>
-            </w:r>
-          </w:p>
-        </w:tc>
-        <w:tc>
-          <w:tcPr>
-            <w:tcW w:type="dxa" w:w="1984"/>
-            <w:shd w:val="clear" w:color="auto" w:fill="EAF4F8"/>
-          </w:tcPr>
-          <w:p>
-            <w:r>
-              <w:rPr>
-                <w:sz w:val="18"/>
-              </w:rPr>
-              <w:t>Absolute Hb (g/dL)</w:t>
-            </w:r>
-          </w:p>
-        </w:tc>
-        <w:tc>
-          <w:tcPr>
-            <w:tcW w:type="dxa" w:w="1984"/>
-            <w:shd w:val="clear" w:color="auto" w:fill="EAF4F8"/>
-          </w:tcPr>
-          <w:p>
-            <w:r>
-              <w:rPr>
-                <w:sz w:val="18"/>
-              </w:rPr>
-              <w:t>Continuous Hb (g/dL)</w:t>
-            </w:r>
-          </w:p>
-        </w:tc>
-        <w:tc>
-          <w:tcPr>
-            <w:tcW w:type="dxa" w:w="1531"/>
-            <w:shd w:val="clear" w:color="auto" w:fill="EAF4F8"/>
-          </w:tcPr>
-          <w:p>
-            <w:r>
-              <w:rPr>
-                <w:sz w:val="18"/>
-              </w:rPr>
-              <w:t>Subjective Guess</w:t>
-            </w:r>
-          </w:p>
-        </w:tc>
-      </w:tr>
-      <w:tr>
-        <w:tc>
-          <w:tcPr>
-            <w:tcW w:type="dxa" w:w="1984"/>
-            <w:shd w:val="clear" w:color="auto" w:fill="FFFFFF"/>
-          </w:tcPr>
-          <w:p>
-            <w:r>
-              <w:rPr>
-                <w:sz w:val="18"/>
-              </w:rPr>
-              <w:t>Offline Ready</w:t>
-            </w:r>
-          </w:p>
-        </w:tc>
-        <w:tc>
-          <w:tcPr>
-            <w:tcW w:type="dxa" w:w="2154"/>
-            <w:shd w:val="clear" w:color="auto" w:fill="FFFFFF"/>
-          </w:tcPr>
-          <w:p>
-            <w:r>
-              <w:rPr>
-                <w:sz w:val="18"/>
-              </w:rPr>
-              <w:t>100% Offline</w:t>
-            </w:r>
-          </w:p>
-        </w:tc>
-        <w:tc>
-          <w:tcPr>
-            <w:tcW w:type="dxa" w:w="1984"/>
-            <w:shd w:val="clear" w:color="auto" w:fill="FFFFFF"/>
-          </w:tcPr>
-          <w:p>
-            <w:r>
-              <w:rPr>
-                <w:sz w:val="18"/>
-              </w:rPr>
-              <w:t>100% Offline</w:t>
-            </w:r>
-          </w:p>
-        </w:tc>
-        <w:tc>
-          <w:tcPr>
-            <w:tcW w:type="dxa" w:w="1984"/>
-            <w:shd w:val="clear" w:color="auto" w:fill="FFFFFF"/>
-          </w:tcPr>
-          <w:p>
-            <w:r>
-              <w:rPr>
-                <w:sz w:val="18"/>
-              </w:rPr>
-              <w:t>Requires Cloud Sync</w:t>
-            </w:r>
-          </w:p>
-        </w:tc>
-        <w:tc>
-          <w:tcPr>
-            <w:tcW w:type="dxa" w:w="1531"/>
-            <w:shd w:val="clear" w:color="auto" w:fill="FFFFFF"/>
-          </w:tcPr>
-          <w:p>
-            <w:r>
-              <w:rPr>
-                <w:sz w:val="18"/>
-              </w:rPr>
-              <w:t>Offline</w:t>
-            </w:r>
-          </w:p>
-        </w:tc>
-      </w:tr>
-      <w:tr>
-        <w:tc>
-          <w:tcPr>
-            <w:tcW w:type="dxa" w:w="1984"/>
-            <w:shd w:val="clear" w:color="auto" w:fill="EAF4F8"/>
-          </w:tcPr>
-          <w:p>
-            <w:r>
-              <w:rPr>
-                <w:sz w:val="18"/>
-              </w:rPr>
-              <w:t>PhilHealth Aligned</w:t>
-            </w:r>
-          </w:p>
-        </w:tc>
-        <w:tc>
-          <w:tcPr>
-            <w:tcW w:type="dxa" w:w="2154"/>
-            <w:shd w:val="clear" w:color="auto" w:fill="EAF4F8"/>
-          </w:tcPr>
-          <w:p>
-            <w:r>
-              <w:rPr>
-                <w:sz w:val="18"/>
-              </w:rPr>
-              <w:t>Konsulta PDF Generated</w:t>
-            </w:r>
-          </w:p>
-        </w:tc>
-        <w:tc>
-          <w:tcPr>
-            <w:tcW w:type="dxa" w:w="1984"/>
-            <w:shd w:val="clear" w:color="auto" w:fill="EAF4F8"/>
-          </w:tcPr>
-          <w:p>
-            <w:r>
-              <w:rPr>
-                <w:sz w:val="18"/>
-              </w:rPr>
-              <w:t>None</w:t>
-            </w:r>
-          </w:p>
-        </w:tc>
-        <w:tc>
-          <w:tcPr>
-            <w:tcW w:type="dxa" w:w="1984"/>
-            <w:shd w:val="clear" w:color="auto" w:fill="EAF4F8"/>
-          </w:tcPr>
-          <w:p>
-            <w:r>
-              <w:rPr>
-                <w:sz w:val="18"/>
-              </w:rPr>
-              <w:t>None</w:t>
-            </w:r>
-          </w:p>
-        </w:tc>
-        <w:tc>
-          <w:tcPr>
-            <w:tcW w:type="dxa" w:w="1531"/>
-            <w:shd w:val="clear" w:color="auto" w:fill="EAF4F8"/>
-          </w:tcPr>
-          <w:p>
-            <w:r>
-              <w:rPr>
-                <w:sz w:val="18"/>
-              </w:rPr>
-              <w:t>Manual Paper Logs</w:t>
+              <w:t>Complete 12-Month Operational Milestone</w:t>
             </w:r>
           </w:p>
         </w:tc>
@@ -4085,28 +4531,63 @@
     <w:p/>
     <w:p>
       <w:pPr>
-        <w:spacing w:before="280" w:after="60"/>
+        <w:spacing w:before="200" w:after="60"/>
       </w:pPr>
       <w:r>
         <w:rPr>
           <w:b/>
-          <w:color w:val="0E4D64"/>
-          <w:sz w:val="27"/>
+          <w:color w:val="1B6B8A"/>
+          <w:sz w:val="23"/>
         </w:rPr>
-        <w:t>XI. CONCLUSION</w:t>
+        <w:t>Proposed Funding Sources</w:t>
       </w:r>
     </w:p>
     <w:p>
       <w:pPr>
-        <w:spacing w:before="40" w:after="80"/>
-        <w:jc w:val="both"/>
+        <w:pStyle w:val="ListBullet"/>
+        <w:spacing w:before="20" w:after="20"/>
       </w:pPr>
       <w:r>
         <w:rPr>
-          <w:i w:val="0"/>
           <w:sz w:val="20"/>
         </w:rPr>
-        <w:t>TinginHB demonstrates that responsible AI in healthcare is not about making unsubstantiated claims of replacing laboratory medicine, but about scientifically bounding algorithms to solve concrete frontline bottlenecks. By transforming entry-level smartphones into zero-consumable, dual-site triage tools with calibrated probabilistic outputs and dynamic missing-modality weighting, TinginHB empowers 200,000 Filipino Barangay Health Workers to detect severe maternal and infant anemia months before catastrophic clinical complications arise—turning every routine barangay visit into a life-saving health intervention.</w:t>
+        <w:t>PSC XI Award Prize — Primary seed capital for prototyping and initial testing.</w:t>
+      </w:r>
+    </w:p>
+    <w:p>
+      <w:pPr>
+        <w:pStyle w:val="ListBullet"/>
+        <w:spacing w:before="20" w:after="20"/>
+      </w:pPr>
+      <w:r>
+        <w:rPr>
+          <w:sz w:val="20"/>
+        </w:rPr>
+        <w:t>DICT Startup Grant Fund (SGF) — Second-tranche application post-PSC competition.</w:t>
+      </w:r>
+    </w:p>
+    <w:p>
+      <w:pPr>
+        <w:pStyle w:val="ListBullet"/>
+        <w:spacing w:before="20" w:after="20"/>
+      </w:pPr>
+      <w:r>
+        <w:rPr>
+          <w:sz w:val="20"/>
+        </w:rPr>
+        <w:t>USTP Research Grant / Technology Transfer Office — Institutional co-funding and facility access.</w:t>
+      </w:r>
+    </w:p>
+    <w:p>
+      <w:pPr>
+        <w:pStyle w:val="ListBullet"/>
+        <w:spacing w:before="20" w:after="20"/>
+      </w:pPr>
+      <w:r>
+        <w:rPr>
+          <w:sz w:val="20"/>
+        </w:rPr>
+        <w:t>DOST-PCHRD Small Grant for Health Innovation — Clinical field validation phase support.</w:t>
       </w:r>
     </w:p>
     <w:p>
@@ -4119,7 +4600,7 @@
           <w:color w:val="0E4D64"/>
           <w:sz w:val="27"/>
         </w:rPr>
-        <w:t>XII. REFERENCES &amp; ACADEMIC GROUNDING</w:t>
+        <w:t>XI. REFERENCES &amp; ACADEMIC GROUNDING</w:t>
       </w:r>
     </w:p>
     <w:p>
@@ -4155,7 +4636,7 @@
         <w:rPr>
           <w:sz w:val="17"/>
         </w:rPr>
-        <w:t>3. World Health Organization (2016). WHO recommendations on antenatal care for a positive pregnancy experience.</w:t>
+        <w:t>3. World Health Organization (2016). WHO recommendations on antenatal care for a positive pregnancy experience. WHO Guidelines Approved by the Guidelines Review Committee.</w:t>
       </w:r>
     </w:p>
     <w:p>
@@ -4167,7 +4648,7 @@
         <w:rPr>
           <w:sz w:val="17"/>
         </w:rPr>
-        <w:t>4. Strobach, R. S., et al. (1988). The value of the physical examination in diagnosing anemia. JAMA, 259(11), 1682–1685.</w:t>
+        <w:t>4. Strobach, R. S., Anderson, S. K., Doll, D. C., &amp; Ringenberg, Q. S. (1988). The value of the physical examination in diagnosing anemia. JAMA, 259(11), 1682–1685.</w:t>
       </w:r>
     </w:p>
     <w:p>
@@ -4179,7 +4660,7 @@
         <w:rPr>
           <w:sz w:val="17"/>
         </w:rPr>
-        <w:t>5. Kalter, H. D., et al. (1997). Evaluation of clinical signs to diagnose anaemia in Uganda and Bangladesh. Bulletin of the WHO, 75(Suppl 1), 103–111.</w:t>
+        <w:t>5. Kalter, H. D., Burnham, G., Kolstad, P. R., et al. (1997). Evaluation of clinical signs to diagnose anaemia in Uganda and Bangladesh. Bulletin of the WHO, 75(Suppl 1), 103–111.</w:t>
       </w:r>
     </w:p>
     <w:p>
@@ -4191,7 +4672,7 @@
         <w:rPr>
           <w:sz w:val="17"/>
         </w:rPr>
-        <w:t>6. Luby, S. P., et al. (1995). Using clinical signs to diagnose anaemia in African children. Bulletin of the WHO, 73(4), 477–482.</w:t>
+        <w:t>6. Luby, S. P., Kazembe, P. N., Redd, S. C., et al. (1995). Using clinical signs to diagnose anaemia in African children. Bulletin of the WHO, 73(4), 477–482.</w:t>
       </w:r>
     </w:p>
     <w:p>
@@ -4251,7 +4732,7 @@
         <w:rPr>
           <w:sz w:val="17"/>
         </w:rPr>
-        <w:t>11. Mannino, R. G., et al. (2018). Smartphone app for non-invasive detection of anemia using only patient-sourced photos. Nature Communications, 9(1), 4924.</w:t>
+        <w:t>11. Mannino, R. G., Myers, D. R., Tyburski, E. A., et al. (2018). Smartphone app for non-invasive detection of anemia using only patient-sourced photos. Nature Communications, 9(1), 4924.</w:t>
       </w:r>
     </w:p>
     <w:p>
@@ -4263,7 +4744,7 @@
         <w:rPr>
           <w:sz w:val="17"/>
         </w:rPr>
-        <w:t>12. Dimauro, G., et al. (2018). Ocular redness measurement in non-contact and non-invasive diagnoses of anaemia. Journal of Imaging, 4(8), 95.</w:t>
+        <w:t>12. Dimauro, G., Ciprandi, D., Deperte, F., et al. (2018). Ocular redness measurement in non-contact and non-invasive diagnoses of anaemia. Journal of Imaging, 4(8), 95.</w:t>
       </w:r>
     </w:p>
     <w:p>
@@ -4275,7 +4756,7 @@
         <w:rPr>
           <w:sz w:val="17"/>
         </w:rPr>
-        <w:t>13. Valles-Coral, M. A., et al. (2025). AnaeCare: Non-invasive anemia detection from smartphone images using multi-site pallor analysis. arXiv.</w:t>
+        <w:t>13. Valles-Coral, M. A., et al. (2025). AnaeCare: Non-invasive anemia detection from smartphone images using multi-site pallor analysis. arXiv:2503.XXXXX.</w:t>
       </w:r>
     </w:p>
     <w:p>
@@ -4299,7 +4780,7 @@
         <w:rPr>
           <w:sz w:val="17"/>
         </w:rPr>
-        <w:t>15. Huang, S. C., et al. (2020). Fusion of medical imaging and electronic health records using deep learning. npj Digital Medicine, 3(1), 136.</w:t>
+        <w:t>15. Huang, S. C., Pareek, A., Seyyedi, S., et al. (2020). Fusion of medical imaging and electronic health records using deep learning. npj Digital Medicine, 3(1), 136.</w:t>
       </w:r>
     </w:p>
     <w:p>
@@ -4323,7 +4804,7 @@
         <w:rPr>
           <w:sz w:val="17"/>
         </w:rPr>
-        <w:t>17. Platt, J. (1999). Probabilistic outputs for support vector machines and comparisons to regularized likelihood methods. Advances in Large Margin Classifiers.</w:t>
+        <w:t>17. Platt, J. (1999). Probabilistic outputs for support vector machines and comparisons to regularized likelihood methods. Advances in Large Margin Classifiers, 10(3), 61–74.</w:t>
       </w:r>
     </w:p>
     <w:p>

</xml_diff>

<commit_message>
feat(docs): embed 7 high-res publication figures directly into Concept Note docx and Google Docs
</commit_message>
<xml_diff>
--- a/docs/TinginHB_Revised_Concept_Note_PSCXI.docx
+++ b/docs/TinginHB_Revised_Concept_Note_PSCXI.docx
@@ -258,191 +258,88 @@
         <w:t>Naked-Eye Subjectivity: Over 200,000 BHWs rely on naked-eye physical pallor inspection under WHO IMCI protocols. Peer-reviewed clinical literature (Strobach et al., 1988, JAMA; Kalter et al., 1997, Bull WHO) proves naked-eye sensitivity is only 10% to 60%, with an inter-observer agreement kappa of only κ = 0.20–0.45 (poor to slight agreement).</w:t>
       </w:r>
     </w:p>
-    <w:tbl>
-      <w:tblPr>
-        <w:tblStyle w:val="TableGrid"/>
-        <w:tblW w:type="auto" w:w="0"/>
-        <w:jc w:val="center"/>
-        <w:tblLayout w:type="fixed"/>
-        <w:tblLook w:firstColumn="1" w:firstRow="1" w:lastColumn="0" w:lastRow="0" w:noHBand="0" w:noVBand="1" w:val="04A0"/>
-      </w:tblPr>
-      <w:tblGrid>
-        <w:gridCol w:w="9406"/>
-      </w:tblGrid>
-      <w:tr>
-        <w:tc>
-          <w:tcPr>
-            <w:tcW w:type="dxa" w:w="9071"/>
-            <w:shd w:val="clear" w:color="auto" w:fill="0E4D64"/>
-          </w:tcPr>
-          <w:p>
-            <w:pPr>
-              <w:spacing w:before="80" w:after="80"/>
-              <w:jc w:val="left"/>
-            </w:pPr>
-            <w:r>
-              <w:rPr>
-                <w:b/>
-                <w:color w:val="FFFFFF"/>
-                <w:sz w:val="19"/>
-              </w:rPr>
-              <w:t xml:space="preserve">  [FIGURE 1 PLACEHOLDER: PHILIPPINE MATERNAL ANEMIA &amp; PPH BURDEN]</w:t>
-            </w:r>
-          </w:p>
-        </w:tc>
-      </w:tr>
-      <w:tr>
-        <w:tc>
-          <w:tcPr>
-            <w:tcW w:type="dxa" w:w="9071"/>
-            <w:shd w:val="clear" w:color="auto" w:fill="F4F9FB"/>
-          </w:tcPr>
-          <w:p>
-            <w:pPr>
-              <w:spacing w:before="80" w:after="40"/>
-            </w:pPr>
-            <w:r>
-              <w:rPr>
-                <w:b/>
-                <w:color w:val="1B6B8A"/>
-                <w:sz w:val="18"/>
-              </w:rPr>
-              <w:t xml:space="preserve">Suggested Visual: </w:t>
-            </w:r>
-            <w:r>
-              <w:rPr>
-                <w:sz w:val="18"/>
-              </w:rPr>
-              <w:t>Infographic chart / map combining prevalence data, maternal mortality breakdown, and GIDA health access geography.</w:t>
-            </w:r>
-          </w:p>
-          <w:p>
-            <w:pPr>
-              <w:spacing w:before="20" w:after="20"/>
-              <w:ind w:left="283"/>
-            </w:pPr>
-            <w:r>
-              <w:rPr>
-                <w:b/>
-                <w:color w:val="2B8AAE"/>
-                <w:sz w:val="17"/>
-              </w:rPr>
-              <w:t xml:space="preserve">• </w:t>
-            </w:r>
-            <w:r>
-              <w:rPr>
-                <w:sz w:val="17"/>
-              </w:rPr>
-              <w:t>DOST-FNRI Anemia Prevalence: Bar chart highlighting 21.8% to 28.0% in pregnant women and 40%–45% in infants aged 6–11 months.</w:t>
-            </w:r>
-          </w:p>
-          <w:p>
-            <w:pPr>
-              <w:spacing w:before="20" w:after="20"/>
-              <w:ind w:left="283"/>
-            </w:pPr>
-            <w:r>
-              <w:rPr>
-                <w:b/>
-                <w:color w:val="2B8AAE"/>
-                <w:sz w:val="17"/>
-              </w:rPr>
-              <w:t xml:space="preserve">• </w:t>
-            </w:r>
-            <w:r>
-              <w:rPr>
-                <w:sz w:val="17"/>
-              </w:rPr>
-              <w:t>Philippine Maternal Mortality: Pie chart showing Postpartum Hemorrhage (PPH) causing ~30% of maternal deaths (~2,000+ deaths/yr), with a 4-fold risk multiplier in anemic mothers.</w:t>
-            </w:r>
-          </w:p>
-          <w:p>
-            <w:pPr>
-              <w:spacing w:before="20" w:after="20"/>
-              <w:ind w:left="283"/>
-            </w:pPr>
-            <w:r>
-              <w:rPr>
-                <w:b/>
-                <w:color w:val="2B8AAE"/>
-                <w:sz w:val="17"/>
-              </w:rPr>
-              <w:t xml:space="preserve">• </w:t>
-            </w:r>
-            <w:r>
-              <w:rPr>
-                <w:sz w:val="17"/>
-              </w:rPr>
-              <w:t>Geographic CBC Bottleneck: Accessibility map contrasting urban laboratory density (₱200–₱350 CBC) vs. rural GIDA barangays requiring 2–6 hours travel and ₱300–₱800 fare.</w:t>
-            </w:r>
-          </w:p>
-          <w:p>
-            <w:pPr>
-              <w:spacing w:before="20" w:after="20"/>
-              <w:ind w:left="283"/>
-            </w:pPr>
-            <w:r>
-              <w:rPr>
-                <w:b/>
-                <w:color w:val="2B8AAE"/>
-                <w:sz w:val="17"/>
-              </w:rPr>
-              <w:t xml:space="preserve">• </w:t>
-            </w:r>
-            <w:r>
-              <w:rPr>
-                <w:sz w:val="17"/>
-              </w:rPr>
-              <w:t>HemoCue Stockout Paradox: Comparison showing ₱70k–₱125k capital cost and ₱150/test cuvette vs. ₱0 consumable smartphone triage.</w:t>
-            </w:r>
-          </w:p>
-          <w:p>
-            <w:pPr>
-              <w:spacing w:before="80" w:after="40"/>
-            </w:pPr>
-            <w:r>
-              <w:rPr>
-                <w:b/>
-                <w:sz w:val="18"/>
-              </w:rPr>
-              <w:t xml:space="preserve">Caption: </w:t>
-            </w:r>
-            <w:r>
-              <w:rPr>
-                <w:i/>
-                <w:sz w:val="18"/>
-              </w:rPr>
-              <w:t>Figure 1. The Maternal Anemia and Diagnostic Desert in the Philippines.</w:t>
-            </w:r>
-          </w:p>
-          <w:p>
-            <w:pPr>
-              <w:spacing w:before="20" w:after="80"/>
-            </w:pPr>
-            <w:r>
-              <w:rPr>
-                <w:b/>
-                <w:color w:val="556677"/>
-                <w:sz w:val="17"/>
-              </w:rPr>
-              <w:t xml:space="preserve">Data Sources / Theoretical Grounding: </w:t>
-            </w:r>
-            <w:r>
-              <w:rPr>
-                <w:i/>
-                <w:color w:val="556677"/>
-                <w:sz w:val="17"/>
-              </w:rPr>
-              <w:t>DOST-FNRI Expanded National Nutrition Survey (2020); DOH Maternal Health Statistics; Philippine Statistics Authority (PSA) Vital Statistics.</w:t>
-            </w:r>
-          </w:p>
-        </w:tc>
-      </w:tr>
-    </w:tbl>
     <w:p>
       <w:pPr>
-        <w:spacing w:before="0" w:after="80"/>
+        <w:spacing w:before="160" w:after="60"/>
+        <w:jc w:val="center"/>
       </w:pPr>
+      <w:r>
+        <w:drawing>
+          <wp:inline xmlns:a="http://schemas.openxmlformats.org/drawingml/2006/main" xmlns:pic="http://schemas.openxmlformats.org/drawingml/2006/picture">
+            <wp:extent cx="5760000" cy="3376984"/>
+            <wp:docPr id="1" name="Picture 1"/>
+            <wp:cNvGraphicFramePr>
+              <a:graphicFrameLocks noChangeAspect="1"/>
+            </wp:cNvGraphicFramePr>
+            <a:graphic>
+              <a:graphicData uri="http://schemas.openxmlformats.org/drawingml/2006/picture">
+                <pic:pic>
+                  <pic:nvPicPr>
+                    <pic:cNvPr id="0" name="fig1_maternal_burden.png"/>
+                    <pic:cNvPicPr/>
+                  </pic:nvPicPr>
+                  <pic:blipFill>
+                    <a:blip r:embed="rId9"/>
+                    <a:stretch>
+                      <a:fillRect/>
+                    </a:stretch>
+                  </pic:blipFill>
+                  <pic:spPr>
+                    <a:xfrm>
+                      <a:off x="0" y="0"/>
+                      <a:ext cx="5760000" cy="3376984"/>
+                    </a:xfrm>
+                    <a:prstGeom prst="rect"/>
+                  </pic:spPr>
+                </pic:pic>
+              </a:graphicData>
+            </a:graphic>
+          </wp:inline>
+        </w:drawing>
+      </w:r>
+    </w:p>
+    <w:p>
+      <w:pPr>
+        <w:spacing w:before="40" w:after="40"/>
+        <w:jc w:val="center"/>
+      </w:pPr>
+      <w:r>
+        <w:rPr>
+          <w:b/>
+          <w:color w:val="0E4D64"/>
+          <w:sz w:val="18"/>
+        </w:rPr>
+        <w:t xml:space="preserve">Figure 1. Philippine Maternal Anemia &amp; Diagnostic Bottleneck. </w:t>
+      </w:r>
+      <w:r>
+        <w:rPr>
+          <w:i/>
+          <w:sz w:val="17"/>
+        </w:rPr>
+        <w:t>DOST-FNRI maternal/infant prevalence, PPH mortality burden (31.4% of deaths), GIDA diagnostic travel time vs. fare, and point-of-care screening economics.</w:t>
+      </w:r>
+    </w:p>
+    <w:p>
+      <w:pPr>
+        <w:spacing w:before="0" w:after="160"/>
+        <w:jc w:val="center"/>
+      </w:pPr>
+      <w:r>
+        <w:rPr>
+          <w:b/>
+          <w:color w:val="556677"/>
+          <w:sz w:val="16"/>
+        </w:rPr>
+        <w:t xml:space="preserve">Data Sources / Theoretical Grounding: </w:t>
+      </w:r>
+      <w:r>
+        <w:rPr>
+          <w:i/>
+          <w:color w:val="556677"/>
+          <w:sz w:val="16"/>
+        </w:rPr>
+        <w:t>DOST-FNRI Expanded National Nutrition Survey (2020); DOH Maternal Health Statistics; PSA Vital Statistics.</w:t>
+      </w:r>
     </w:p>
     <w:p>
       <w:pPr>
@@ -507,171 +404,88 @@
         <w:t>Secondary Site — Subungual Nail Bed: Visualizes the subungual capillary plexus through a uniform 0.5–0.8 mm translucent keratin plate, avoiding light scattering from skin calluses. Periungual skin melanin is computationally normalized using the Contrast Ratio (CR) formula: CR = (G_nail - G_skin) / (G_nail + G_skin) (Mannino et al., 2018).</w:t>
       </w:r>
     </w:p>
-    <w:tbl>
-      <w:tblPr>
-        <w:tblStyle w:val="TableGrid"/>
-        <w:tblW w:type="auto" w:w="0"/>
-        <w:jc w:val="center"/>
-        <w:tblLayout w:type="fixed"/>
-        <w:tblLook w:firstColumn="1" w:firstRow="1" w:lastColumn="0" w:lastRow="0" w:noHBand="0" w:noVBand="1" w:val="04A0"/>
-      </w:tblPr>
-      <w:tblGrid>
-        <w:gridCol w:w="9406"/>
-      </w:tblGrid>
-      <w:tr>
-        <w:tc>
-          <w:tcPr>
-            <w:tcW w:type="dxa" w:w="9071"/>
-            <w:shd w:val="clear" w:color="auto" w:fill="0E4D64"/>
-          </w:tcPr>
-          <w:p>
-            <w:pPr>
-              <w:spacing w:before="80" w:after="80"/>
-              <w:jc w:val="left"/>
-            </w:pPr>
-            <w:r>
-              <w:rPr>
-                <w:b/>
-                <w:color w:val="FFFFFF"/>
-                <w:sz w:val="19"/>
-              </w:rPr>
-              <w:t xml:space="preserve">  [FIGURE 2 PLACEHOLDER: MICROVASCULAR OPTICAL ANATOMY &amp; SPECTRAL ABSORPTION]</w:t>
-            </w:r>
-          </w:p>
-        </w:tc>
-      </w:tr>
-      <w:tr>
-        <w:tc>
-          <w:tcPr>
-            <w:tcW w:type="dxa" w:w="9071"/>
-            <w:shd w:val="clear" w:color="auto" w:fill="F4F9FB"/>
-          </w:tcPr>
-          <w:p>
-            <w:pPr>
-              <w:spacing w:before="80" w:after="40"/>
-            </w:pPr>
-            <w:r>
-              <w:rPr>
-                <w:b/>
-                <w:color w:val="1B6B8A"/>
-                <w:sz w:val="18"/>
-              </w:rPr>
-              <w:t xml:space="preserve">Suggested Visual: </w:t>
-            </w:r>
-            <w:r>
-              <w:rPr>
-                <w:sz w:val="18"/>
-              </w:rPr>
-              <w:t>Multi-panel optical physics diagram comparing conjunctiva and subungual nail bed signal paths.</w:t>
-            </w:r>
-          </w:p>
-          <w:p>
-            <w:pPr>
-              <w:spacing w:before="20" w:after="20"/>
-              <w:ind w:left="283"/>
-            </w:pPr>
-            <w:r>
-              <w:rPr>
-                <w:b/>
-                <w:color w:val="2B8AAE"/>
-                <w:sz w:val="17"/>
-              </w:rPr>
-              <w:t xml:space="preserve">• </w:t>
-            </w:r>
-            <w:r>
-              <w:rPr>
-                <w:sz w:val="17"/>
-              </w:rPr>
-              <w:t>Oxygenated Hemoglobin Absorption Curve: Spectral plot showing distinct extinction peaks at 540 nm and 576 nm within the green color spectrum.</w:t>
-            </w:r>
-          </w:p>
-          <w:p>
-            <w:pPr>
-              <w:spacing w:before="20" w:after="20"/>
-              <w:ind w:left="283"/>
-            </w:pPr>
-            <w:r>
-              <w:rPr>
-                <w:b/>
-                <w:color w:val="2B8AAE"/>
-                <w:sz w:val="17"/>
-              </w:rPr>
-              <w:t xml:space="preserve">• </w:t>
-            </w:r>
-            <w:r>
-              <w:rPr>
-                <w:sz w:val="17"/>
-              </w:rPr>
-              <w:t>Palpebral Conjunctiva Cross-Section: Microvascular diagram illustrating non-keratinized epithelium with zero melanocytes (Fitzpatrick I–VI invariance) and adjacent white sclera anchor.</w:t>
-            </w:r>
-          </w:p>
-          <w:p>
-            <w:pPr>
-              <w:spacing w:before="20" w:after="20"/>
-              <w:ind w:left="283"/>
-            </w:pPr>
-            <w:r>
-              <w:rPr>
-                <w:b/>
-                <w:color w:val="2B8AAE"/>
-                <w:sz w:val="17"/>
-              </w:rPr>
-              <w:t xml:space="preserve">• </w:t>
-            </w:r>
-            <w:r>
-              <w:rPr>
-                <w:sz w:val="17"/>
-              </w:rPr>
-              <w:t>Subungual Nail Bed Optical Transmission: Diagram showing 0.5–0.8 mm translucent keratin plate, subungual microvascular plexus, and periungual Contrast Ratio (CR) melanin subtraction zone.</w:t>
-            </w:r>
-          </w:p>
-          <w:p>
-            <w:pPr>
-              <w:spacing w:before="80" w:after="40"/>
-            </w:pPr>
-            <w:r>
-              <w:rPr>
-                <w:b/>
-                <w:sz w:val="18"/>
-              </w:rPr>
-              <w:t xml:space="preserve">Caption: </w:t>
-            </w:r>
-            <w:r>
-              <w:rPr>
-                <w:i/>
-                <w:sz w:val="18"/>
-              </w:rPr>
-              <w:t>Figure 2. Optical Transmission and Chromophore Absorption in Primary Anatomical Sites.</w:t>
-            </w:r>
-          </w:p>
-          <w:p>
-            <w:pPr>
-              <w:spacing w:before="20" w:after="80"/>
-            </w:pPr>
-            <w:r>
-              <w:rPr>
-                <w:b/>
-                <w:color w:val="556677"/>
-                <w:sz w:val="17"/>
-              </w:rPr>
-              <w:t xml:space="preserve">Data Sources / Theoretical Grounding: </w:t>
-            </w:r>
-            <w:r>
-              <w:rPr>
-                <w:i/>
-                <w:color w:val="556677"/>
-                <w:sz w:val="17"/>
-              </w:rPr>
-              <w:t>Prahl (1999); Kim et al. (2020, PNAS); Mannino et al. (2018, Nature Communications).</w:t>
-            </w:r>
-          </w:p>
-        </w:tc>
-      </w:tr>
-    </w:tbl>
     <w:p>
       <w:pPr>
-        <w:spacing w:before="0" w:after="80"/>
+        <w:spacing w:before="160" w:after="60"/>
+        <w:jc w:val="center"/>
       </w:pPr>
+      <w:r>
+        <w:drawing>
+          <wp:inline xmlns:a="http://schemas.openxmlformats.org/drawingml/2006/main" xmlns:pic="http://schemas.openxmlformats.org/drawingml/2006/picture">
+            <wp:extent cx="5760000" cy="3432919"/>
+            <wp:docPr id="2" name="Picture 2"/>
+            <wp:cNvGraphicFramePr>
+              <a:graphicFrameLocks noChangeAspect="1"/>
+            </wp:cNvGraphicFramePr>
+            <a:graphic>
+              <a:graphicData uri="http://schemas.openxmlformats.org/drawingml/2006/picture">
+                <pic:pic>
+                  <pic:nvPicPr>
+                    <pic:cNvPr id="0" name="fig2_optical_physics.png"/>
+                    <pic:cNvPicPr/>
+                  </pic:nvPicPr>
+                  <pic:blipFill>
+                    <a:blip r:embed="rId10"/>
+                    <a:stretch>
+                      <a:fillRect/>
+                    </a:stretch>
+                  </pic:blipFill>
+                  <pic:spPr>
+                    <a:xfrm>
+                      <a:off x="0" y="0"/>
+                      <a:ext cx="5760000" cy="3432919"/>
+                    </a:xfrm>
+                    <a:prstGeom prst="rect"/>
+                  </pic:spPr>
+                </pic:pic>
+              </a:graphicData>
+            </a:graphic>
+          </wp:inline>
+        </w:drawing>
+      </w:r>
+    </w:p>
+    <w:p>
+      <w:pPr>
+        <w:spacing w:before="40" w:after="40"/>
+        <w:jc w:val="center"/>
+      </w:pPr>
+      <w:r>
+        <w:rPr>
+          <w:b/>
+          <w:color w:val="0E4D64"/>
+          <w:sz w:val="18"/>
+        </w:rPr>
+        <w:t xml:space="preserve">Figure 2. Microvascular Optical Anatomy &amp; Spectral Absorption. </w:t>
+      </w:r>
+      <w:r>
+        <w:rPr>
+          <w:i/>
+          <w:sz w:val="17"/>
+        </w:rPr>
+        <w:t>Hemoglobin extinction spectrum with 540nm/576nm peaks in the green sensor band, zero-melanin conjunctival signal path with scleral white balance anchor, and keratin subungual nail bed with Contrast Ratio melanin subtraction.</w:t>
+      </w:r>
+    </w:p>
+    <w:p>
+      <w:pPr>
+        <w:spacing w:before="0" w:after="160"/>
+        <w:jc w:val="center"/>
+      </w:pPr>
+      <w:r>
+        <w:rPr>
+          <w:b/>
+          <w:color w:val="556677"/>
+          <w:sz w:val="16"/>
+        </w:rPr>
+        <w:t xml:space="preserve">Data Sources / Theoretical Grounding: </w:t>
+      </w:r>
+      <w:r>
+        <w:rPr>
+          <w:i/>
+          <w:color w:val="556677"/>
+          <w:sz w:val="16"/>
+        </w:rPr>
+        <w:t>Prahl (1999); Kim et al. (2020, PNAS); Mannino et al. (2018, Nature Communications).</w:t>
+      </w:r>
     </w:p>
     <w:p>
       <w:pPr>
@@ -747,191 +561,88 @@
         <w:t>Post-Hoc Probability Calibration: Maps continuous estimates into a calibrated posterior probability of moderate-to-severe anemia (Hb &lt; 10.0 g/dL) using Platt Scaling, maintaining Expected Calibration Error ECE ≤ 0.08.</w:t>
       </w:r>
     </w:p>
-    <w:tbl>
-      <w:tblPr>
-        <w:tblStyle w:val="TableGrid"/>
-        <w:tblW w:type="auto" w:w="0"/>
-        <w:jc w:val="center"/>
-        <w:tblLayout w:type="fixed"/>
-        <w:tblLook w:firstColumn="1" w:firstRow="1" w:lastColumn="0" w:lastRow="0" w:noHBand="0" w:noVBand="1" w:val="04A0"/>
-      </w:tblPr>
-      <w:tblGrid>
-        <w:gridCol w:w="9406"/>
-      </w:tblGrid>
-      <w:tr>
-        <w:tc>
-          <w:tcPr>
-            <w:tcW w:type="dxa" w:w="9071"/>
-            <w:shd w:val="clear" w:color="auto" w:fill="0E4D64"/>
-          </w:tcPr>
-          <w:p>
-            <w:pPr>
-              <w:spacing w:before="80" w:after="80"/>
-              <w:jc w:val="left"/>
-            </w:pPr>
-            <w:r>
-              <w:rPr>
-                <w:b/>
-                <w:color w:val="FFFFFF"/>
-                <w:sz w:val="19"/>
-              </w:rPr>
-              <w:t xml:space="preserve">  [FIGURE 3 PLACEHOLDER: END-TO-END EDGE-AI PIPELINE ARCHITECTURE]</w:t>
-            </w:r>
-          </w:p>
-        </w:tc>
-      </w:tr>
-      <w:tr>
-        <w:tc>
-          <w:tcPr>
-            <w:tcW w:type="dxa" w:w="9071"/>
-            <w:shd w:val="clear" w:color="auto" w:fill="F4F9FB"/>
-          </w:tcPr>
-          <w:p>
-            <w:pPr>
-              <w:spacing w:before="80" w:after="40"/>
-            </w:pPr>
-            <w:r>
-              <w:rPr>
-                <w:b/>
-                <w:color w:val="1B6B8A"/>
-                <w:sz w:val="18"/>
-              </w:rPr>
-              <w:t xml:space="preserve">Suggested Visual: </w:t>
-            </w:r>
-            <w:r>
-              <w:rPr>
-                <w:sz w:val="18"/>
-              </w:rPr>
-              <w:t>Neural network architecture schematic diagram illustrating offline edge inference.</w:t>
-            </w:r>
-          </w:p>
-          <w:p>
-            <w:pPr>
-              <w:spacing w:before="20" w:after="20"/>
-              <w:ind w:left="283"/>
-            </w:pPr>
-            <w:r>
-              <w:rPr>
-                <w:b/>
-                <w:color w:val="2B8AAE"/>
-                <w:sz w:val="17"/>
-              </w:rPr>
-              <w:t xml:space="preserve">• </w:t>
-            </w:r>
-            <w:r>
-              <w:rPr>
-                <w:sz w:val="17"/>
-              </w:rPr>
-              <w:t>Assisted Image Acquisition: Camera viewfinder with elliptical guide overlays and real-time Laplacian blur filtering.</w:t>
-            </w:r>
-          </w:p>
-          <w:p>
-            <w:pPr>
-              <w:spacing w:before="20" w:after="20"/>
-              <w:ind w:left="283"/>
-            </w:pPr>
-            <w:r>
-              <w:rPr>
-                <w:b/>
-                <w:color w:val="2B8AAE"/>
-                <w:sz w:val="17"/>
-              </w:rPr>
-              <w:t xml:space="preserve">• </w:t>
-            </w:r>
-            <w:r>
-              <w:rPr>
-                <w:sz w:val="17"/>
-              </w:rPr>
-              <w:t>Region of Interest Segmentation: YOLOv8n-seg (INT8, ~3.5 MB, 80ms) generating polygon masks for conjunctiva, sclera, and nail plate.</w:t>
-            </w:r>
-          </w:p>
-          <w:p>
-            <w:pPr>
-              <w:spacing w:before="20" w:after="20"/>
-              <w:ind w:left="283"/>
-            </w:pPr>
-            <w:r>
-              <w:rPr>
-                <w:b/>
-                <w:color w:val="2B8AAE"/>
-                <w:sz w:val="17"/>
-              </w:rPr>
-              <w:t xml:space="preserve">• </w:t>
-            </w:r>
-            <w:r>
-              <w:rPr>
-                <w:sz w:val="17"/>
-              </w:rPr>
-              <w:t>Dual-Branch Feature Extractor: Deep convolutional representations via MobileNetV3-Small (FP16, ~5.2 MB) parallel to 16 handcrafted colorimetric radiomics (Erythema Index, Pallor Index).</w:t>
-            </w:r>
-          </w:p>
-          <w:p>
-            <w:pPr>
-              <w:spacing w:before="20" w:after="20"/>
-              <w:ind w:left="283"/>
-            </w:pPr>
-            <w:r>
-              <w:rPr>
-                <w:b/>
-                <w:color w:val="2B8AAE"/>
-                <w:sz w:val="17"/>
-              </w:rPr>
-              <w:t xml:space="preserve">• </w:t>
-            </w:r>
-            <w:r>
-              <w:rPr>
-                <w:sz w:val="17"/>
-              </w:rPr>
-              <w:t>Bayesian Uncertainty Engine: Monte Carlo Dropout (N=50 stochastic passes) generating Gaussian parameters (ŷ ± σ) followed by Platt Scaling probability calibration.</w:t>
-            </w:r>
-          </w:p>
-          <w:p>
-            <w:pPr>
-              <w:spacing w:before="80" w:after="40"/>
-            </w:pPr>
-            <w:r>
-              <w:rPr>
-                <w:b/>
-                <w:sz w:val="18"/>
-              </w:rPr>
-              <w:t xml:space="preserve">Caption: </w:t>
-            </w:r>
-            <w:r>
-              <w:rPr>
-                <w:i/>
-                <w:sz w:val="18"/>
-              </w:rPr>
-              <w:t>Figure 3. Dual-Branch Deep Learning Pipeline and Bayesian Uncertainty Engine (&lt;10 MB runtime footprint).</w:t>
-            </w:r>
-          </w:p>
-          <w:p>
-            <w:pPr>
-              <w:spacing w:before="20" w:after="80"/>
-            </w:pPr>
-            <w:r>
-              <w:rPr>
-                <w:b/>
-                <w:color w:val="556677"/>
-                <w:sz w:val="17"/>
-              </w:rPr>
-              <w:t xml:space="preserve">Data Sources / Theoretical Grounding: </w:t>
-            </w:r>
-            <w:r>
-              <w:rPr>
-                <w:i/>
-                <w:color w:val="556677"/>
-                <w:sz w:val="17"/>
-              </w:rPr>
-              <w:t>Gal &amp; Ghahramani (2016, ICML); Platt (1999); TinginHB Edge Software Specification.</w:t>
-            </w:r>
-          </w:p>
-        </w:tc>
-      </w:tr>
-    </w:tbl>
     <w:p>
       <w:pPr>
-        <w:spacing w:before="0" w:after="80"/>
+        <w:spacing w:before="160" w:after="60"/>
+        <w:jc w:val="center"/>
       </w:pPr>
+      <w:r>
+        <w:drawing>
+          <wp:inline xmlns:a="http://schemas.openxmlformats.org/drawingml/2006/main" xmlns:pic="http://schemas.openxmlformats.org/drawingml/2006/picture">
+            <wp:extent cx="5760000" cy="3316547"/>
+            <wp:docPr id="3" name="Picture 3"/>
+            <wp:cNvGraphicFramePr>
+              <a:graphicFrameLocks noChangeAspect="1"/>
+            </wp:cNvGraphicFramePr>
+            <a:graphic>
+              <a:graphicData uri="http://schemas.openxmlformats.org/drawingml/2006/picture">
+                <pic:pic>
+                  <pic:nvPicPr>
+                    <pic:cNvPr id="0" name="fig3_edge_ai_pipeline.png"/>
+                    <pic:cNvPicPr/>
+                  </pic:nvPicPr>
+                  <pic:blipFill>
+                    <a:blip r:embed="rId11"/>
+                    <a:stretch>
+                      <a:fillRect/>
+                    </a:stretch>
+                  </pic:blipFill>
+                  <pic:spPr>
+                    <a:xfrm>
+                      <a:off x="0" y="0"/>
+                      <a:ext cx="5760000" cy="3316547"/>
+                    </a:xfrm>
+                    <a:prstGeom prst="rect"/>
+                  </pic:spPr>
+                </pic:pic>
+              </a:graphicData>
+            </a:graphic>
+          </wp:inline>
+        </w:drawing>
+      </w:r>
+    </w:p>
+    <w:p>
+      <w:pPr>
+        <w:spacing w:before="40" w:after="40"/>
+        <w:jc w:val="center"/>
+      </w:pPr>
+      <w:r>
+        <w:rPr>
+          <w:b/>
+          <w:color w:val="0E4D64"/>
+          <w:sz w:val="18"/>
+        </w:rPr>
+        <w:t xml:space="preserve">Figure 3. End-to-End Offline Edge-AI Inference Pipeline. </w:t>
+      </w:r>
+      <w:r>
+        <w:rPr>
+          <w:i/>
+          <w:sz w:val="17"/>
+        </w:rPr>
+        <w:t>Assisted capture QC, YOLOv8n-seg region segmentation, dual-branch deep and radiomic feature extraction, Monte Carlo Dropout uncertainty estimation, and calibrated WHO triage output (&lt;10 MB runtime footprint).</w:t>
+      </w:r>
+    </w:p>
+    <w:p>
+      <w:pPr>
+        <w:spacing w:before="0" w:after="160"/>
+        <w:jc w:val="center"/>
+      </w:pPr>
+      <w:r>
+        <w:rPr>
+          <w:b/>
+          <w:color w:val="556677"/>
+          <w:sz w:val="16"/>
+        </w:rPr>
+        <w:t xml:space="preserve">Data Sources / Theoretical Grounding: </w:t>
+      </w:r>
+      <w:r>
+        <w:rPr>
+          <w:i/>
+          <w:color w:val="556677"/>
+          <w:sz w:val="16"/>
+        </w:rPr>
+        <w:t>Gal &amp; Ghahramani (2016, ICML); Platt (1999); TinginHB Edge Software Specification.</w:t>
+      </w:r>
     </w:p>
     <w:p>
       <w:pPr>
@@ -956,7 +667,7 @@
           <w:i w:val="0"/>
           <w:sz w:val="20"/>
         </w:rPr>
-        <w:t>To ensure robustness when a child resists eyelid eversion or a BHW lacks a blood pressure cuff, TinginHB employs a dynamic multi-modal fusion architecture that gracefully handles missing inputs (Baltrusaitis et al., 2019; Huang et al., 2020):</w:t>
+        <w:t>To ensure robustness when an infant resists eyelid eversion or a BHW lacks a blood pressure cuff, TinginHB employs a dynamic multi-modal fusion architecture that gracefully handles missing inputs (Baltrusaitis et al., 2019; Huang et al., 2020):</w:t>
       </w:r>
     </w:p>
     <w:tbl>
@@ -1380,191 +1091,88 @@
         <w:t>• Discrepancy Gate: If |Eye - Nail| &gt; 2.0 g/dL, palmar crease scan is triggered to break ambiguity.</w:t>
       </w:r>
     </w:p>
-    <w:tbl>
-      <w:tblPr>
-        <w:tblStyle w:val="TableGrid"/>
-        <w:tblW w:type="auto" w:w="0"/>
-        <w:jc w:val="center"/>
-        <w:tblLayout w:type="fixed"/>
-        <w:tblLook w:firstColumn="1" w:firstRow="1" w:lastColumn="0" w:lastRow="0" w:noHBand="0" w:noVBand="1" w:val="04A0"/>
-      </w:tblPr>
-      <w:tblGrid>
-        <w:gridCol w:w="9406"/>
-      </w:tblGrid>
-      <w:tr>
-        <w:tc>
-          <w:tcPr>
-            <w:tcW w:type="dxa" w:w="9071"/>
-            <w:shd w:val="clear" w:color="auto" w:fill="0E4D64"/>
-          </w:tcPr>
-          <w:p>
-            <w:pPr>
-              <w:spacing w:before="80" w:after="80"/>
-              <w:jc w:val="left"/>
-            </w:pPr>
-            <w:r>
-              <w:rPr>
-                <w:b/>
-                <w:color w:val="FFFFFF"/>
-                <w:sz w:val="19"/>
-              </w:rPr>
-              <w:t xml:space="preserve">  [FIGURE 4 PLACEHOLDER: 5-MODALITY DECISION TREE &amp; MISSING MODALITY FLOWCHART]</w:t>
-            </w:r>
-          </w:p>
-        </w:tc>
-      </w:tr>
-      <w:tr>
-        <w:tc>
-          <w:tcPr>
-            <w:tcW w:type="dxa" w:w="9071"/>
-            <w:shd w:val="clear" w:color="auto" w:fill="F4F9FB"/>
-          </w:tcPr>
-          <w:p>
-            <w:pPr>
-              <w:spacing w:before="80" w:after="40"/>
-            </w:pPr>
-            <w:r>
-              <w:rPr>
-                <w:b/>
-                <w:color w:val="1B6B8A"/>
-                <w:sz w:val="18"/>
-              </w:rPr>
-              <w:t xml:space="preserve">Suggested Visual: </w:t>
-            </w:r>
-            <w:r>
-              <w:rPr>
-                <w:sz w:val="18"/>
-              </w:rPr>
-              <w:t>Decision flow diagram / workflow tree illustrating graceful degradation across clinical scenarios.</w:t>
-            </w:r>
-          </w:p>
-          <w:p>
-            <w:pPr>
-              <w:spacing w:before="20" w:after="20"/>
-              <w:ind w:left="283"/>
-            </w:pPr>
-            <w:r>
-              <w:rPr>
-                <w:b/>
-                <w:color w:val="2B8AAE"/>
-                <w:sz w:val="17"/>
-              </w:rPr>
-              <w:t xml:space="preserve">• </w:t>
-            </w:r>
-            <w:r>
-              <w:rPr>
-                <w:sz w:val="17"/>
-              </w:rPr>
-              <w:t>Modality Acquisition Gate: Simultaneous check for active inputs: Conjunctiva (35%), Nail Bed (25%), Patient Survey (15%), Palmar Creases (15%), BP / Pulse (10%).</w:t>
-            </w:r>
-          </w:p>
-          <w:p>
-            <w:pPr>
-              <w:spacing w:before="20" w:after="20"/>
-              <w:ind w:left="283"/>
-            </w:pPr>
-            <w:r>
-              <w:rPr>
-                <w:b/>
-                <w:color w:val="2B8AAE"/>
-                <w:sz w:val="17"/>
-              </w:rPr>
-              <w:t xml:space="preserve">• </w:t>
-            </w:r>
-            <w:r>
-              <w:rPr>
-                <w:sz w:val="17"/>
-              </w:rPr>
-              <w:t>Dynamic Weight Normalization Engine: Re-scaling formula w'_i = w_i / SUM(w_avail) adapting weights for Full Clinic (100%), Rapid Field Visit (75%), and Pediatric Fallback (55%).</w:t>
-            </w:r>
-          </w:p>
-          <w:p>
-            <w:pPr>
-              <w:spacing w:before="20" w:after="20"/>
-              <w:ind w:left="283"/>
-            </w:pPr>
-            <w:r>
-              <w:rPr>
-                <w:b/>
-                <w:color w:val="2B8AAE"/>
-                <w:sz w:val="17"/>
-              </w:rPr>
-              <w:t xml:space="preserve">• </w:t>
-            </w:r>
-            <w:r>
-              <w:rPr>
-                <w:sz w:val="17"/>
-              </w:rPr>
-              <w:t>Discrepancy &amp; Plausibility Checker: Automated check triggering palmar crease scan if |Eye - Nail| &gt; 2.0 g/dL to rule out unilateral conjunctival inflammation.</w:t>
-            </w:r>
-          </w:p>
-          <w:p>
-            <w:pPr>
-              <w:spacing w:before="20" w:after="20"/>
-              <w:ind w:left="283"/>
-            </w:pPr>
-            <w:r>
-              <w:rPr>
-                <w:b/>
-                <w:color w:val="2B8AAE"/>
-                <w:sz w:val="17"/>
-              </w:rPr>
-              <w:t xml:space="preserve">• </w:t>
-            </w:r>
-            <w:r>
-              <w:rPr>
-                <w:sz w:val="17"/>
-              </w:rPr>
-              <w:t>Bayesian Evidence Stacking: Likelihood ratio log-odds fusion yielding calibrated posterior probability mapped to 4-tier WHO Triage Action Protocols.</w:t>
-            </w:r>
-          </w:p>
-          <w:p>
-            <w:pPr>
-              <w:spacing w:before="80" w:after="40"/>
-            </w:pPr>
-            <w:r>
-              <w:rPr>
-                <w:b/>
-                <w:sz w:val="18"/>
-              </w:rPr>
-              <w:t xml:space="preserve">Caption: </w:t>
-            </w:r>
-            <w:r>
-              <w:rPr>
-                <w:i/>
-                <w:sz w:val="18"/>
-              </w:rPr>
-              <w:t>Figure 4. 5-Modality Dynamic Weighting Decision Tree and Missing-Modality Fallback Workflow.</w:t>
-            </w:r>
-          </w:p>
-          <w:p>
-            <w:pPr>
-              <w:spacing w:before="20" w:after="80"/>
-            </w:pPr>
-            <w:r>
-              <w:rPr>
-                <w:b/>
-                <w:color w:val="556677"/>
-                <w:sz w:val="17"/>
-              </w:rPr>
-              <w:t xml:space="preserve">Data Sources / Theoretical Grounding: </w:t>
-            </w:r>
-            <w:r>
-              <w:rPr>
-                <w:i/>
-                <w:color w:val="556677"/>
-                <w:sz w:val="17"/>
-              </w:rPr>
-              <w:t>Baltrusaitis et al. (2019, IEEE TPAMI); Huang et al. (2020, npj Digital Medicine); Strobach et al. (1988, JAMA).</w:t>
-            </w:r>
-          </w:p>
-        </w:tc>
-      </w:tr>
-    </w:tbl>
     <w:p>
       <w:pPr>
-        <w:spacing w:before="0" w:after="80"/>
+        <w:spacing w:before="160" w:after="60"/>
+        <w:jc w:val="center"/>
       </w:pPr>
+      <w:r>
+        <w:drawing>
+          <wp:inline xmlns:a="http://schemas.openxmlformats.org/drawingml/2006/main" xmlns:pic="http://schemas.openxmlformats.org/drawingml/2006/picture">
+            <wp:extent cx="5760000" cy="3985516"/>
+            <wp:docPr id="4" name="Picture 4"/>
+            <wp:cNvGraphicFramePr>
+              <a:graphicFrameLocks noChangeAspect="1"/>
+            </wp:cNvGraphicFramePr>
+            <a:graphic>
+              <a:graphicData uri="http://schemas.openxmlformats.org/drawingml/2006/picture">
+                <pic:pic>
+                  <pic:nvPicPr>
+                    <pic:cNvPr id="0" name="fig4_decision_tree.png"/>
+                    <pic:cNvPicPr/>
+                  </pic:nvPicPr>
+                  <pic:blipFill>
+                    <a:blip r:embed="rId12"/>
+                    <a:stretch>
+                      <a:fillRect/>
+                    </a:stretch>
+                  </pic:blipFill>
+                  <pic:spPr>
+                    <a:xfrm>
+                      <a:off x="0" y="0"/>
+                      <a:ext cx="5760000" cy="3985516"/>
+                    </a:xfrm>
+                    <a:prstGeom prst="rect"/>
+                  </pic:spPr>
+                </pic:pic>
+              </a:graphicData>
+            </a:graphic>
+          </wp:inline>
+        </w:drawing>
+      </w:r>
+    </w:p>
+    <w:p>
+      <w:pPr>
+        <w:spacing w:before="40" w:after="40"/>
+        <w:jc w:val="center"/>
+      </w:pPr>
+      <w:r>
+        <w:rPr>
+          <w:b/>
+          <w:color w:val="0E4D64"/>
+          <w:sz w:val="18"/>
+        </w:rPr>
+        <w:t xml:space="preserve">Figure 4. 5-Modality Dynamic Weighting &amp; Fallback Flowchart. </w:t>
+      </w:r>
+      <w:r>
+        <w:rPr>
+          <w:i/>
+          <w:sz w:val="17"/>
+        </w:rPr>
+        <w:t>Parallel acquisition across 5 modalities, dynamic weight re-normalization formula, discrepancy safety gate (|Eye - Nail| &gt; 2.0 g/dL triggering palmar scan), and Bayesian log-odds aggregation.</w:t>
+      </w:r>
+    </w:p>
+    <w:p>
+      <w:pPr>
+        <w:spacing w:before="0" w:after="160"/>
+        <w:jc w:val="center"/>
+      </w:pPr>
+      <w:r>
+        <w:rPr>
+          <w:b/>
+          <w:color w:val="556677"/>
+          <w:sz w:val="16"/>
+        </w:rPr>
+        <w:t xml:space="preserve">Data Sources / Theoretical Grounding: </w:t>
+      </w:r>
+      <w:r>
+        <w:rPr>
+          <w:i/>
+          <w:color w:val="556677"/>
+          <w:sz w:val="16"/>
+        </w:rPr>
+        <w:t>Baltrusaitis et al. (2019, IEEE TPAMI); Huang et al. (2020, npj Digital Medicine); Strobach et al. (1988, JAMA).</w:t>
+      </w:r>
     </w:p>
     <w:p>
       <w:pPr>
@@ -2973,191 +2581,88 @@
       </w:tr>
     </w:tbl>
     <w:p/>
-    <w:tbl>
-      <w:tblPr>
-        <w:tblStyle w:val="TableGrid"/>
-        <w:tblW w:type="auto" w:w="0"/>
-        <w:jc w:val="center"/>
-        <w:tblLayout w:type="fixed"/>
-        <w:tblLook w:firstColumn="1" w:firstRow="1" w:lastColumn="0" w:lastRow="0" w:noHBand="0" w:noVBand="1" w:val="04A0"/>
-      </w:tblPr>
-      <w:tblGrid>
-        <w:gridCol w:w="9406"/>
-      </w:tblGrid>
-      <w:tr>
-        <w:tc>
-          <w:tcPr>
-            <w:tcW w:type="dxa" w:w="9071"/>
-            <w:shd w:val="clear" w:color="auto" w:fill="0E4D64"/>
-          </w:tcPr>
-          <w:p>
-            <w:pPr>
-              <w:spacing w:before="80" w:after="80"/>
-              <w:jc w:val="left"/>
-            </w:pPr>
-            <w:r>
-              <w:rPr>
-                <w:b/>
-                <w:color w:val="FFFFFF"/>
-                <w:sz w:val="19"/>
-              </w:rPr>
-              <w:t xml:space="preserve">  [FIGURE 5 PLACEHOLDER: FRONTLINE BHW MOBILE APP UI &amp; REFERRAL PDF MOCKUP]</w:t>
-            </w:r>
-          </w:p>
-        </w:tc>
-      </w:tr>
-      <w:tr>
-        <w:tc>
-          <w:tcPr>
-            <w:tcW w:type="dxa" w:w="9071"/>
-            <w:shd w:val="clear" w:color="auto" w:fill="F4F9FB"/>
-          </w:tcPr>
-          <w:p>
-            <w:pPr>
-              <w:spacing w:before="80" w:after="40"/>
-            </w:pPr>
-            <w:r>
-              <w:rPr>
-                <w:b/>
-                <w:color w:val="1B6B8A"/>
-                <w:sz w:val="18"/>
-              </w:rPr>
-              <w:t xml:space="preserve">Suggested Visual: </w:t>
-            </w:r>
-            <w:r>
-              <w:rPr>
-                <w:sz w:val="18"/>
-              </w:rPr>
-              <w:t>High-fidelity 4-screen mobile user interface flow and printable referral document mockup.</w:t>
-            </w:r>
-          </w:p>
-          <w:p>
-            <w:pPr>
-              <w:spacing w:before="20" w:after="20"/>
-              <w:ind w:left="283"/>
-            </w:pPr>
-            <w:r>
-              <w:rPr>
-                <w:b/>
-                <w:color w:val="2B8AAE"/>
-                <w:sz w:val="17"/>
-              </w:rPr>
-              <w:t xml:space="preserve">• </w:t>
-            </w:r>
-            <w:r>
-              <w:rPr>
-                <w:sz w:val="17"/>
-              </w:rPr>
-              <w:t>Screen 1 (Assisted Capture): Viewfinder with green positioning guide, real-time focus validation, and auto-exposure lock.</w:t>
-            </w:r>
-          </w:p>
-          <w:p>
-            <w:pPr>
-              <w:spacing w:before="20" w:after="20"/>
-              <w:ind w:left="283"/>
-            </w:pPr>
-            <w:r>
-              <w:rPr>
-                <w:b/>
-                <w:color w:val="2B8AAE"/>
-                <w:sz w:val="17"/>
-              </w:rPr>
-              <w:t xml:space="preserve">• </w:t>
-            </w:r>
-            <w:r>
-              <w:rPr>
-                <w:sz w:val="17"/>
-              </w:rPr>
-              <w:t>Screen 2 (4-Tap Clinical Survey): Minimalist questionnaire for patient age, pregnancy trimester, and acute symptoms (dizziness/fatigue).</w:t>
-            </w:r>
-          </w:p>
-          <w:p>
-            <w:pPr>
-              <w:spacing w:before="20" w:after="20"/>
-              <w:ind w:left="283"/>
-            </w:pPr>
-            <w:r>
-              <w:rPr>
-                <w:b/>
-                <w:color w:val="2B8AAE"/>
-                <w:sz w:val="17"/>
-              </w:rPr>
-              <w:t xml:space="preserve">• </w:t>
-            </w:r>
-            <w:r>
-              <w:rPr>
-                <w:sz w:val="17"/>
-              </w:rPr>
-              <w:t>Screen 3 (Calibrated Triage Card): Actionable color-coded risk card displaying posterior probability band, clear Filipino/English directives, and auditory cues.</w:t>
-            </w:r>
-          </w:p>
-          <w:p>
-            <w:pPr>
-              <w:spacing w:before="20" w:after="20"/>
-              <w:ind w:left="283"/>
-            </w:pPr>
-            <w:r>
-              <w:rPr>
-                <w:b/>
-                <w:color w:val="2B8AAE"/>
-                <w:sz w:val="17"/>
-              </w:rPr>
-              <w:t xml:space="preserve">• </w:t>
-            </w:r>
-            <w:r>
-              <w:rPr>
-                <w:sz w:val="17"/>
-              </w:rPr>
-              <w:t>Screen 4 (PhilHealth Konsulta Referral Letter): Automated 1-page PDF referral form with patient metadata, observed clinical cues, risk tier, and QR verification code for RHU doctor.</w:t>
-            </w:r>
-          </w:p>
-          <w:p>
-            <w:pPr>
-              <w:spacing w:before="80" w:after="40"/>
-            </w:pPr>
-            <w:r>
-              <w:rPr>
-                <w:b/>
-                <w:sz w:val="18"/>
-              </w:rPr>
-              <w:t xml:space="preserve">Caption: </w:t>
-            </w:r>
-            <w:r>
-              <w:rPr>
-                <w:i/>
-                <w:sz w:val="18"/>
-              </w:rPr>
-              <w:t>Figure 5. TinginHB Frontline User Interface and Automated PhilHealth Konsulta Referral Workflow.</w:t>
-            </w:r>
-          </w:p>
-          <w:p>
-            <w:pPr>
-              <w:spacing w:before="20" w:after="80"/>
-            </w:pPr>
-            <w:r>
-              <w:rPr>
-                <w:b/>
-                <w:color w:val="556677"/>
-                <w:sz w:val="17"/>
-              </w:rPr>
-              <w:t xml:space="preserve">Data Sources / Theoretical Grounding: </w:t>
-            </w:r>
-            <w:r>
-              <w:rPr>
-                <w:i/>
-                <w:color w:val="556677"/>
-                <w:sz w:val="17"/>
-              </w:rPr>
-              <w:t>DOH Telemedicine Guidelines; PhilHealth Circular 2022-0005 (Konsulta Package).</w:t>
-            </w:r>
-          </w:p>
-        </w:tc>
-      </w:tr>
-    </w:tbl>
     <w:p>
       <w:pPr>
-        <w:spacing w:before="0" w:after="80"/>
+        <w:spacing w:before="160" w:after="60"/>
+        <w:jc w:val="center"/>
       </w:pPr>
+      <w:r>
+        <w:drawing>
+          <wp:inline xmlns:a="http://schemas.openxmlformats.org/drawingml/2006/main" xmlns:pic="http://schemas.openxmlformats.org/drawingml/2006/picture">
+            <wp:extent cx="5760000" cy="3470147"/>
+            <wp:docPr id="5" name="Picture 5"/>
+            <wp:cNvGraphicFramePr>
+              <a:graphicFrameLocks noChangeAspect="1"/>
+            </wp:cNvGraphicFramePr>
+            <a:graphic>
+              <a:graphicData uri="http://schemas.openxmlformats.org/drawingml/2006/picture">
+                <pic:pic>
+                  <pic:nvPicPr>
+                    <pic:cNvPr id="0" name="fig5_mobile_ui_mockup.png"/>
+                    <pic:cNvPicPr/>
+                  </pic:nvPicPr>
+                  <pic:blipFill>
+                    <a:blip r:embed="rId13"/>
+                    <a:stretch>
+                      <a:fillRect/>
+                    </a:stretch>
+                  </pic:blipFill>
+                  <pic:spPr>
+                    <a:xfrm>
+                      <a:off x="0" y="0"/>
+                      <a:ext cx="5760000" cy="3470147"/>
+                    </a:xfrm>
+                    <a:prstGeom prst="rect"/>
+                  </pic:spPr>
+                </pic:pic>
+              </a:graphicData>
+            </a:graphic>
+          </wp:inline>
+        </w:drawing>
+      </w:r>
+    </w:p>
+    <w:p>
+      <w:pPr>
+        <w:spacing w:before="40" w:after="40"/>
+        <w:jc w:val="center"/>
+      </w:pPr>
+      <w:r>
+        <w:rPr>
+          <w:b/>
+          <w:color w:val="0E4D64"/>
+          <w:sz w:val="18"/>
+        </w:rPr>
+        <w:t xml:space="preserve">Figure 5. Frontline BHW Mobile Interface &amp; Referral Slip. </w:t>
+      </w:r>
+      <w:r>
+        <w:rPr>
+          <w:i/>
+          <w:sz w:val="17"/>
+        </w:rPr>
+        <w:t>Assisted camera viewfinder with Laplacian focus validation, 4-tap clinical prior survey, calibrated traffic-light risk result card, and auto-generated 1-page PhilHealth Konsulta referral PDF with security QR verification.</w:t>
+      </w:r>
+    </w:p>
+    <w:p>
+      <w:pPr>
+        <w:spacing w:before="0" w:after="160"/>
+        <w:jc w:val="center"/>
+      </w:pPr>
+      <w:r>
+        <w:rPr>
+          <w:b/>
+          <w:color w:val="556677"/>
+          <w:sz w:val="16"/>
+        </w:rPr>
+        <w:t xml:space="preserve">Data Sources / Theoretical Grounding: </w:t>
+      </w:r>
+      <w:r>
+        <w:rPr>
+          <w:i/>
+          <w:color w:val="556677"/>
+          <w:sz w:val="16"/>
+        </w:rPr>
+        <w:t>DOH Telemedicine Guidelines; PhilHealth Circular 2022-0005 (Konsulta Package).</w:t>
+      </w:r>
     </w:p>
     <w:p>
       <w:pPr>
@@ -3625,397 +3130,171 @@
         <w:t xml:space="preserve">                         • Submit manuscript to peer-reviewed digital health journal</w:t>
       </w:r>
     </w:p>
-    <w:tbl>
-      <w:tblPr>
-        <w:tblStyle w:val="TableGrid"/>
-        <w:tblW w:type="auto" w:w="0"/>
-        <w:jc w:val="center"/>
-        <w:tblLayout w:type="fixed"/>
-        <w:tblLook w:firstColumn="1" w:firstRow="1" w:lastColumn="0" w:lastRow="0" w:noHBand="0" w:noVBand="1" w:val="04A0"/>
-      </w:tblPr>
-      <w:tblGrid>
-        <w:gridCol w:w="9406"/>
-      </w:tblGrid>
-      <w:tr>
-        <w:tc>
-          <w:tcPr>
-            <w:tcW w:type="dxa" w:w="9071"/>
-            <w:shd w:val="clear" w:color="auto" w:fill="0E4D64"/>
-          </w:tcPr>
-          <w:p>
-            <w:pPr>
-              <w:spacing w:before="80" w:after="80"/>
-              <w:jc w:val="left"/>
-            </w:pPr>
-            <w:r>
-              <w:rPr>
-                <w:b/>
-                <w:color w:val="FFFFFF"/>
-                <w:sz w:val="19"/>
-              </w:rPr>
-              <w:t xml:space="preserve">  [FIGURE 6 PLACEHOLDER: PROSPECTIVE CLINICAL VALIDATION DESIGN &amp; ROC CURVE]</w:t>
-            </w:r>
-          </w:p>
-        </w:tc>
-      </w:tr>
-      <w:tr>
-        <w:tc>
-          <w:tcPr>
-            <w:tcW w:type="dxa" w:w="9071"/>
-            <w:shd w:val="clear" w:color="auto" w:fill="F4F9FB"/>
-          </w:tcPr>
-          <w:p>
-            <w:pPr>
-              <w:spacing w:before="80" w:after="40"/>
-            </w:pPr>
-            <w:r>
-              <w:rPr>
-                <w:b/>
-                <w:color w:val="1B6B8A"/>
-                <w:sz w:val="18"/>
-              </w:rPr>
-              <w:t xml:space="preserve">Suggested Visual: </w:t>
-            </w:r>
-            <w:r>
-              <w:rPr>
-                <w:sz w:val="18"/>
-              </w:rPr>
-              <w:t>Dual-panel clinical validation methodology schema and target diagnostic performance curve.</w:t>
-            </w:r>
-          </w:p>
-          <w:p>
-            <w:pPr>
-              <w:spacing w:before="20" w:after="20"/>
-              <w:ind w:left="283"/>
-            </w:pPr>
-            <w:r>
-              <w:rPr>
-                <w:b/>
-                <w:color w:val="2B8AAE"/>
-                <w:sz w:val="17"/>
-              </w:rPr>
-              <w:t xml:space="preserve">• </w:t>
-            </w:r>
-            <w:r>
-              <w:rPr>
-                <w:sz w:val="17"/>
-              </w:rPr>
-              <w:t>STARD Study Flowchart: Prospective recruitment schema of N=250 subjects at Cagayan de Oro City Health Centers (100 pregnant women, 75 infants/children, 75 general adults).</w:t>
-            </w:r>
-          </w:p>
-          <w:p>
-            <w:pPr>
-              <w:spacing w:before="20" w:after="20"/>
-              <w:ind w:left="283"/>
-            </w:pPr>
-            <w:r>
-              <w:rPr>
-                <w:b/>
-                <w:color w:val="2B8AAE"/>
-                <w:sz w:val="17"/>
-              </w:rPr>
-              <w:t xml:space="preserve">• </w:t>
-            </w:r>
-            <w:r>
-              <w:rPr>
-                <w:sz w:val="17"/>
-              </w:rPr>
-              <w:t>Paired Reference Testing: Double-blinded evaluation between non-invasive TinginHB index test and automated venous complete blood count (Sysmex XN-550) within a 2-hour window.</w:t>
-            </w:r>
-          </w:p>
-          <w:p>
-            <w:pPr>
-              <w:spacing w:before="20" w:after="20"/>
-              <w:ind w:left="283"/>
-            </w:pPr>
-            <w:r>
-              <w:rPr>
-                <w:b/>
-                <w:color w:val="2B8AAE"/>
-                <w:sz w:val="17"/>
-              </w:rPr>
-              <w:t xml:space="preserve">• </w:t>
-            </w:r>
-            <w:r>
-              <w:rPr>
-                <w:sz w:val="17"/>
-              </w:rPr>
-              <w:t>Target ROC / AUROC Curves: Expected Receiver Operating Characteristic curve displaying target AUROC &gt;= 0.88 for moderate-to-severe anemia (Hb &lt; 10.0 g/dL), with Sensitivity &gt;= 85% and Specificity &gt;= 80%.</w:t>
-            </w:r>
-          </w:p>
-          <w:p>
-            <w:pPr>
-              <w:spacing w:before="80" w:after="40"/>
-            </w:pPr>
-            <w:r>
-              <w:rPr>
-                <w:b/>
-                <w:sz w:val="18"/>
-              </w:rPr>
-              <w:t xml:space="preserve">Caption: </w:t>
-            </w:r>
-            <w:r>
-              <w:rPr>
-                <w:i/>
-                <w:sz w:val="18"/>
-              </w:rPr>
-              <w:t>Figure 6. Prospective Clinical Field Validation Design (STARD Compliant) and Expected ROC Diagnostic Curves.</w:t>
-            </w:r>
-          </w:p>
-          <w:p>
-            <w:pPr>
-              <w:spacing w:before="20" w:after="80"/>
-            </w:pPr>
-            <w:r>
-              <w:rPr>
-                <w:b/>
-                <w:color w:val="556677"/>
-                <w:sz w:val="17"/>
-              </w:rPr>
-              <w:t xml:space="preserve">Data Sources / Theoretical Grounding: </w:t>
-            </w:r>
-            <w:r>
-              <w:rPr>
-                <w:i/>
-                <w:color w:val="556677"/>
-                <w:sz w:val="17"/>
-              </w:rPr>
-              <w:t>Bossuyt et al. (2015, STARD 2015); Kim et al. (2020, PNAS); Mannino et al. (2018).</w:t>
-            </w:r>
-          </w:p>
-        </w:tc>
-      </w:tr>
-    </w:tbl>
     <w:p>
       <w:pPr>
-        <w:spacing w:before="0" w:after="80"/>
+        <w:spacing w:before="160" w:after="60"/>
+        <w:jc w:val="center"/>
       </w:pPr>
+      <w:r>
+        <w:drawing>
+          <wp:inline xmlns:a="http://schemas.openxmlformats.org/drawingml/2006/main" xmlns:pic="http://schemas.openxmlformats.org/drawingml/2006/picture">
+            <wp:extent cx="5760000" cy="3464930"/>
+            <wp:docPr id="6" name="Picture 6"/>
+            <wp:cNvGraphicFramePr>
+              <a:graphicFrameLocks noChangeAspect="1"/>
+            </wp:cNvGraphicFramePr>
+            <a:graphic>
+              <a:graphicData uri="http://schemas.openxmlformats.org/drawingml/2006/picture">
+                <pic:pic>
+                  <pic:nvPicPr>
+                    <pic:cNvPr id="0" name="fig6_clinical_validation_roc.png"/>
+                    <pic:cNvPicPr/>
+                  </pic:nvPicPr>
+                  <pic:blipFill>
+                    <a:blip r:embed="rId14"/>
+                    <a:stretch>
+                      <a:fillRect/>
+                    </a:stretch>
+                  </pic:blipFill>
+                  <pic:spPr>
+                    <a:xfrm>
+                      <a:off x="0" y="0"/>
+                      <a:ext cx="5760000" cy="3464930"/>
+                    </a:xfrm>
+                    <a:prstGeom prst="rect"/>
+                  </pic:spPr>
+                </pic:pic>
+              </a:graphicData>
+            </a:graphic>
+          </wp:inline>
+        </w:drawing>
+      </w:r>
     </w:p>
-    <w:tbl>
-      <w:tblPr>
-        <w:tblStyle w:val="TableGrid"/>
-        <w:tblW w:type="auto" w:w="0"/>
-        <w:jc w:val="center"/>
-        <w:tblLayout w:type="fixed"/>
-        <w:tblLook w:firstColumn="1" w:firstRow="1" w:lastColumn="0" w:lastRow="0" w:noHBand="0" w:noVBand="1" w:val="04A0"/>
-      </w:tblPr>
-      <w:tblGrid>
-        <w:gridCol w:w="9406"/>
-      </w:tblGrid>
-      <w:tr>
-        <w:tc>
-          <w:tcPr>
-            <w:tcW w:type="dxa" w:w="9071"/>
-            <w:shd w:val="clear" w:color="auto" w:fill="0E4D64"/>
-          </w:tcPr>
-          <w:p>
-            <w:pPr>
-              <w:spacing w:before="80" w:after="80"/>
-              <w:jc w:val="left"/>
-            </w:pPr>
-            <w:r>
-              <w:rPr>
-                <w:b/>
-                <w:color w:val="FFFFFF"/>
-                <w:sz w:val="19"/>
-              </w:rPr>
-              <w:t xml:space="preserve">  [FIGURE 7 PLACEHOLDER: 12-MONTH RESEARCH &amp; PRODUCT ROADMAP GANTT CHART]</w:t>
-            </w:r>
-          </w:p>
-        </w:tc>
-      </w:tr>
-      <w:tr>
-        <w:tc>
-          <w:tcPr>
-            <w:tcW w:type="dxa" w:w="9071"/>
-            <w:shd w:val="clear" w:color="auto" w:fill="F4F9FB"/>
-          </w:tcPr>
-          <w:p>
-            <w:pPr>
-              <w:spacing w:before="80" w:after="40"/>
-            </w:pPr>
-            <w:r>
-              <w:rPr>
-                <w:b/>
-                <w:color w:val="1B6B8A"/>
-                <w:sz w:val="18"/>
-              </w:rPr>
-              <w:t xml:space="preserve">Suggested Visual: </w:t>
-            </w:r>
-            <w:r>
-              <w:rPr>
-                <w:sz w:val="18"/>
-              </w:rPr>
-              <w:t>Horizontal Gantt Chart timeline spanning Months 1 through 12 across 5 core development workstreams.</w:t>
-            </w:r>
-          </w:p>
-          <w:p>
-            <w:pPr>
-              <w:spacing w:before="20" w:after="20"/>
-              <w:ind w:left="283"/>
-            </w:pPr>
-            <w:r>
-              <w:rPr>
-                <w:b/>
-                <w:color w:val="2B8AAE"/>
-                <w:sz w:val="17"/>
-              </w:rPr>
-              <w:t xml:space="preserve">• </w:t>
-            </w:r>
-            <w:r>
-              <w:rPr>
-                <w:sz w:val="17"/>
-              </w:rPr>
-              <w:t>Workstream 1 (Months 1–2): Dataset Curation &amp; Synthetic Augmentation (Ghana &amp; Peru cohorts, YOLOv8n-seg models).</w:t>
-            </w:r>
-          </w:p>
-          <w:p>
-            <w:pPr>
-              <w:spacing w:before="20" w:after="20"/>
-              <w:ind w:left="283"/>
-            </w:pPr>
-            <w:r>
-              <w:rPr>
-                <w:b/>
-                <w:color w:val="2B8AAE"/>
-                <w:sz w:val="17"/>
-              </w:rPr>
-              <w:t xml:space="preserve">• </w:t>
-            </w:r>
-            <w:r>
-              <w:rPr>
-                <w:sz w:val="17"/>
-              </w:rPr>
-              <w:t>Workstream 2 (Months 2–3): Dual-Branch Model Training &amp; MC Dropout (MobileNetV3-S + radiomics, Platt calibration ECE &lt;= 0.08).</w:t>
-            </w:r>
-          </w:p>
-          <w:p>
-            <w:pPr>
-              <w:spacing w:before="20" w:after="20"/>
-              <w:ind w:left="283"/>
-            </w:pPr>
-            <w:r>
-              <w:rPr>
-                <w:b/>
-                <w:color w:val="2B8AAE"/>
-                <w:sz w:val="17"/>
-              </w:rPr>
-              <w:t xml:space="preserve">• </w:t>
-            </w:r>
-            <w:r>
-              <w:rPr>
-                <w:sz w:val="17"/>
-              </w:rPr>
-              <w:t>Workstream 3 (Months 3–5): Android Edge App Development &amp; Usability Testing (quantized TFLite, BHW co-design).</w:t>
-            </w:r>
-          </w:p>
-          <w:p>
-            <w:pPr>
-              <w:spacing w:before="20" w:after="20"/>
-              <w:ind w:left="283"/>
-            </w:pPr>
-            <w:r>
-              <w:rPr>
-                <w:b/>
-                <w:color w:val="2B8AAE"/>
-                <w:sz w:val="17"/>
-              </w:rPr>
-              <w:t xml:space="preserve">• </w:t>
-            </w:r>
-            <w:r>
-              <w:rPr>
-                <w:sz w:val="17"/>
-              </w:rPr>
-              <w:t>Workstream 4 (Months 5–8): Prospective Clinical Trials (N=250) in Cagayan de Oro RHUs with Ethics Review Board (REC/IRB) approval.</w:t>
-            </w:r>
-          </w:p>
-          <w:p>
-            <w:pPr>
-              <w:spacing w:before="20" w:after="20"/>
-              <w:ind w:left="283"/>
-            </w:pPr>
-            <w:r>
-              <w:rPr>
-                <w:b/>
-                <w:color w:val="2B8AAE"/>
-                <w:sz w:val="17"/>
-              </w:rPr>
-              <w:t xml:space="preserve">• </w:t>
-            </w:r>
-            <w:r>
-              <w:rPr>
-                <w:sz w:val="17"/>
-              </w:rPr>
-              <w:t>Workstream 5 (Months 8–10): DOH Maternal Dashboard &amp; PhilHealth Konsulta API Integration.</w:t>
-            </w:r>
-          </w:p>
-          <w:p>
-            <w:pPr>
-              <w:spacing w:before="20" w:after="20"/>
-              <w:ind w:left="283"/>
-            </w:pPr>
-            <w:r>
-              <w:rPr>
-                <w:b/>
-                <w:color w:val="2B8AAE"/>
-                <w:sz w:val="17"/>
-              </w:rPr>
-              <w:t xml:space="preserve">• </w:t>
-            </w:r>
-            <w:r>
-              <w:rPr>
-                <w:sz w:val="17"/>
-              </w:rPr>
-              <w:t>Workstream 6 (Months 10–12): Philippine FDA Class B Medical Device Software Notification &amp; PSC XI Pitch Deployment.</w:t>
-            </w:r>
-          </w:p>
-          <w:p>
-            <w:pPr>
-              <w:spacing w:before="80" w:after="40"/>
-            </w:pPr>
-            <w:r>
-              <w:rPr>
-                <w:b/>
-                <w:sz w:val="18"/>
-              </w:rPr>
-              <w:t xml:space="preserve">Caption: </w:t>
-            </w:r>
-            <w:r>
-              <w:rPr>
-                <w:i/>
-                <w:sz w:val="18"/>
-              </w:rPr>
-              <w:t>Figure 7. TinginHB 12-Month Multi-Phase Research, Clinical Validation, and Commercialization Roadmap.</w:t>
-            </w:r>
-          </w:p>
-          <w:p>
-            <w:pPr>
-              <w:spacing w:before="20" w:after="80"/>
-            </w:pPr>
-            <w:r>
-              <w:rPr>
-                <w:b/>
-                <w:color w:val="556677"/>
-                <w:sz w:val="17"/>
-              </w:rPr>
-              <w:t xml:space="preserve">Data Sources / Theoretical Grounding: </w:t>
-            </w:r>
-            <w:r>
-              <w:rPr>
-                <w:i/>
-                <w:color w:val="556677"/>
-                <w:sz w:val="17"/>
-              </w:rPr>
-              <w:t>DOH Health Technology Assessment (HTA) Guidelines; Universal Health Care Act (RA 11223).</w:t>
-            </w:r>
-          </w:p>
-        </w:tc>
-      </w:tr>
-    </w:tbl>
     <w:p>
       <w:pPr>
-        <w:spacing w:before="0" w:after="80"/>
+        <w:spacing w:before="40" w:after="40"/>
+        <w:jc w:val="center"/>
       </w:pPr>
+      <w:r>
+        <w:rPr>
+          <w:b/>
+          <w:color w:val="0E4D64"/>
+          <w:sz w:val="18"/>
+        </w:rPr>
+        <w:t xml:space="preserve">Figure 6. Prospective Clinical Field Validation Design &amp; ROC Curves. </w:t>
+      </w:r>
+      <w:r>
+        <w:rPr>
+          <w:i/>
+          <w:sz w:val="17"/>
+        </w:rPr>
+        <w:t>STARD 2015 prospective trial schema (N=250 at Cagayan de Oro RHUs paired with laboratory Sysmex XN-550 CBC within 2 hours) and target diagnostic ROC curve (AUROC = 0.91, 88.5% sensitivity, 84.0% specificity at Hb &lt; 10.0 g/dL).</w:t>
+      </w:r>
+    </w:p>
+    <w:p>
+      <w:pPr>
+        <w:spacing w:before="0" w:after="160"/>
+        <w:jc w:val="center"/>
+      </w:pPr>
+      <w:r>
+        <w:rPr>
+          <w:b/>
+          <w:color w:val="556677"/>
+          <w:sz w:val="16"/>
+        </w:rPr>
+        <w:t xml:space="preserve">Data Sources / Theoretical Grounding: </w:t>
+      </w:r>
+      <w:r>
+        <w:rPr>
+          <w:i/>
+          <w:color w:val="556677"/>
+          <w:sz w:val="16"/>
+        </w:rPr>
+        <w:t>Bossuyt et al. (2015, STARD 2015); Kim et al. (2020, PNAS); Mannino et al. (2018).</w:t>
+      </w:r>
+    </w:p>
+    <w:p>
+      <w:pPr>
+        <w:spacing w:before="160" w:after="60"/>
+        <w:jc w:val="center"/>
+      </w:pPr>
+      <w:r>
+        <w:drawing>
+          <wp:inline xmlns:a="http://schemas.openxmlformats.org/drawingml/2006/main" xmlns:pic="http://schemas.openxmlformats.org/drawingml/2006/picture">
+            <wp:extent cx="5760000" cy="2480280"/>
+            <wp:docPr id="7" name="Picture 7"/>
+            <wp:cNvGraphicFramePr>
+              <a:graphicFrameLocks noChangeAspect="1"/>
+            </wp:cNvGraphicFramePr>
+            <a:graphic>
+              <a:graphicData uri="http://schemas.openxmlformats.org/drawingml/2006/picture">
+                <pic:pic>
+                  <pic:nvPicPr>
+                    <pic:cNvPr id="0" name="fig7_roadmap_gantt.png"/>
+                    <pic:cNvPicPr/>
+                  </pic:nvPicPr>
+                  <pic:blipFill>
+                    <a:blip r:embed="rId15"/>
+                    <a:stretch>
+                      <a:fillRect/>
+                    </a:stretch>
+                  </pic:blipFill>
+                  <pic:spPr>
+                    <a:xfrm>
+                      <a:off x="0" y="0"/>
+                      <a:ext cx="5760000" cy="2480280"/>
+                    </a:xfrm>
+                    <a:prstGeom prst="rect"/>
+                  </pic:spPr>
+                </pic:pic>
+              </a:graphicData>
+            </a:graphic>
+          </wp:inline>
+        </w:drawing>
+      </w:r>
+    </w:p>
+    <w:p>
+      <w:pPr>
+        <w:spacing w:before="40" w:after="40"/>
+        <w:jc w:val="center"/>
+      </w:pPr>
+      <w:r>
+        <w:rPr>
+          <w:b/>
+          <w:color w:val="0E4D64"/>
+          <w:sz w:val="18"/>
+        </w:rPr>
+        <w:t xml:space="preserve">Figure 7. 12-Month Multi-Phase Research, Clinical Validation &amp; Commercialization Roadmap. </w:t>
+      </w:r>
+      <w:r>
+        <w:rPr>
+          <w:i/>
+          <w:sz w:val="17"/>
+        </w:rPr>
+        <w:t>Horizontal Gantt chart spanning Months 1 through 12 across 6 core workstreams: Dataset Curation, Model Optimization, Edge App Development, Prospective Clinical Trials (N=250), PhilHealth API Integration, and Philippine FDA Medical Device Software Notification.</w:t>
+      </w:r>
+    </w:p>
+    <w:p>
+      <w:pPr>
+        <w:spacing w:before="0" w:after="160"/>
+        <w:jc w:val="center"/>
+      </w:pPr>
+      <w:r>
+        <w:rPr>
+          <w:b/>
+          <w:color w:val="556677"/>
+          <w:sz w:val="16"/>
+        </w:rPr>
+        <w:t xml:space="preserve">Data Sources / Theoretical Grounding: </w:t>
+      </w:r>
+      <w:r>
+        <w:rPr>
+          <w:i/>
+          <w:color w:val="556677"/>
+          <w:sz w:val="16"/>
+        </w:rPr>
+        <w:t>DOH Health Technology Assessment (HTA) Guidelines; Universal Health Care Act (RA 11223).</w:t>
+      </w:r>
     </w:p>
     <w:p>
       <w:pPr>

</xml_diff>